<commit_message>
Rough Draft of Intro
</commit_message>
<xml_diff>
--- a/paRsynth_methods_draft_BAC.docx
+++ b/paRsynth_methods_draft_BAC.docx
@@ -325,11 +325,19 @@
           <w:rFonts w:ascii="Arial" w:hAnsi="Arial" w:cs="Arial"/>
         </w:rPr>
       </w:pPr>
-      <w:r>
-        <w:rPr>
-          <w:rFonts w:ascii="Arial" w:hAnsi="Arial" w:cs="Arial"/>
-        </w:rPr>
-        <w:t>Tktk need name address and email address for Methods in Ecology and Evolution</w:t>
+      <w:proofErr w:type="spellStart"/>
+      <w:r>
+        <w:rPr>
+          <w:rFonts w:ascii="Arial" w:hAnsi="Arial" w:cs="Arial"/>
+        </w:rPr>
+        <w:t>Tktk</w:t>
+      </w:r>
+      <w:proofErr w:type="spellEnd"/>
+      <w:r>
+        <w:rPr>
+          <w:rFonts w:ascii="Arial" w:hAnsi="Arial" w:cs="Arial"/>
+        </w:rPr>
+        <w:t xml:space="preserve"> need name address and email address for Methods in Ecology and Evolution</w:t>
       </w:r>
     </w:p>
     <w:p>
@@ -765,6 +773,7 @@
         </w:rPr>
         <w:t xml:space="preserve">: </w:t>
       </w:r>
+      <w:proofErr w:type="gramStart"/>
       <w:r>
         <w:rPr>
           <w:rFonts w:ascii="Arial" w:hAnsi="Arial" w:cs="Arial"/>
@@ -781,7 +790,14 @@
         <w:rPr>
           <w:rFonts w:ascii="Arial" w:hAnsi="Arial" w:cs="Arial"/>
         </w:rPr>
-        <w:t xml:space="preserve">word </w:t>
+        <w:t>word</w:t>
+      </w:r>
+      <w:proofErr w:type="gramEnd"/>
+      <w:r>
+        <w:rPr>
+          <w:rFonts w:ascii="Arial" w:hAnsi="Arial" w:cs="Arial"/>
+        </w:rPr>
+        <w:t xml:space="preserve"> </w:t>
       </w:r>
       <w:r>
         <w:rPr>
@@ -1316,7 +1332,7 @@
         <w:rPr>
           <w:rFonts w:ascii="Arial" w:hAnsi="Arial" w:cs="Arial"/>
         </w:rPr>
-        <w:instrText xml:space="preserve"> ADDIN ZOTERO_ITEM CSL_CITATION {"citationID":"ypmC2vLC","properties":{"formattedCitation":"(Araya-Salas et al., 2019; Berg, Delgado, Cortopassi, et al., 2011; Berg, Delgado, Okawa, et al., 2011; Smith-Vidaurre et al., 2020, 2023; Wright, 1997)","plainCitation":"(Araya-Salas et al., 2019; Berg, Delgado, Cortopassi, et al., 2011; Berg, Delgado, Okawa, et al., 2011; Smith-Vidaurre et al., 2020, 2023; Wright, 1997)","noteIndex":0},"citationItems":[{"id":534,"uris":["http://zotero.org/groups/5786507/items/DLH8HEV6"],"itemData":{"id":534,"type":"article-journal","abstract":"Vocal learning, in which animals modify their vocalizations based on social experience, has evolved in several lineages of mammals and birds, including humans. Despite much attention, the question of how this key cognitive trait has evolved remains unanswered. The motor theory for the origin of vocal learning posits that neural centres specialized for vocal learning arose from adjacent areas in the brain devoted to general motor learning. One prediction of this hypothesis is that visual displays that rely on complex motor patterns may also be learned in taxa with vocal learning. While learning of both spoken and gestural languages is well documented in humans, the occurrence of learned visual displays has rarely been examined in non-human animals. We tested for geographical variation consistent with learning of visual displays in long-billed hermits (Phaethornis longirostris), a lek-mating hummingbird that, like humans, has both learned vocalizations and elaborate visual displays. We found lek-level signatures in both vocal parameters and visual display features, including display element proportions, sequence syntax and fine-scale parameters of elements. This variation was not associated with genetic differentiation between leks. In the absence of genetic differences, geographical variation in vocal signals at small scales is most parsimoniously attributed to learning, suggesting a significant role of social learning in visual display ontogeny. The co-occurrence of learning in vocal and visual displays would be consistent with a parallel evolution of these two signal modalities in this species.","container-title":"Proceedings of the Royal Society B: Biological Sciences","DOI":"10.1098/rspb.2019.0666","issue":"1903","note":"publisher: Royal Society","page":"20190666","source":"royalsocietypublishing.org (Atypon)","title":"Social group signatures in hummingbird displays provide evidence of co-occurrence of vocal and visual learning","volume":"286","author":[{"family":"Araya-Salas","given":"Marcelo"},{"family":"Smith-Vidaurre","given":"Grace"},{"family":"Mennill","given":"Daniel J."},{"family":"González-Gómez","given":"Paulina L."},{"family":"Cahill","given":"James"},{"family":"Wright","given":"Timothy F."}],"issued":{"date-parts":[["2019",5,29]]}}},{"id":530,"uris":["http://zotero.org/groups/5786507/items/4ILM3F4A"],"itemData":{"id":530,"type":"article-journal","abstract":"Learned birdsong is a widely used animal model for understanding the acquisition of human speech. Male songbirds often learn songs from adult males during sensitive periods early in life, and sing to attract mates and defend territories. In presumably all of the 350+ parrot species, individuals of both sexes commonly learn vocal signals throughout life to satisfy a wide variety of social functions. Despite intriguing parallels with humans, there have been no experimental studies demonstrating learned vocal production in wild parrots. We studied contact call learning in video-rigged nests of a well-known marked population of green-rumped parrotlets (Forpus passerinus) in Venezuela. Both sexes of naive nestlings developed individually unique contact calls in the nest, and we demonstrate experimentally that signature attributes are learned from both primary care-givers. This represents the first experimental evidence for the mechanisms underlying the transmission of a socially acquired trait in a wild parrot population.","container-title":"Proceedings of the Royal Society B: Biological Sciences","DOI":"10.1098/rspb.2011.0932","issue":"1728","note":"publisher: Royal Society","page":"585-591","source":"royalsocietypublishing-org.proxy2.cl.msu.edu (Atypon)","title":"Vertical transmission of learned signatures in a wild parrot","volume":"279","author":[{"family":"Berg","given":"Karl S."},{"family":"Delgado","given":"Soraya"},{"family":"Cortopassi","given":"Kathryn A."},{"family":"Beissinger","given":"Steven R."},{"family":"Bradbury","given":"Jack W."}],"issued":{"date-parts":[["2011",7,13]]}}},{"id":527,"uris":["http://zotero.org/groups/5786507/items/M5RQLYC2"],"itemData":{"id":527,"type":"article-journal","abstract":"Contact calls function to coordinate movements in a wide variety of social animals. Where population density is high, visibility is low and repeated interactions occur between known social companions, calls are often individually recognizable. Parrots are highly social and make substantial daily movements, which appear to be mediated through contact calling. However, there is little experimental evidence for how free-ranging parrots recognize social companions. We quantified intra- and interindividual variation of contact calls in a banded population of green-rumped parrotlets in Venezuela. Recordings of a sample of males were made on replicate days as they announced their return to incubating mates. Spectrographic structure of these contact calls showed significantly more variation between than within individuals, and calls could be correctly classified to individuals more often than was expected by chance. Males varied across multiple dimensions simultaneously, including duration, frequency and frequency modulation of contact calls. Playback experiments showed that free-ranging female parrotlets responded significantly more often to their mates’ calls than to calls of males of other nests. Mate recognition via contact calls may be selectively advantageous during incubation and brooding if this reduces the potential costs associated with confusing contact calls of mates with those of nonmates, including infanticidal conspecifics.","container-title":"Animal Behaviour","DOI":"10.1016/j.anbehav.2010.10.012","ISSN":"0003-3472","issue":"1","journalAbbreviation":"Animal Behaviour","page":"241-248","source":"ScienceDirect","title":"Contact calls are used for individual mate recognition in free-ranging green-rumped parrotlets, &lt;i&gt;Forpus passerinus&lt;/i&gt;","volume":"81","author":[{"family":"Berg","given":"Karl S."},{"family":"Delgado","given":"Soraya"},{"family":"Okawa","given":"Rae"},{"family":"Beissinger","given":"Steven R."},{"family":"Bradbury","given":"Jack W."}],"issued":{"date-parts":[["2011",1,1]]}}},{"id":536,"uris":["http://zotero.org/groups/5786507/items/ZNXJZAJT"],"itemData":{"id":536,"type":"article-journal","abstract":"Despite longstanding interest in the evolutionary origins and maintenance of vocal learning, we know relatively little about how social dynamics influence vocal learning processes in natural populations. The “signaling group membership” hypothesis proposes that socially learned calls evolved and are maintained as signals of group membership. However, in fission–fusion societies, individuals can interact in social groups across various social scales. For learned calls to signal group membership over multiple social scales, they must contain information about group membership over each of these scales, a concept termed “hierarchical mapping.” Monk parakeets (Myiopsitta monachus), small parrots native to South America, exhibit vocal mimicry in captivity and fission–fusion social dynamics in the wild. We examined patterns of contact call acoustic similarity in Uruguay to test the hierarchical mapping assumption of the signaling group membership hypothesis. We also asked whether geographic variation patterns matched regional dialects or geographic clines that have been documented in other vocal learning species. We used visual inspection, spectrographic cross-correlation and random forests, a machine learning approach, to evaluate contact call similarity. We compared acoustic similarity across social scales and geographic distance using Mantel tests and spatial autocorrelation. We found high similarity within individuals, and low, albeit significant, similarity within groups at the pair, flock and site social scales. Patterns of acoustic similarity over geographic distance did not match mosaic or graded patterns expected in dialectal or clinal variation. Our findings suggest that monk parakeet social interactions rely more heavily upon individual recognition than group membership at higher social scales.","container-title":"Behavioral Ecology","DOI":"10.1093/beheco/arz202","ISSN":"1045-2249","issue":"2","journalAbbreviation":"Behavioral Ecology","page":"448-458","source":"Silverchair","title":"Individual signatures outweigh social group identity in contact calls of a communally nesting parrot","volume":"31","author":[{"family":"Smith-Vidaurre","given":"Grace"},{"family":"Araya-Salas","given":"Marcelo"},{"family":"Wright","given":"Timothy F"}],"issued":{"date-parts":[["2020",3,20]]}}},{"id":542,"uris":["http://zotero.org/groups/5786507/items/E7IVATDZ"],"itemData":{"id":542,"type":"article-journal","abstract":"Animals can actively encode different types of identity information in learned communication signals, such as group membership or individual identity. The social environments in which animals interact may favor different types of information, but whether identity information conveyed in learned signals is robust or responsive to social disruption over short evolutionary timescales is not well understood. We inferred the type of identity information that was most salient in vocal signals by combining computational tools, including supervised machine learning, with a conceptual framework of “hierarchical mapping”, or patterns of relative acoustic convergence across social scales. We used populations of a vocal learning species as a natural experiment to test whether the type of identity information emphasized in learned vocalizations changed in populations that experienced the social disruption of introduction into new parts of the world. We compared the social scales with the most salient identity information among native and introduced range monk parakeet (Myiopsitta monachus) calls recorded in Uruguay and the United States, respectively. We also evaluated whether the identity information emphasized in introduced range calls changed over time. To place our findings in an evolutionary context, we compared our results with another parrot species that exhibits well-established and distinctive regional vocal dialects that are consistent with signaling group identity. We found that both native and introduced range monk parakeet calls displayed the strongest convergence at the individual scale and minimal convergence within sites. We did not identify changes in the strength of acoustic convergence within sites over time in the introduced range calls. These results indicate that the individual identity information in learned vocalizations did not change over short evolutionary timescales in populations that experienced the social disruption of introduction. Our findings point to exciting new research directions about the robustness or responsiveness of communication systems over different evolutionary timescales.","container-title":"PLOS Computational Biology","DOI":"10.1371/journal.pcbi.1011231","ISSN":"1553-7358","issue":"7","journalAbbreviation":"PLOS Computational Biology","language":"en","note":"publisher: Public Library of Science","page":"e1011231","source":"PLoS Journals","title":"Individual identity information persists in learned calls of introduced parrot populations","volume":"19","author":[{"family":"Smith-Vidaurre","given":"Grace"},{"family":"Pérez-Marrufo","given":"Valeria"},{"family":"Hobson","given":"Elizabeth A."},{"family":"Salinas-Melgoza","given":"Alejandro"},{"family":"Wright","given":"Timothy F."}],"issued":{"date-parts":[["2023",7,27]]}}},{"id":519,"uris":["http://zotero.org/groups/5786507/items/CYI2BRGH"],"itemData":{"id":519,"type":"article-journal","abstract":"This study describes a system of regional dialects in the contact call of a parrot, the yellow-naped amazon (Amazona auropalliata.) Spectrographic cross-correlation analyses of calls from multiple adults at 16 roosts in Costa Rica reveal two distinct patterns of geographic variation in call structure: first, variation in the basic structure of the call by which roosts can be classified into three distinct dialects, and second, fine-scale variation of call structure among roosts within a dialect. Some birds at roosts bordering two dialects use the calls of both neighbouring dialects interchangeably. These results suggest that there are two distinct processes governing the diffusion of call types among roosts, with dialect borders acting as barriers to the spread of foreign calls. Such a dialect system could be maintained through either reduced dispersal of birds across dialect boundaries or alternatively, by reduced diffusion of call types. These two possibilities have different implications for the genetic isolation of populations and thus for both speciation and learning. This pattern is broadly similar to those seen in some songbirds and may be maintained in a similar manner.","container-title":"Proceedings of the Royal Society of London. Series B: Biological Sciences","DOI":"10.1098/rspb.1996.0128","issue":"1372","note":"publisher: Royal Society","page":"867-872","source":"royalsocietypublishing.org (Atypon)","title":"Regional dialects in the contact call of a parrot","volume":"263","author":[{"family":"Wright","given":"Timothy F."}],"issued":{"date-parts":[["1997",1]]}}}],"schema":"https://github.com/citation-style-language/schema/raw/master/csl-citation.json"} </w:instrText>
+        <w:instrText xml:space="preserve"> ADDIN ZOTERO_ITEM CSL_CITATION {"citationID":"ypmC2vLC","properties":{"formattedCitation":"(Araya-Salas et al., 2019; Berg, Delgado, Cortopassi, et al., 2011; Berg, Delgado, Okawa, et al., 2011; Smith-Vidaurre et al., 2020, 2023; Wright, 1997a)","plainCitation":"(Araya-Salas et al., 2019; Berg, Delgado, Cortopassi, et al., 2011; Berg, Delgado, Okawa, et al., 2011; Smith-Vidaurre et al., 2020, 2023; Wright, 1997a)","noteIndex":0},"citationItems":[{"id":534,"uris":["http://zotero.org/groups/5786507/items/DLH8HEV6"],"itemData":{"id":534,"type":"article-journal","abstract":"Vocal learning, in which animals modify their vocalizations based on social experience, has evolved in several lineages of mammals and birds, including humans. Despite much attention, the question of how this key cognitive trait has evolved remains unanswered. The motor theory for the origin of vocal learning posits that neural centres specialized for vocal learning arose from adjacent areas in the brain devoted to general motor learning. One prediction of this hypothesis is that visual displays that rely on complex motor patterns may also be learned in taxa with vocal learning. While learning of both spoken and gestural languages is well documented in humans, the occurrence of learned visual displays has rarely been examined in non-human animals. We tested for geographical variation consistent with learning of visual displays in long-billed hermits (Phaethornis longirostris), a lek-mating hummingbird that, like humans, has both learned vocalizations and elaborate visual displays. We found lek-level signatures in both vocal parameters and visual display features, including display element proportions, sequence syntax and fine-scale parameters of elements. This variation was not associated with genetic differentiation between leks. In the absence of genetic differences, geographical variation in vocal signals at small scales is most parsimoniously attributed to learning, suggesting a significant role of social learning in visual display ontogeny. The co-occurrence of learning in vocal and visual displays would be consistent with a parallel evolution of these two signal modalities in this species.","container-title":"Proceedings of the Royal Society B: Biological Sciences","DOI":"10.1098/rspb.2019.0666","issue":"1903","note":"publisher: Royal Society","page":"20190666","source":"royalsocietypublishing.org (Atypon)","title":"Social group signatures in hummingbird displays provide evidence of co-occurrence of vocal and visual learning","volume":"286","author":[{"family":"Araya-Salas","given":"Marcelo"},{"family":"Smith-Vidaurre","given":"Grace"},{"family":"Mennill","given":"Daniel J."},{"family":"González-Gómez","given":"Paulina L."},{"family":"Cahill","given":"James"},{"family":"Wright","given":"Timothy F."}],"issued":{"date-parts":[["2019",5,29]]}}},{"id":530,"uris":["http://zotero.org/groups/5786507/items/4ILM3F4A"],"itemData":{"id":530,"type":"article-journal","abstract":"Learned birdsong is a widely used animal model for understanding the acquisition of human speech. Male songbirds often learn songs from adult males during sensitive periods early in life, and sing to attract mates and defend territories. In presumably all of the 350+ parrot species, individuals of both sexes commonly learn vocal signals throughout life to satisfy a wide variety of social functions. Despite intriguing parallels with humans, there have been no experimental studies demonstrating learned vocal production in wild parrots. We studied contact call learning in video-rigged nests of a well-known marked population of green-rumped parrotlets (Forpus passerinus) in Venezuela. Both sexes of naive nestlings developed individually unique contact calls in the nest, and we demonstrate experimentally that signature attributes are learned from both primary care-givers. This represents the first experimental evidence for the mechanisms underlying the transmission of a socially acquired trait in a wild parrot population.","container-title":"Proceedings of the Royal Society B: Biological Sciences","DOI":"10.1098/rspb.2011.0932","issue":"1728","note":"publisher: Royal Society","page":"585-591","source":"royalsocietypublishing-org.proxy2.cl.msu.edu (Atypon)","title":"Vertical transmission of learned signatures in a wild parrot","volume":"279","author":[{"family":"Berg","given":"Karl S."},{"family":"Delgado","given":"Soraya"},{"family":"Cortopassi","given":"Kathryn A."},{"family":"Beissinger","given":"Steven R."},{"family":"Bradbury","given":"Jack W."}],"issued":{"date-parts":[["2011",7,13]]}}},{"id":527,"uris":["http://zotero.org/groups/5786507/items/M5RQLYC2"],"itemData":{"id":527,"type":"article-journal","abstract":"Contact calls function to coordinate movements in a wide variety of social animals. Where population density is high, visibility is low and repeated interactions occur between known social companions, calls are often individually recognizable. Parrots are highly social and make substantial daily movements, which appear to be mediated through contact calling. However, there is little experimental evidence for how free-ranging parrots recognize social companions. We quantified intra- and interindividual variation of contact calls in a banded population of green-rumped parrotlets in Venezuela. Recordings of a sample of males were made on replicate days as they announced their return to incubating mates. Spectrographic structure of these contact calls showed significantly more variation between than within individuals, and calls could be correctly classified to individuals more often than was expected by chance. Males varied across multiple dimensions simultaneously, including duration, frequency and frequency modulation of contact calls. Playback experiments showed that free-ranging female parrotlets responded significantly more often to their mates’ calls than to calls of males of other nests. Mate recognition via contact calls may be selectively advantageous during incubation and brooding if this reduces the potential costs associated with confusing contact calls of mates with those of nonmates, including infanticidal conspecifics.","container-title":"Animal Behaviour","DOI":"10.1016/j.anbehav.2010.10.012","ISSN":"0003-3472","issue":"1","journalAbbreviation":"Animal Behaviour","page":"241-248","source":"ScienceDirect","title":"Contact calls are used for individual mate recognition in free-ranging green-rumped parrotlets, &lt;i&gt;Forpus passerinus&lt;/i&gt;","volume":"81","author":[{"family":"Berg","given":"Karl S."},{"family":"Delgado","given":"Soraya"},{"family":"Okawa","given":"Rae"},{"family":"Beissinger","given":"Steven R."},{"family":"Bradbury","given":"Jack W."}],"issued":{"date-parts":[["2011",1,1]]}}},{"id":536,"uris":["http://zotero.org/groups/5786507/items/ZNXJZAJT"],"itemData":{"id":536,"type":"article-journal","abstract":"Despite longstanding interest in the evolutionary origins and maintenance of vocal learning, we know relatively little about how social dynamics influence vocal learning processes in natural populations. The “signaling group membership” hypothesis proposes that socially learned calls evolved and are maintained as signals of group membership. However, in fission–fusion societies, individuals can interact in social groups across various social scales. For learned calls to signal group membership over multiple social scales, they must contain information about group membership over each of these scales, a concept termed “hierarchical mapping.” Monk parakeets (Myiopsitta monachus), small parrots native to South America, exhibit vocal mimicry in captivity and fission–fusion social dynamics in the wild. We examined patterns of contact call acoustic similarity in Uruguay to test the hierarchical mapping assumption of the signaling group membership hypothesis. We also asked whether geographic variation patterns matched regional dialects or geographic clines that have been documented in other vocal learning species. We used visual inspection, spectrographic cross-correlation and random forests, a machine learning approach, to evaluate contact call similarity. We compared acoustic similarity across social scales and geographic distance using Mantel tests and spatial autocorrelation. We found high similarity within individuals, and low, albeit significant, similarity within groups at the pair, flock and site social scales. Patterns of acoustic similarity over geographic distance did not match mosaic or graded patterns expected in dialectal or clinal variation. Our findings suggest that monk parakeet social interactions rely more heavily upon individual recognition than group membership at higher social scales.","container-title":"Behavioral Ecology","DOI":"10.1093/beheco/arz202","ISSN":"1045-2249","issue":"2","journalAbbreviation":"Behavioral Ecology","page":"448-458","source":"Silverchair","title":"Individual signatures outweigh social group identity in contact calls of a communally nesting parrot","volume":"31","author":[{"family":"Smith-Vidaurre","given":"Grace"},{"family":"Araya-Salas","given":"Marcelo"},{"family":"Wright","given":"Timothy F"}],"issued":{"date-parts":[["2020",3,20]]}}},{"id":542,"uris":["http://zotero.org/groups/5786507/items/E7IVATDZ"],"itemData":{"id":542,"type":"article-journal","abstract":"Animals can actively encode different types of identity information in learned communication signals, such as group membership or individual identity. The social environments in which animals interact may favor different types of information, but whether identity information conveyed in learned signals is robust or responsive to social disruption over short evolutionary timescales is not well understood. We inferred the type of identity information that was most salient in vocal signals by combining computational tools, including supervised machine learning, with a conceptual framework of “hierarchical mapping”, or patterns of relative acoustic convergence across social scales. We used populations of a vocal learning species as a natural experiment to test whether the type of identity information emphasized in learned vocalizations changed in populations that experienced the social disruption of introduction into new parts of the world. We compared the social scales with the most salient identity information among native and introduced range monk parakeet (Myiopsitta monachus) calls recorded in Uruguay and the United States, respectively. We also evaluated whether the identity information emphasized in introduced range calls changed over time. To place our findings in an evolutionary context, we compared our results with another parrot species that exhibits well-established and distinctive regional vocal dialects that are consistent with signaling group identity. We found that both native and introduced range monk parakeet calls displayed the strongest convergence at the individual scale and minimal convergence within sites. We did not identify changes in the strength of acoustic convergence within sites over time in the introduced range calls. These results indicate that the individual identity information in learned vocalizations did not change over short evolutionary timescales in populations that experienced the social disruption of introduction. Our findings point to exciting new research directions about the robustness or responsiveness of communication systems over different evolutionary timescales.","container-title":"PLOS Computational Biology","DOI":"10.1371/journal.pcbi.1011231","ISSN":"1553-7358","issue":"7","journalAbbreviation":"PLOS Computational Biology","language":"en","note":"publisher: Public Library of Science","page":"e1011231","source":"PLoS Journals","title":"Individual identity information persists in learned calls of introduced parrot populations","volume":"19","author":[{"family":"Smith-Vidaurre","given":"Grace"},{"family":"Pérez-Marrufo","given":"Valeria"},{"family":"Hobson","given":"Elizabeth A."},{"family":"Salinas-Melgoza","given":"Alejandro"},{"family":"Wright","given":"Timothy F."}],"issued":{"date-parts":[["2023",7,27]]}}},{"id":519,"uris":["http://zotero.org/groups/5786507/items/CYI2BRGH"],"itemData":{"id":519,"type":"article-journal","abstract":"This study describes a system of regional dialects in the contact call of a parrot, the yellow-naped amazon (Amazona auropalliata.) Spectrographic cross-correlation analyses of calls from multiple adults at 16 roosts in Costa Rica reveal two distinct patterns of geographic variation in call structure: first, variation in the basic structure of the call by which roosts can be classified into three distinct dialects, and second, fine-scale variation of call structure among roosts within a dialect. Some birds at roosts bordering two dialects use the calls of both neighbouring dialects interchangeably. These results suggest that there are two distinct processes governing the diffusion of call types among roosts, with dialect borders acting as barriers to the spread of foreign calls. Such a dialect system could be maintained through either reduced dispersal of birds across dialect boundaries or alternatively, by reduced diffusion of call types. These two possibilities have different implications for the genetic isolation of populations and thus for both speciation and learning. This pattern is broadly similar to those seen in some songbirds and may be maintained in a similar manner.","container-title":"Proceedings of the Royal Society of London. Series B: Biological Sciences","DOI":"10.1098/rspb.1996.0128","issue":"1372","note":"publisher: Royal Society","page":"867-872","source":"royalsocietypublishing.org (Atypon)","title":"Regional dialects in the contact call of a parrot","volume":"263","author":[{"family":"Wright","given":"Timothy F."}],"issued":{"date-parts":[["1997",1]]}}}],"schema":"https://github.com/citation-style-language/schema/raw/master/csl-citation.json"} </w:instrText>
       </w:r>
       <w:r>
         <w:rPr>
@@ -1328,7 +1344,7 @@
         <w:rPr>
           <w:rFonts w:ascii="Arial" w:hAnsi="Arial" w:cs="Arial"/>
         </w:rPr>
-        <w:t>(Araya-Salas et al., 2019; Berg, Delgado, Cortopassi, et al., 2011; Berg, Delgado, Okawa, et al., 2011; Smith-Vidaurre et al., 2020, 2023; Wright, 1997)</w:t>
+        <w:t>(Araya-Salas et al., 2019; Berg, Delgado, Cortopassi, et al., 2011; Berg, Delgado, Okawa, et al., 2011; Smith-Vidaurre et al., 2020, 2023; Wright, 1997a)</w:t>
       </w:r>
       <w:r>
         <w:rPr>
@@ -1589,7 +1605,7 @@
         <w:rPr>
           <w:rFonts w:ascii="Arial" w:hAnsi="Arial" w:cs="Arial"/>
         </w:rPr>
-        <w:t xml:space="preserve"> First, while these tools are good for measuring information encoded in a signal, studies often fail to assess if this information is valuable or perceptible to </w:t>
+        <w:t xml:space="preserve"> First, studies often fail to assess if this information is valuable or perceptible to </w:t>
       </w:r>
       <w:commentRangeStart w:id="11"/>
       <w:r>
@@ -1609,229 +1625,340 @@
         <w:rPr>
           <w:rFonts w:ascii="Arial" w:hAnsi="Arial" w:cs="Arial"/>
         </w:rPr>
+        <w:t xml:space="preserve"> </w:t>
+      </w:r>
+      <w:r>
+        <w:rPr>
+          <w:rFonts w:ascii="Arial" w:hAnsi="Arial" w:cs="Arial"/>
+        </w:rPr>
+        <w:t xml:space="preserve">, therefore creating a potential mismatch between the salient information that we can quantify and the information that is salient to receivers. Second, </w:t>
+      </w:r>
+      <w:proofErr w:type="gramStart"/>
+      <w:r>
+        <w:rPr>
+          <w:rFonts w:ascii="Arial" w:hAnsi="Arial" w:cs="Arial"/>
+        </w:rPr>
+        <w:lastRenderedPageBreak/>
+        <w:t>out</w:t>
+      </w:r>
+      <w:proofErr w:type="gramEnd"/>
+      <w:r>
+        <w:rPr>
+          <w:rFonts w:ascii="Arial" w:hAnsi="Arial" w:cs="Arial"/>
+        </w:rPr>
+        <w:t xml:space="preserve"> ability to detect the dynamics of information encoding during real time social interactions is limited by our ability to capture the totality of an individual’s or groups signal produced during these interactions. </w:t>
+      </w:r>
+      <w:r>
+        <w:rPr>
+          <w:rFonts w:ascii="Arial" w:hAnsi="Arial" w:cs="Arial"/>
+        </w:rPr>
+        <w:t>We may be over sampling from vocal learning species whose social interaction and signal production are easy to observe and measure, and therefore may not be assessing the full scope of how information can be encoded across a range of species. Third</w:t>
+      </w:r>
+      <w:r>
+        <w:rPr>
+          <w:rFonts w:ascii="Arial" w:hAnsi="Arial" w:cs="Arial"/>
+        </w:rPr>
+        <w:t xml:space="preserve">, </w:t>
+      </w:r>
+      <w:r>
+        <w:rPr>
+          <w:rFonts w:ascii="Arial" w:hAnsi="Arial" w:cs="Arial"/>
+        </w:rPr>
+        <w:t>c</w:t>
+      </w:r>
+      <w:r>
+        <w:rPr>
+          <w:rFonts w:ascii="Arial" w:hAnsi="Arial" w:cs="Arial"/>
+        </w:rPr>
+        <w:t>ondensing information down to a unit does not allow for the assessment of multiple types of information at one time</w:t>
+      </w:r>
+      <w:r>
+        <w:rPr>
+          <w:rFonts w:ascii="Arial" w:hAnsi="Arial" w:cs="Arial"/>
+        </w:rPr>
+        <w:t>, also known as multidimensional or hierarchical social information (</w:t>
+      </w:r>
+      <w:commentRangeStart w:id="12"/>
+      <w:commentRangeStart w:id="13"/>
+      <w:r>
+        <w:rPr>
+          <w:rFonts w:ascii="Arial" w:hAnsi="Arial" w:cs="Arial"/>
+        </w:rPr>
+        <w:t>CITE</w:t>
+      </w:r>
+      <w:commentRangeEnd w:id="12"/>
+      <w:r>
+        <w:rPr>
+          <w:rStyle w:val="CommentReference"/>
+        </w:rPr>
+        <w:commentReference w:id="12"/>
+      </w:r>
+      <w:commentRangeEnd w:id="13"/>
+      <w:r>
+        <w:rPr>
+          <w:rStyle w:val="CommentReference"/>
+        </w:rPr>
+        <w:commentReference w:id="13"/>
+      </w:r>
+      <w:r>
+        <w:rPr>
+          <w:rFonts w:ascii="Arial" w:hAnsi="Arial" w:cs="Arial"/>
+        </w:rPr>
+        <w:t xml:space="preserve">), but other types of information about signaler’s internal states or the environmental context. </w:t>
+      </w:r>
+    </w:p>
+    <w:p>
+      <w:pPr>
+        <w:spacing w:line="360" w:lineRule="auto"/>
+        <w:rPr>
+          <w:rFonts w:ascii="Arial" w:hAnsi="Arial" w:cs="Arial"/>
+        </w:rPr>
+      </w:pPr>
+      <w:r>
+        <w:rPr>
+          <w:rFonts w:ascii="Arial" w:hAnsi="Arial" w:cs="Arial"/>
+        </w:rPr>
+        <w:tab/>
+      </w:r>
+      <w:r>
+        <w:rPr>
+          <w:rFonts w:ascii="Arial" w:hAnsi="Arial" w:cs="Arial"/>
+        </w:rPr>
+        <w:t>Synthetic</w:t>
+      </w:r>
+      <w:r>
+        <w:rPr>
+          <w:rFonts w:ascii="Arial" w:hAnsi="Arial" w:cs="Arial"/>
+        </w:rPr>
+        <w:t xml:space="preserve"> tools offer a practical solution</w:t>
+      </w:r>
+      <w:r>
+        <w:rPr>
+          <w:rFonts w:ascii="Arial" w:hAnsi="Arial" w:cs="Arial"/>
+        </w:rPr>
+        <w:t>, by allowing us to control these variables, while still providing datasets that mimic biologic ones. Currently there are calls for vocal communication research to take advantage large-scale quantification methods that are often used in animal movement research</w:t>
+      </w:r>
+      <w:r>
+        <w:rPr>
+          <w:rFonts w:ascii="Arial" w:hAnsi="Arial" w:cs="Arial"/>
+        </w:rPr>
+        <w:t xml:space="preserve"> </w:t>
+      </w:r>
+      <w:r>
+        <w:rPr>
+          <w:rFonts w:ascii="Arial" w:hAnsi="Arial" w:cs="Arial"/>
+        </w:rPr>
+        <w:fldChar w:fldCharType="begin"/>
+      </w:r>
+      <w:r>
+        <w:rPr>
+          <w:rFonts w:ascii="Arial" w:hAnsi="Arial" w:cs="Arial"/>
+        </w:rPr>
+        <w:instrText xml:space="preserve"> ADDIN ZOTERO_ITEM CSL_CITATION {"citationID":"Y4ZDuWNr","properties":{"formattedCitation":"(Sainburg &amp; Gentner, 2021)","plainCitation":"(Sainburg &amp; Gentner, 2021)","noteIndex":0},"citationItems":[{"id":561,"uris":["http://zotero.org/groups/5786507/items/94ZV9WNS"],"itemData":{"id":561,"type":"article-journal","abstract":"&lt;p&gt;Recently developed methods in computational neuroethology have enabled increasingly detailed and comprehensive quantification of animal movements and behavioral kinematics. Vocal communication behavior is well poised for application of similar large-scale quantification methods in the service of physiological and ethological studies. This review describes emerging techniques that can be applied to acoustic and vocal communication signals with the goal of enabling study beyond a small number of model species. We review a range of modern computational methods for bioacoustics, signal processing, and brain-behavior mapping. Along with a discussion of recent advances and techniques, we include challenges and broader goals in establishing a framework for the computational neuroethology of vocal communication.&lt;/p&gt;","container-title":"Frontiers in Behavioral Neuroscience","DOI":"10.3389/fnbeh.2021.811737","ISSN":"1662-5153","journalAbbreviation":"Front. Behav. Neurosci.","language":"English","note":"publisher: Frontiers","source":"Frontiers","title":"Toward a Computational Neuroethology of Vocal Communication: From Bioacoustics to Neurophysiology, Emerging Tools and Future Directions","title-short":"Toward a Computational Neuroethology of Vocal Communication","URL":"https://www.frontiersin.org/journals/behavioral-neuroscience/articles/10.3389/fnbeh.2021.811737/full","volume":"15","author":[{"family":"Sainburg","given":"Tim"},{"family":"Gentner","given":"Timothy Q."}],"accessed":{"date-parts":[["2024",12,17]]},"issued":{"date-parts":[["2021",12,20]]}}}],"schema":"https://github.com/citation-style-language/schema/raw/master/csl-citation.json"} </w:instrText>
+      </w:r>
+      <w:r>
+        <w:rPr>
+          <w:rFonts w:ascii="Arial" w:hAnsi="Arial" w:cs="Arial"/>
+        </w:rPr>
+        <w:fldChar w:fldCharType="separate"/>
+      </w:r>
+      <w:r>
+        <w:rPr>
+          <w:rFonts w:ascii="Arial" w:hAnsi="Arial" w:cs="Arial"/>
+        </w:rPr>
+        <w:t>(</w:t>
+      </w:r>
+      <w:proofErr w:type="spellStart"/>
+      <w:r>
+        <w:rPr>
+          <w:rFonts w:ascii="Arial" w:hAnsi="Arial" w:cs="Arial"/>
+        </w:rPr>
+        <w:t>Sainburg</w:t>
+      </w:r>
+      <w:proofErr w:type="spellEnd"/>
+      <w:r>
+        <w:rPr>
+          <w:rFonts w:ascii="Arial" w:hAnsi="Arial" w:cs="Arial"/>
+        </w:rPr>
+        <w:t xml:space="preserve"> &amp; Gentner, 2021)</w:t>
+      </w:r>
+      <w:r>
+        <w:rPr>
+          <w:rFonts w:ascii="Arial" w:hAnsi="Arial" w:cs="Arial"/>
+        </w:rPr>
+        <w:fldChar w:fldCharType="end"/>
+      </w:r>
+      <w:r>
+        <w:rPr>
+          <w:rFonts w:ascii="Arial" w:hAnsi="Arial" w:cs="Arial"/>
+        </w:rPr>
+        <w:t xml:space="preserve">. Researchers are already using these datasets in combination with natural ones to determine which analytic tools perform best to assess complexity and animal vocal sequences </w:t>
+      </w:r>
+      <w:r>
+        <w:rPr>
+          <w:rFonts w:ascii="Arial" w:hAnsi="Arial" w:cs="Arial"/>
+        </w:rPr>
+        <w:fldChar w:fldCharType="begin"/>
+      </w:r>
+      <w:r>
+        <w:rPr>
+          <w:rFonts w:ascii="Arial" w:hAnsi="Arial" w:cs="Arial"/>
+        </w:rPr>
+        <w:instrText xml:space="preserve"> ADDIN ZOTERO_ITEM CSL_CITATION {"citationID":"zczypB1i","properties":{"formattedCitation":"(Kershenbaum &amp; Garland, 2015)","plainCitation":"(Kershenbaum &amp; Garland, 2015)","noteIndex":0},"citationItems":[{"id":544,"uris":["http://zotero.org/groups/5786507/items/WJJ2WCSZ"],"itemData":{"id":544,"type":"article-journal","abstract":"Many animals communicate using sequences of discrete acoustic elements which can be complex, vary in their degree of stereotypy, and are potentially open-ended. Variation in sequences can provide important ecological, behavioural or evolutionary information about the structure and connectivity of populations, mechanisms for vocal cultural evolution and the underlying drivers responsible for these processes. Various mathematical techniques have been used to form a realistic approximation of sequence similarity for such tasks. Here, we use both simulated and empirical data sets from animal vocal sequences (rock hyrax, Procavia capensis; humpback whale, Megaptera novaeangliae; bottlenose dolphin, Tursiops truncatus; and Carolina chickadee, Poecile carolinensis) to test which of eight sequence analysis metrics are more likely to reconstruct the information encoded in the sequences, and to test the fidelity of estimation of model parameters, when the sequences are assumed to conform to particular statistical models. Results from the simulated data indicated that multiple metrics were equally successful in reconstructing the information encoded in the sequences of simulated individuals (Markov chains, n-gram models, repeat distribution and edit distance) and data generated by different stochastic processes (entropy rate and n-grams). However, the string edit (Levenshtein) distance performed consistently and significantly better than all other tested metrics (including entropy, Markov chains, n-grams, mutual information) for all empirical data sets, despite being less commonly used in the field of animal acoustic communication. The Levenshtein distance metric provides a robust analytical approach that should be considered in the comparison of animal acoustic sequences in preference to other commonly employed techniques (such as Markov chains, hidden Markov models or Shannon entropy). The recent discovery that non-Markovian vocal sequences may be more common in animal communication than previously thought provides a rich area for future research that requires non-Markovian-based analysis techniques to investigate animal grammars and potentially the origin of human language.","container-title":"Methods in Ecology and Evolution","DOI":"10.1111/2041-210X.12433","ISSN":"2041-210X","issue":"12","language":"en","license":"© 2015 The Authors. Methods in Ecology and Evolution © 2015 British Ecological Society","note":"_eprint: https://onlinelibrary.wiley.com/doi/pdf/10.1111/2041-210X.12433","page":"1452-1461","source":"Wiley Online Library","title":"Quantifying similarity in animal vocal sequences: which metric performs best?","title-short":"Quantifying similarity in animal vocal sequences","volume":"6","author":[{"family":"Kershenbaum","given":"Arik"},{"family":"Garland","given":"Ellen C."}],"issued":{"date-parts":[["2015"]]}}}],"schema":"https://github.com/citation-style-language/schema/raw/master/csl-citation.json"} </w:instrText>
+      </w:r>
+      <w:r>
+        <w:rPr>
+          <w:rFonts w:ascii="Arial" w:hAnsi="Arial" w:cs="Arial"/>
+        </w:rPr>
+        <w:fldChar w:fldCharType="separate"/>
+      </w:r>
+      <w:r>
+        <w:rPr>
+          <w:rFonts w:ascii="Arial" w:hAnsi="Arial" w:cs="Arial"/>
+        </w:rPr>
+        <w:t>(</w:t>
+      </w:r>
+      <w:proofErr w:type="spellStart"/>
+      <w:r>
+        <w:rPr>
+          <w:rFonts w:ascii="Arial" w:hAnsi="Arial" w:cs="Arial"/>
+        </w:rPr>
+        <w:t>Kershenbaum</w:t>
+      </w:r>
+      <w:proofErr w:type="spellEnd"/>
+      <w:r>
+        <w:rPr>
+          <w:rFonts w:ascii="Arial" w:hAnsi="Arial" w:cs="Arial"/>
+        </w:rPr>
+        <w:t xml:space="preserve"> &amp; Garland, 2015)</w:t>
+      </w:r>
+      <w:r>
+        <w:rPr>
+          <w:rFonts w:ascii="Arial" w:hAnsi="Arial" w:cs="Arial"/>
+        </w:rPr>
+        <w:fldChar w:fldCharType="end"/>
+      </w:r>
+      <w:r>
+        <w:rPr>
+          <w:rFonts w:ascii="Arial" w:hAnsi="Arial" w:cs="Arial"/>
+        </w:rPr>
+        <w:t xml:space="preserve"> or to </w:t>
+      </w:r>
+      <w:r>
+        <w:rPr>
+          <w:rFonts w:ascii="Arial" w:hAnsi="Arial" w:cs="Arial"/>
+        </w:rPr>
+        <w:t>validate</w:t>
+      </w:r>
+      <w:r>
+        <w:rPr>
+          <w:rFonts w:ascii="Arial" w:hAnsi="Arial" w:cs="Arial"/>
+        </w:rPr>
+        <w:t xml:space="preserve"> new methods for calculate and quantify acoustic structure </w:t>
+      </w:r>
+      <w:r>
+        <w:rPr>
+          <w:rFonts w:ascii="Arial" w:hAnsi="Arial" w:cs="Arial"/>
+        </w:rPr>
+        <w:fldChar w:fldCharType="begin"/>
+      </w:r>
+      <w:r>
+        <w:rPr>
+          <w:rFonts w:ascii="Arial" w:hAnsi="Arial" w:cs="Arial"/>
+        </w:rPr>
+        <w:instrText xml:space="preserve"> ADDIN ZOTERO_ITEM CSL_CITATION {"citationID":"UxTXoiAQ","properties":{"formattedCitation":"(Keen et al., 2021; Sawant et al., 2022)","plainCitation":"(Keen et al., 2021; Sawant et al., 2022)","noteIndex":0},"citationItems":[{"id":558,"uris":["http://zotero.org/groups/5786507/items/ZECAX5J9"],"itemData":{"id":558,"type":"article-journal","abstract":"Assessing diversity of discretely varying behaviour is a classical ethological problem. In particular, the challenge of calculating an individuals’ or species’ vocal repertoire size is often an important step in ecological and behavioural studies, but a reproducible and broadly applicable method for accomplishing this task is not currently available. We offer a generalizable method to automate the calculation and quantification of acoustic diversity using an unsupervised random forest framework. We tested our method using natural and synthetic datasets of known repertoire sizes that exhibit standardized variation in common acoustic features as well as in recording quality. We tested two approaches to estimate acoustic diversity using the output from unsupervised random forest analyses: (a) cluster analysis to estimate the number of discrete acoustic signals (e.g. repertoire size) and (b) an estimation of acoustic area in acoustic feature space, as a proxy for repertoire size. We find that our unsupervised analyses classify acoustic structure with high accuracy. Specifically, both approaches accurately estimate element diversity when repertoire size is small to intermediate (5–20 unique elements). However, for larger datasets (20–100 unique elements), we find that calculating the size of the area occupied in acoustic space is a more reliable proxy for estimating repertoire size. We conclude that our implementation of unsupervised random forest analysis offers a generalizable tool that researchers can apply to classify acoustic structure of diverse datasets. Additionally, output from these analyses can be used to compare the distribution and diversity of signals in acoustic space, creating opportunities to quantify and compare the amount of acoustic variation among individuals, populations or species in a standardized way. We provide R code and examples to aid researchers interested in using these techniques.","container-title":"Methods in Ecology and Evolution","DOI":"10.1111/2041-210X.13599","ISSN":"2041-210X","issue":"7","language":"en","license":"© 2021 British Ecological Society","note":"_eprint: https://onlinelibrary.wiley.com/doi/pdf/10.1111/2041-210X.13599","page":"1213-1225","source":"Wiley Online Library","title":"A machine learning approach for classifying and quantifying acoustic diversity","volume":"12","author":[{"family":"Keen","given":"Sara C."},{"family":"Odom","given":"Karan J."},{"family":"Webster","given":"Michael S."},{"family":"Kohn","given":"Gregory M."},{"family":"Wright","given":"Timothy F."},{"family":"Araya-Salas","given":"Marcelo"}],"issued":{"date-parts":[["2021"]]}}},{"id":563,"uris":["http://zotero.org/groups/5786507/items/F9NHL8ST"],"itemData":{"id":563,"type":"article-journal","abstract":"Birdsong is an important signal in mate attraction and territorial defence. Quantifying the complexity of these songs can shed light on individual fitness, sexual selection and behaviour. Several techniques have been used to quantify song complexity and be broadly categorized into measures of sequential variations and measures of diversity. However, these methods are unable to account for important acoustic features like the frequency bandwidth and the variety in the spectro-temporal shape of notes which are an integral part of these vocal signals. This study proposes a new complexity method that considers intra-song note variability and calculates a weighted index for birdsongs using spectral cross-correlation. We first compared previously described methods to understand their advantages and limitations based on the factors that would affect the complexity of songs. We then developed a new method, Note Variability Index (NVI), which incorporates the spectral features of notes to quantify complexity. This method alleviates the need for manual classification of notes that can be error-prone. We used spectrogram cross-correlation to compare notes within a song and used the output values to quantify song complexity. To evaluate the efficacy of the new method, we generated synthetic songs to caricature extremes in song complexity and compared selected conventional complexity methods along with the NVI. We provide case-specific limitations of these methods. Additionally, to examine the efficacy of this new method in real-world scenarios, we used natural birdsongs from multiple species across the globe with varying song structures to compare conventional methods with NVI. To our knowledge, NVI is the only song complexity method that captures the variation of spectro-temporal shapes of the notes in songs where the conventional methods fail to distinguish between similar song structures with different note types. Furthermore, as NVI does not need a manual classification of notes, it can be easily implemented for any type of birdsong with existing sound analysis software; it is quick, avoids the possible subjectivity in note classification and can be automated for large datasets.","container-title":"Methods in Ecology and Evolution","DOI":"10.1111/2041-210X.13765","ISSN":"2041-210X","issue":"2","language":"en","license":"© 2021 British Ecological Society","note":"_eprint: https://onlinelibrary.wiley.com/doi/pdf/10.1111/2041-210X.13765","page":"459-472","source":"Wiley Online Library","title":"Spectrogram cross-correlation can be used to measure the complexity of bird vocalizations","volume":"13","author":[{"family":"Sawant","given":"Suyash"},{"family":"Arvind","given":"Chiti"},{"family":"Joshi","given":"Viral"},{"family":"Robin","given":"V. V."}],"issued":{"date-parts":[["2022"]]}}}],"schema":"https://github.com/citation-style-language/schema/raw/master/csl-citation.json"} </w:instrText>
+      </w:r>
+      <w:r>
+        <w:rPr>
+          <w:rFonts w:ascii="Arial" w:hAnsi="Arial" w:cs="Arial"/>
+        </w:rPr>
+        <w:fldChar w:fldCharType="separate"/>
+      </w:r>
+      <w:r>
+        <w:rPr>
+          <w:rFonts w:ascii="Arial" w:hAnsi="Arial" w:cs="Arial"/>
+        </w:rPr>
+        <w:t>(Keen et al., 2021; Sawant et al., 2022)</w:t>
+      </w:r>
+      <w:r>
+        <w:rPr>
+          <w:rFonts w:ascii="Arial" w:hAnsi="Arial" w:cs="Arial"/>
+        </w:rPr>
+        <w:fldChar w:fldCharType="end"/>
+      </w:r>
+      <w:r>
+        <w:rPr>
+          <w:rFonts w:ascii="Arial" w:hAnsi="Arial" w:cs="Arial"/>
+        </w:rPr>
+        <w:t xml:space="preserve">. There are several packages in R that allow researchers to create synthetic vocal signal datasets with biological relevance. </w:t>
+      </w:r>
+      <w:commentRangeStart w:id="14"/>
+      <w:r>
+        <w:rPr>
+          <w:rFonts w:ascii="Arial" w:hAnsi="Arial" w:cs="Arial"/>
+        </w:rPr>
+        <w:t xml:space="preserve">[sentences about </w:t>
+      </w:r>
+      <w:proofErr w:type="spellStart"/>
+      <w:r>
+        <w:rPr>
+          <w:rFonts w:ascii="Arial" w:hAnsi="Arial" w:cs="Arial"/>
+        </w:rPr>
+        <w:t>wableR</w:t>
+      </w:r>
+      <w:proofErr w:type="spellEnd"/>
+      <w:r>
+        <w:rPr>
+          <w:rFonts w:ascii="Arial" w:hAnsi="Arial" w:cs="Arial"/>
+        </w:rPr>
+        <w:t xml:space="preserve"> and </w:t>
+      </w:r>
+      <w:proofErr w:type="spellStart"/>
+      <w:r>
+        <w:rPr>
+          <w:rFonts w:ascii="Arial" w:hAnsi="Arial" w:cs="Arial"/>
+        </w:rPr>
+        <w:t>soundgen</w:t>
+      </w:r>
+      <w:proofErr w:type="spellEnd"/>
+      <w:r>
+        <w:rPr>
+          <w:rFonts w:ascii="Arial" w:hAnsi="Arial" w:cs="Arial"/>
+        </w:rPr>
+        <w:t>]</w:t>
+      </w:r>
+      <w:commentRangeEnd w:id="14"/>
+      <w:r>
+        <w:rPr>
+          <w:rStyle w:val="CommentReference"/>
+        </w:rPr>
+        <w:commentReference w:id="14"/>
+      </w:r>
+      <w:r>
+        <w:rPr>
+          <w:rFonts w:ascii="Arial" w:hAnsi="Arial" w:cs="Arial"/>
+        </w:rPr>
         <w:t xml:space="preserve">. </w:t>
       </w:r>
-      <w:commentRangeStart w:id="12"/>
-      <w:r>
-        <w:rPr>
-          <w:rFonts w:ascii="Arial" w:hAnsi="Arial" w:cs="Arial"/>
-        </w:rPr>
-        <w:t xml:space="preserve">Second, Condensing information down to a unit does not allow </w:t>
-      </w:r>
-      <w:r>
-        <w:rPr>
-          <w:rFonts w:ascii="Arial" w:hAnsi="Arial" w:cs="Arial"/>
-        </w:rPr>
-        <w:lastRenderedPageBreak/>
-        <w:t>for the assessment of multiple types of information at one time</w:t>
-      </w:r>
-      <w:r>
-        <w:rPr>
-          <w:rFonts w:ascii="Arial" w:hAnsi="Arial" w:cs="Arial"/>
-        </w:rPr>
-        <w:t xml:space="preserve"> [</w:t>
-      </w:r>
-      <w:r>
-        <w:rPr>
-          <w:rFonts w:ascii="Arial" w:hAnsi="Arial" w:cs="Arial"/>
-        </w:rPr>
-        <w:t xml:space="preserve">multidimensional/hierarchical social information + internal state + environmental </w:t>
-      </w:r>
-      <w:r>
-        <w:rPr>
-          <w:rFonts w:ascii="Arial" w:hAnsi="Arial" w:cs="Arial"/>
-        </w:rPr>
-        <w:t>context]</w:t>
-      </w:r>
-      <w:commentRangeEnd w:id="12"/>
+      <w:commentRangeStart w:id="15"/>
+      <w:r>
+        <w:rPr>
+          <w:rFonts w:ascii="Arial" w:hAnsi="Arial" w:cs="Arial"/>
+        </w:rPr>
+        <w:t xml:space="preserve">An underused function of these packages in animal communication is that they provide researchers with the ability to </w:t>
+      </w:r>
+      <w:r>
+        <w:rPr>
+          <w:rFonts w:ascii="Arial" w:hAnsi="Arial" w:cs="Arial"/>
+        </w:rPr>
+        <w:t xml:space="preserve">manipulate information in synthetic signals to specifically study the types of information encoded in a signal, how much information is encoded, and where the information is encoded in a signal. </w:t>
+      </w:r>
+      <w:commentRangeEnd w:id="15"/>
       <w:r>
         <w:rPr>
           <w:rStyle w:val="CommentReference"/>
         </w:rPr>
-        <w:commentReference w:id="12"/>
-      </w:r>
-      <w:r>
-        <w:rPr>
-          <w:rFonts w:ascii="Arial" w:hAnsi="Arial" w:cs="Arial"/>
-        </w:rPr>
-        <w:t xml:space="preserve">. </w:t>
-      </w:r>
-      <w:r>
-        <w:rPr>
-          <w:rFonts w:ascii="Arial" w:hAnsi="Arial" w:cs="Arial"/>
-        </w:rPr>
-        <w:t xml:space="preserve">Third [something about how </w:t>
-      </w:r>
-      <w:r>
-        <w:rPr>
-          <w:rFonts w:ascii="Arial" w:hAnsi="Arial" w:cs="Arial"/>
-        </w:rPr>
-        <w:t>it’s</w:t>
-      </w:r>
-      <w:r>
-        <w:rPr>
-          <w:rFonts w:ascii="Arial" w:hAnsi="Arial" w:cs="Arial"/>
-        </w:rPr>
-        <w:t xml:space="preserve"> hard to capture an individuals or group’s complete </w:t>
-      </w:r>
-      <w:commentRangeStart w:id="13"/>
-      <w:r>
-        <w:rPr>
-          <w:rFonts w:ascii="Arial" w:hAnsi="Arial" w:cs="Arial"/>
-        </w:rPr>
-        <w:t>repertoire</w:t>
-      </w:r>
-      <w:commentRangeEnd w:id="13"/>
-      <w:r>
-        <w:rPr>
-          <w:rStyle w:val="CommentReference"/>
-        </w:rPr>
-        <w:commentReference w:id="13"/>
-      </w:r>
-      <w:r>
-        <w:rPr>
-          <w:rFonts w:ascii="Arial" w:hAnsi="Arial" w:cs="Arial"/>
-        </w:rPr>
-        <w:t>, so conclusions from these tools are limited to species that are easy to sample from.]</w:t>
-      </w:r>
-      <w:r>
-        <w:rPr>
-          <w:rFonts w:ascii="Arial" w:hAnsi="Arial" w:cs="Arial"/>
-        </w:rPr>
-        <w:t xml:space="preserve">  </w:t>
-      </w:r>
-      <w:r>
-        <w:rPr>
-          <w:rFonts w:ascii="Arial" w:hAnsi="Arial" w:cs="Arial"/>
-        </w:rPr>
-        <w:t xml:space="preserve">Because of these limitations, we are missing critical information _____. </w:t>
-      </w:r>
-    </w:p>
-    <w:p>
-      <w:pPr>
-        <w:spacing w:line="360" w:lineRule="auto"/>
-        <w:rPr>
-          <w:rFonts w:ascii="Arial" w:hAnsi="Arial" w:cs="Arial"/>
-        </w:rPr>
-      </w:pPr>
-      <w:r>
-        <w:rPr>
-          <w:rFonts w:ascii="Arial" w:hAnsi="Arial" w:cs="Arial"/>
-        </w:rPr>
-        <w:tab/>
-      </w:r>
-      <w:r>
-        <w:rPr>
-          <w:rFonts w:ascii="Arial" w:hAnsi="Arial" w:cs="Arial"/>
-        </w:rPr>
-        <w:t>Synthetic</w:t>
-      </w:r>
-      <w:r>
-        <w:rPr>
-          <w:rFonts w:ascii="Arial" w:hAnsi="Arial" w:cs="Arial"/>
-        </w:rPr>
-        <w:t xml:space="preserve"> tools offer a practical solution. [</w:t>
-      </w:r>
-      <w:commentRangeStart w:id="14"/>
-      <w:commentRangeStart w:id="15"/>
-      <w:r>
-        <w:rPr>
-          <w:rFonts w:ascii="Arial" w:hAnsi="Arial" w:cs="Arial"/>
-        </w:rPr>
-        <w:t>Review other papers that use synthetic tools</w:t>
-      </w:r>
-      <w:commentRangeEnd w:id="14"/>
-      <w:r>
-        <w:rPr>
-          <w:rStyle w:val="CommentReference"/>
-        </w:rPr>
-        <w:commentReference w:id="14"/>
-      </w:r>
-      <w:commentRangeEnd w:id="15"/>
-      <w:r>
-        <w:rPr>
-          <w:rStyle w:val="CommentReference"/>
-        </w:rPr>
         <w:commentReference w:id="15"/>
-      </w:r>
-      <w:r>
-        <w:rPr>
-          <w:rFonts w:ascii="Arial" w:hAnsi="Arial" w:cs="Arial"/>
-        </w:rPr>
-        <w:t>]</w:t>
-      </w:r>
-      <w:r>
-        <w:rPr>
-          <w:rFonts w:ascii="Arial" w:hAnsi="Arial" w:cs="Arial"/>
-        </w:rPr>
-        <w:t xml:space="preserve"> </w:t>
-      </w:r>
-      <w:r>
-        <w:rPr>
-          <w:rFonts w:ascii="Arial" w:hAnsi="Arial" w:cs="Arial"/>
-        </w:rPr>
-        <w:t xml:space="preserve"> [Sentence about linking synthetic tools to specifically studying types of information encoded, how much, and where it is encoded in the signal]. </w:t>
-      </w:r>
-    </w:p>
-    <w:p>
-      <w:pPr>
-        <w:pStyle w:val="ListParagraph"/>
-        <w:numPr>
-          <w:ilvl w:val="0"/>
-          <w:numId w:val="8"/>
-        </w:numPr>
-        <w:spacing w:line="360" w:lineRule="auto"/>
-        <w:rPr>
-          <w:rFonts w:ascii="Arial" w:hAnsi="Arial" w:cs="Arial"/>
-        </w:rPr>
-      </w:pPr>
-      <w:r>
-        <w:rPr>
-          <w:rFonts w:ascii="Arial" w:hAnsi="Arial" w:cs="Arial"/>
-        </w:rPr>
-        <w:fldChar w:fldCharType="begin"/>
-      </w:r>
-      <w:r>
-        <w:rPr>
-          <w:rFonts w:ascii="Arial" w:hAnsi="Arial" w:cs="Arial"/>
-        </w:rPr>
-        <w:instrText xml:space="preserve"> ADDIN ZOTERO_ITEM CSL_CITATION {"citationID":"2uobE2Z9","properties":{"formattedCitation":"(Kershenbaum &amp; Garland, 2015)","plainCitation":"(Kershenbaum &amp; Garland, 2015)","noteIndex":0},"citationItems":[{"id":544,"uris":["http://zotero.org/groups/5786507/items/WJJ2WCSZ"],"itemData":{"id":544,"type":"article-journal","abstract":"Many animals communicate using sequences of discrete acoustic elements which can be complex, vary in their degree of stereotypy, and are potentially open-ended. Variation in sequences can provide important ecological, behavioural or evolutionary information about the structure and connectivity of populations, mechanisms for vocal cultural evolution and the underlying drivers responsible for these processes. Various mathematical techniques have been used to form a realistic approximation of sequence similarity for such tasks. Here, we use both simulated and empirical data sets from animal vocal sequences (rock hyrax, Procavia capensis; humpback whale, Megaptera novaeangliae; bottlenose dolphin, Tursiops truncatus; and Carolina chickadee, Poecile carolinensis) to test which of eight sequence analysis metrics are more likely to reconstruct the information encoded in the sequences, and to test the fidelity of estimation of model parameters, when the sequences are assumed to conform to particular statistical models. Results from the simulated data indicated that multiple metrics were equally successful in reconstructing the information encoded in the sequences of simulated individuals (Markov chains, n-gram models, repeat distribution and edit distance) and data generated by different stochastic processes (entropy rate and n-grams). However, the string edit (Levenshtein) distance performed consistently and significantly better than all other tested metrics (including entropy, Markov chains, n-grams, mutual information) for all empirical data sets, despite being less commonly used in the field of animal acoustic communication. The Levenshtein distance metric provides a robust analytical approach that should be considered in the comparison of animal acoustic sequences in preference to other commonly employed techniques (such as Markov chains, hidden Markov models or Shannon entropy). The recent discovery that non-Markovian vocal sequences may be more common in animal communication than previously thought provides a rich area for future research that requires non-Markovian-based analysis techniques to investigate animal grammars and potentially the origin of human language.","container-title":"Methods in Ecology and Evolution","DOI":"10.1111/2041-210X.12433","ISSN":"2041-210X","issue":"12","language":"en","license":"© 2015 The Authors. Methods in Ecology and Evolution © 2015 British Ecological Society","note":"_eprint: https://onlinelibrary.wiley.com/doi/pdf/10.1111/2041-210X.12433","page":"1452-1461","source":"Wiley Online Library","title":"Quantifying similarity in animal vocal sequences: which metric performs best?","title-short":"Quantifying similarity in animal vocal sequences","volume":"6","author":[{"family":"Kershenbaum","given":"Arik"},{"family":"Garland","given":"Ellen C."}],"issued":{"date-parts":[["2015"]]}}}],"schema":"https://github.com/citation-style-language/schema/raw/master/csl-citation.json"} </w:instrText>
-      </w:r>
-      <w:r>
-        <w:rPr>
-          <w:rFonts w:ascii="Arial" w:hAnsi="Arial" w:cs="Arial"/>
-        </w:rPr>
-        <w:fldChar w:fldCharType="separate"/>
-      </w:r>
-      <w:r>
-        <w:rPr>
-          <w:rFonts w:ascii="Arial" w:hAnsi="Arial" w:cs="Arial"/>
-        </w:rPr>
-        <w:t>(Kershenbaum &amp; Garland, 2015)</w:t>
-      </w:r>
-      <w:r>
-        <w:rPr>
-          <w:rFonts w:ascii="Arial" w:hAnsi="Arial" w:cs="Arial"/>
-        </w:rPr>
-        <w:fldChar w:fldCharType="end"/>
-      </w:r>
-      <w:r>
-        <w:rPr>
-          <w:rFonts w:ascii="Arial" w:hAnsi="Arial" w:cs="Arial"/>
-        </w:rPr>
-        <w:t xml:space="preserve"> – </w:t>
-      </w:r>
-      <w:r>
-        <w:rPr>
-          <w:rFonts w:ascii="Arial" w:hAnsi="Arial" w:cs="Arial"/>
-        </w:rPr>
-        <w:t>Quantifying</w:t>
-      </w:r>
-      <w:r>
-        <w:rPr>
-          <w:rFonts w:ascii="Arial" w:hAnsi="Arial" w:cs="Arial"/>
-        </w:rPr>
-        <w:t xml:space="preserve"> similarity in animal vocal sequences. Used synthetic and empirical data sets of 4 different species to compare which of eight sequence analysis metrics is more likely to reconstruct information encoded in the sequences and test fidelity of estimation of model parameters.</w:t>
       </w:r>
     </w:p>
     <w:p>
@@ -1870,7 +1997,82 @@
         <w:rPr>
           <w:rFonts w:ascii="Arial" w:hAnsi="Arial" w:cs="Arial"/>
         </w:rPr>
-        <w:t xml:space="preserve"> that combines a new synthetic tool and traditional bioacoustics analyses in a dual step approach. We </w:t>
+        <w:t xml:space="preserve"> that combines a new synthetic tool and traditional bioacoustics analyses in a dual step approach. </w:t>
+      </w:r>
+      <w:r>
+        <w:rPr>
+          <w:rFonts w:ascii="Arial" w:hAnsi="Arial" w:cs="Arial"/>
+        </w:rPr>
+        <w:t>Using this synthetic tool, we can encode both group and individual information in the frequency of signals, as research suggests that group and individual information are likely to be frequency encoded</w:t>
+      </w:r>
+      <w:r>
+        <w:rPr>
+          <w:rFonts w:ascii="Arial" w:hAnsi="Arial" w:cs="Arial"/>
+        </w:rPr>
+        <w:t xml:space="preserve"> </w:t>
+      </w:r>
+      <w:r>
+        <w:rPr>
+          <w:rFonts w:ascii="Arial" w:hAnsi="Arial" w:cs="Arial"/>
+        </w:rPr>
+        <w:fldChar w:fldCharType="begin"/>
+      </w:r>
+      <w:r>
+        <w:rPr>
+          <w:rFonts w:ascii="Arial" w:hAnsi="Arial" w:cs="Arial"/>
+        </w:rPr>
+        <w:instrText xml:space="preserve"> ADDIN ZOTERO_ITEM CSL_CITATION {"citationID":"xRhW3o3x","properties":{"formattedCitation":"(Berg, Delgado, Okawa, et al., 2011; Janik et al., 2006; Janik &amp; Sayigh, 2013; Janik &amp; Slater, 2000; Wright, 1997b)","plainCitation":"(Berg, Delgado, Okawa, et al., 2011; Janik et al., 2006; Janik &amp; Sayigh, 2013; Janik &amp; Slater, 2000; Wright, 1997b)","noteIndex":0},"citationItems":[{"id":527,"uris":["http://zotero.org/groups/5786507/items/M5RQLYC2"],"itemData":{"id":527,"type":"article-journal","abstract":"Contact calls function to coordinate movements in a wide variety of social animals. Where population density is high, visibility is low and repeated interactions occur between known social companions, calls are often individually recognizable. Parrots are highly social and make substantial daily movements, which appear to be mediated through contact calling. However, there is little experimental evidence for how free-ranging parrots recognize social companions. We quantified intra- and interindividual variation of contact calls in a banded population of green-rumped parrotlets in Venezuela. Recordings of a sample of males were made on replicate days as they announced their return to incubating mates. Spectrographic structure of these contact calls showed significantly more variation between than within individuals, and calls could be correctly classified to individuals more often than was expected by chance. Males varied across multiple dimensions simultaneously, including duration, frequency and frequency modulation of contact calls. Playback experiments showed that free-ranging female parrotlets responded significantly more often to their mates’ calls than to calls of males of other nests. Mate recognition via contact calls may be selectively advantageous during incubation and brooding if this reduces the potential costs associated with confusing contact calls of mates with those of nonmates, including infanticidal conspecifics.","container-title":"Animal Behaviour","DOI":"10.1016/j.anbehav.2010.10.012","ISSN":"0003-3472","issue":"1","journalAbbreviation":"Animal Behaviour","page":"241-248","source":"ScienceDirect","title":"Contact calls are used for individual mate recognition in free-ranging green-rumped parrotlets, &lt;i&gt;Forpus passerinus&lt;/i&gt;","volume":"81","author":[{"family":"Berg","given":"Karl S."},{"family":"Delgado","given":"Soraya"},{"family":"Okawa","given":"Rae"},{"family":"Beissinger","given":"Steven R."},{"family":"Bradbury","given":"Jack W."}],"issued":{"date-parts":[["2011",1,1]]}}},{"id":569,"uris":["http://zotero.org/groups/5786507/items/JNKBUUG2"],"itemData":{"id":569,"type":"article-journal","container-title":"PNAS","issue":"21","page":"8293-8297","title":"Signature whistle shape conveys identity information to bottlenose dolphins","volume":"103","author":[{"family":"Janik","given":"Vincent M."},{"family":"Sayigh","given":"L.S."},{"family":"Wells","given":"R.S."}],"issued":{"date-parts":[["2006"]]}}},{"id":571,"uris":["http://zotero.org/groups/5786507/items/8JR8VHHB"],"itemData":{"id":571,"type":"article-journal","abstract":"Bottlenose dolphins (Tursiops truncatus) produce individually distinctive signature whistles that broadcast the identity of the caller. Unlike voice cues that affect all calls of an animal, signature whistles are distinct whistle types carrying identity information in their frequency modulation pattern. Signature whistle development is influenced by vocal production learning. Animals use a whistle from their environment as a model, but modify it, and thus invent a novel signal. Dolphins also copy signature whistles of others, effectively addressing the whistle owner. This copying occurs at low rates and the resulting copies are recognizable as such by parameter variations in the copy. Captive dolphins can learn to associate novel whistles with objects and use these whistles to report on the presence or absence of the object. If applied to signature whistles, this ability would make the signature whistle a rare example of a learned referential signal in animals. Here, we review the history of signature whistle research, covering definitions, acoustic features, information content, contextual use, developmental aspects, and species comparisons with mammals and birds. We show how these signals stand out amongst recognition calls in animals and how they contribute to our understanding of complexity in animal communication.","container-title":"Journal of Comparative Physiology A","DOI":"10.1007/s00359-013-0817-7","ISSN":"1432-1351","issue":"6","journalAbbreviation":"J Comp Physiol A","language":"en","page":"479-489","source":"Springer Link","title":"Communication in bottlenose dolphins: 50 years of signature whistle research","title-short":"Communication in bottlenose dolphins","volume":"199","author":[{"family":"Janik","given":"Vincent M."},{"family":"Sayigh","given":"Laela S."}],"issued":{"date-parts":[["2013",6,1]]}}},{"id":512,"uris":["http://zotero.org/groups/5786507/items/U3SX9JPF"],"itemData":{"id":512,"type":"article-journal","abstract":"While vocal learning has been studied extensively in birds and mammals, little effort has been made to define what exactly constitutes vocal learning and to classify the forms that it may take. We present such a theoretical framework for the study of social learning in vocal communication. We define different forms of social learning that affect communication and discuss the required methodology to show each one. We distinguish between contextual and production learning in animal communication. Contextual learning affects the behavioural context or serial position of a signal. It can affect both usage and comprehension. Production learning refers to instances where the signals themselves are modified in form as a result of experience with those of other individuals. Vocal learning is defined as production learning in the vocal domain. It can affect one or more of three systems: the respiratory, phonatory and filter systems. Each involves a different level of control over the sound production apparatus. We hypothesize that contextual learning and respiratory production learning preceded the evolution of phonatory and filter production learning. Each form of learning potentially increases the complexity of a communication system. We also found that unexpected genetic or environmental factors can have considerable effects on vocal behaviour in birds and mammals and are often more likely to cause changes or differences in vocalizations than investigators may assume. Finally, we discuss how production learning is used in innovation and invention, and present important future research questions.","container-title":"Animal Behaviour","DOI":"10.1006/anbe.2000.1410","ISSN":"0003-3472","issue":"1","journalAbbreviation":"Animal Behaviour","page":"1-11","source":"ScienceDirect","title":"The different roles of social learning in vocal communication","volume":"60","author":[{"family":"Janik","given":"Vincent M."},{"family":"Slater","given":"Peter J. B."}],"issued":{"date-parts":[["2000",7,1]]}}},{"id":568,"uris":["http://zotero.org/groups/5786507/items/STVUSI8N"],"itemData":{"id":568,"type":"article-journal","abstract":"This study describes a system of regional dialects in the contact call of a parrot, the yellow-naped amazon (Amazona auropalliata.) Spectrographic cross-correlation analyses of calls from multiple adults at 16 roosts in Costa Rica reveal two distinct patterns of geographic variation in call structure: first, variation in the basic structure of the call by which roosts can be classified into three distinct dialects, and second, fine-scale variation of call structure among roosts within a dialect. Some birds at roosts bordering two dialects use the calls of both neighbouring dialects interchangeably. These results suggest that there are two distinct processes governing the diffusion of call types among roosts, with dialect borders acting as barriers to the spread of foreign calls. Such a dialect system could be maintained through either reduced dispersal of birds across dialect boundaries or alternatively, by reduced diffusion of call types. These two possibilities have different implications for the genetic isolation of populations and thus for both speciation and learning. This pattern is broadly similar to those seen in some songbirds and may be maintained in a similar manner.","container-title":"Proceedings of the Royal Society of London. Series B: Biological Sciences","DOI":"10.1098/rspb.1996.0128","issue":"1372","note":"publisher: Royal Society","page":"867-872","source":"royalsocietypublishing.org (Atypon)","title":"Regional dialects in the contact call of a parrot","volume":"263","author":[{"family":"Wright","given":"Timothy F."}],"issued":{"date-parts":[["1997",1]]}}}],"schema":"https://github.com/citation-style-language/schema/raw/master/csl-citation.json"} </w:instrText>
+      </w:r>
+      <w:r>
+        <w:rPr>
+          <w:rFonts w:ascii="Arial" w:hAnsi="Arial" w:cs="Arial"/>
+        </w:rPr>
+        <w:fldChar w:fldCharType="separate"/>
+      </w:r>
+      <w:r>
+        <w:rPr>
+          <w:rFonts w:ascii="Arial" w:hAnsi="Arial" w:cs="Arial"/>
+        </w:rPr>
+        <w:t xml:space="preserve">(Berg, Delgado, Okawa, et al., 2011; Janik et al., 2006; Janik &amp; </w:t>
+      </w:r>
+      <w:proofErr w:type="spellStart"/>
+      <w:r>
+        <w:rPr>
+          <w:rFonts w:ascii="Arial" w:hAnsi="Arial" w:cs="Arial"/>
+        </w:rPr>
+        <w:t>Sayigh</w:t>
+      </w:r>
+      <w:proofErr w:type="spellEnd"/>
+      <w:r>
+        <w:rPr>
+          <w:rFonts w:ascii="Arial" w:hAnsi="Arial" w:cs="Arial"/>
+        </w:rPr>
+        <w:t>, 2013; Janik &amp; Slater, 2000; Wright, 1997b)</w:t>
+      </w:r>
+      <w:r>
+        <w:rPr>
+          <w:rFonts w:ascii="Arial" w:hAnsi="Arial" w:cs="Arial"/>
+        </w:rPr>
+        <w:fldChar w:fldCharType="end"/>
+      </w:r>
+      <w:r>
+        <w:rPr>
+          <w:rFonts w:ascii="Arial" w:hAnsi="Arial" w:cs="Arial"/>
+        </w:rPr>
+        <w:t xml:space="preserve">. We then use traditional bioacoustics analyses to create an “information recovery pipeline” to showcase the fidelity of these approaches in recovering information that was originally </w:t>
+      </w:r>
+      <w:r>
+        <w:rPr>
+          <w:rFonts w:ascii="Arial" w:hAnsi="Arial" w:cs="Arial"/>
+        </w:rPr>
+        <w:lastRenderedPageBreak/>
+        <w:t xml:space="preserve">encoded in a signal. </w:t>
+      </w:r>
+      <w:r>
+        <w:rPr>
+          <w:rFonts w:ascii="Arial" w:hAnsi="Arial" w:cs="Arial"/>
+        </w:rPr>
+        <w:t xml:space="preserve">We </w:t>
       </w:r>
       <w:r>
         <w:rPr>
@@ -1918,203 +2120,38 @@
         <w:rPr>
           <w:rFonts w:ascii="Arial" w:hAnsi="Arial" w:cs="Arial"/>
         </w:rPr>
-        <w:t>allows us to model information theory from the encoding and decoding of information</w:t>
-      </w:r>
-      <w:r>
-        <w:rPr>
-          <w:rFonts w:ascii="Arial" w:hAnsi="Arial" w:cs="Arial"/>
-        </w:rPr>
-        <w:t xml:space="preserve">, while simplifying the complex organic process that occurs in both signalers and receivers, allowing for the </w:t>
-      </w:r>
-      <w:commentRangeStart w:id="19"/>
-      <w:r>
-        <w:rPr>
-          <w:rFonts w:ascii="Arial" w:hAnsi="Arial" w:cs="Arial"/>
-        </w:rPr>
-        <w:t>creation of controlled information encoding and decoding</w:t>
-      </w:r>
-      <w:commentRangeEnd w:id="19"/>
-      <w:r>
-        <w:rPr>
-          <w:rStyle w:val="CommentReference"/>
-        </w:rPr>
-        <w:commentReference w:id="19"/>
-      </w:r>
-      <w:r>
-        <w:rPr>
-          <w:rFonts w:ascii="Arial" w:hAnsi="Arial" w:cs="Arial"/>
-        </w:rPr>
-        <w:t xml:space="preserve">. [detail what readers can expect in the paper: ie First we introduce the paRsynth package, second we blah blah blah]. </w:t>
-      </w:r>
-    </w:p>
-    <w:p>
-      <w:pPr>
-        <w:rPr>
-          <w:rFonts w:ascii="Arial" w:hAnsi="Arial" w:cs="Arial"/>
-        </w:rPr>
-      </w:pPr>
-    </w:p>
-    <w:p>
-      <w:pPr>
-        <w:rPr>
-          <w:rFonts w:ascii="Arial" w:hAnsi="Arial" w:cs="Arial"/>
-        </w:rPr>
-      </w:pPr>
-    </w:p>
-    <w:p>
-      <w:pPr>
-        <w:rPr>
-          <w:rFonts w:ascii="Arial" w:hAnsi="Arial" w:cs="Arial"/>
-        </w:rPr>
-      </w:pPr>
-      <w:r>
-        <w:rPr>
-          <w:rFonts w:ascii="Arial" w:hAnsi="Arial" w:cs="Arial"/>
-        </w:rPr>
-        <w:t>Goals of this paper:</w:t>
-      </w:r>
-    </w:p>
-    <w:p>
-      <w:pPr>
-        <w:pStyle w:val="ListParagraph"/>
-        <w:numPr>
-          <w:ilvl w:val="0"/>
-          <w:numId w:val="1"/>
-        </w:numPr>
-        <w:rPr>
-          <w:rFonts w:ascii="Arial" w:hAnsi="Arial" w:cs="Arial"/>
-        </w:rPr>
-      </w:pPr>
-      <w:r>
-        <w:rPr>
-          <w:rFonts w:ascii="Arial" w:hAnsi="Arial" w:cs="Arial"/>
-        </w:rPr>
-        <w:t>Linking an information theory perspective to creating synthetic signals and controlling types and amounts of information encoded in these signals (paRsynth package)</w:t>
-      </w:r>
-    </w:p>
-    <w:p>
-      <w:pPr>
-        <w:pStyle w:val="ListParagraph"/>
-        <w:numPr>
-          <w:ilvl w:val="1"/>
-          <w:numId w:val="1"/>
-        </w:numPr>
-        <w:rPr>
-          <w:rFonts w:ascii="Arial" w:hAnsi="Arial" w:cs="Arial"/>
-        </w:rPr>
-      </w:pPr>
-      <w:r>
-        <w:rPr>
-          <w:rFonts w:ascii="Arial" w:hAnsi="Arial" w:cs="Arial"/>
-        </w:rPr>
-        <w:t>Be careful about pitching paRsynth too broadly, right now this is an in-house tool/set of functions</w:t>
-      </w:r>
-    </w:p>
-    <w:p>
-      <w:pPr>
-        <w:pStyle w:val="ListParagraph"/>
-        <w:numPr>
-          <w:ilvl w:val="1"/>
-          <w:numId w:val="1"/>
-        </w:numPr>
-        <w:rPr>
-          <w:rFonts w:ascii="Arial" w:hAnsi="Arial" w:cs="Arial"/>
-        </w:rPr>
-      </w:pPr>
-      <w:r>
-        <w:rPr>
-          <w:rFonts w:ascii="Arial" w:hAnsi="Arial" w:cs="Arial"/>
-        </w:rPr>
-        <w:t>Short statements about unit testing to show rigor</w:t>
-      </w:r>
-      <w:r>
-        <w:rPr>
-          <w:rFonts w:ascii="Arial" w:hAnsi="Arial" w:cs="Arial"/>
-        </w:rPr>
-        <w:t xml:space="preserve">, add details to the supplement </w:t>
-      </w:r>
-      <w:r>
-        <w:rPr>
-          <w:rFonts w:ascii="Arial" w:hAnsi="Arial" w:cs="Arial"/>
-        </w:rPr>
-        <w:t>(</w:t>
-      </w:r>
-      <w:r>
-        <w:rPr>
-          <w:rFonts w:ascii="Arial" w:hAnsi="Arial" w:cs="Arial"/>
-        </w:rPr>
-        <w:t>tested functionality and error handling</w:t>
-      </w:r>
-      <w:r>
-        <w:rPr>
-          <w:rFonts w:ascii="Arial" w:hAnsi="Arial" w:cs="Arial"/>
-        </w:rPr>
-        <w:t>)</w:t>
-      </w:r>
-    </w:p>
-    <w:p>
-      <w:pPr>
-        <w:pStyle w:val="ListParagraph"/>
-        <w:rPr>
-          <w:rFonts w:ascii="Arial" w:hAnsi="Arial" w:cs="Arial"/>
-        </w:rPr>
-      </w:pPr>
-    </w:p>
-    <w:p>
-      <w:pPr>
-        <w:pStyle w:val="ListParagraph"/>
-        <w:numPr>
-          <w:ilvl w:val="0"/>
-          <w:numId w:val="1"/>
-        </w:numPr>
-        <w:rPr>
-          <w:rFonts w:ascii="Arial" w:hAnsi="Arial" w:cs="Arial"/>
-        </w:rPr>
-      </w:pPr>
-      <w:r>
-        <w:rPr>
-          <w:rFonts w:ascii="Arial" w:hAnsi="Arial" w:cs="Arial"/>
-        </w:rPr>
-        <w:t>Using traditional bioacoustics analyses as “information recovery pipeline”, in other words, do traditional tools recover the information that was originally encoded in these signals?</w:t>
-      </w:r>
-      <w:r>
-        <w:rPr>
-          <w:rFonts w:ascii="Arial" w:hAnsi="Arial" w:cs="Arial"/>
-        </w:rPr>
-        <w:t xml:space="preserve"> </w:t>
-      </w:r>
-      <w:r>
-        <w:rPr>
-          <w:rFonts w:ascii="Arial" w:hAnsi="Arial" w:cs="Arial"/>
-        </w:rPr>
-        <w:t>An internal validation</w:t>
-      </w:r>
-      <w:r>
-        <w:rPr>
-          <w:rFonts w:ascii="Arial" w:hAnsi="Arial" w:cs="Arial"/>
-        </w:rPr>
-        <w:t xml:space="preserve">, also a way of validating tools </w:t>
-      </w:r>
-      <w:r>
-        <w:rPr>
-          <w:rFonts w:ascii="Arial" w:hAnsi="Arial" w:cs="Arial"/>
-        </w:rPr>
-        <w:lastRenderedPageBreak/>
-        <w:t>that are commonly used in the bioacoustics community</w:t>
-      </w:r>
-      <w:r>
-        <w:rPr>
-          <w:rFonts w:ascii="Arial" w:hAnsi="Arial" w:cs="Arial"/>
-        </w:rPr>
-        <w:t>. The reason we can do this is that we’re using synthetic signals</w:t>
-      </w:r>
-    </w:p>
-    <w:p>
-      <w:pPr>
-        <w:rPr>
-          <w:rFonts w:ascii="Arial" w:hAnsi="Arial" w:cs="Arial"/>
-        </w:rPr>
-      </w:pPr>
+        <w:t xml:space="preserve">allows us to model information theory </w:t>
+      </w:r>
+      <w:r>
+        <w:rPr>
+          <w:rFonts w:ascii="Arial" w:hAnsi="Arial" w:cs="Arial"/>
+        </w:rPr>
+        <w:t>via both</w:t>
+      </w:r>
+      <w:r>
+        <w:rPr>
+          <w:rFonts w:ascii="Arial" w:hAnsi="Arial" w:cs="Arial"/>
+        </w:rPr>
+        <w:t xml:space="preserve"> the encoding and decoding of information</w:t>
+      </w:r>
+      <w:r>
+        <w:rPr>
+          <w:rFonts w:ascii="Arial" w:hAnsi="Arial" w:cs="Arial"/>
+        </w:rPr>
+        <w:t>, while simplifying the complex organic process that occurs in both signalers and receivers</w:t>
+      </w:r>
+      <w:r>
+        <w:rPr>
+          <w:rFonts w:ascii="Arial" w:hAnsi="Arial" w:cs="Arial"/>
+        </w:rPr>
+        <w:t xml:space="preserve">. This approach can also allow for the quantification of information encoded when multiple types of information exist in the same discrete </w:t>
+      </w:r>
+      <w:r>
+        <w:rPr>
+          <w:rFonts w:ascii="Arial" w:hAnsi="Arial" w:cs="Arial"/>
+        </w:rPr>
+        <w:t>vocalization. [Need powerful closing sentence].</w:t>
+      </w:r>
     </w:p>
     <w:p>
       <w:pPr>
@@ -2164,11 +2201,19 @@
           <w:rFonts w:ascii="Arial" w:hAnsi="Arial" w:cs="Arial"/>
         </w:rPr>
       </w:pPr>
-      <w:r>
-        <w:rPr>
-          <w:rFonts w:ascii="Arial" w:hAnsi="Arial" w:cs="Arial"/>
-        </w:rPr>
-        <w:t>paRsynth functions</w:t>
+      <w:proofErr w:type="spellStart"/>
+      <w:r>
+        <w:rPr>
+          <w:rFonts w:ascii="Arial" w:hAnsi="Arial" w:cs="Arial"/>
+        </w:rPr>
+        <w:t>paRsynth</w:t>
+      </w:r>
+      <w:proofErr w:type="spellEnd"/>
+      <w:r>
+        <w:rPr>
+          <w:rFonts w:ascii="Arial" w:hAnsi="Arial" w:cs="Arial"/>
+        </w:rPr>
+        <w:t xml:space="preserve"> functions</w:t>
       </w:r>
     </w:p>
     <w:p>
@@ -2194,13 +2239,41 @@
         <w:rPr>
           <w:rFonts w:ascii="Arial" w:hAnsi="Arial" w:cs="Arial"/>
         </w:rPr>
-        <w:t>nformation “trits”</w:t>
-      </w:r>
-      <w:r>
-        <w:rPr>
-          <w:rFonts w:ascii="Arial" w:hAnsi="Arial" w:cs="Arial"/>
-        </w:rPr>
-        <w:t xml:space="preserve"> and base-3 Parsons </w:t>
+        <w:t>nformation “</w:t>
+      </w:r>
+      <w:proofErr w:type="spellStart"/>
+      <w:r>
+        <w:rPr>
+          <w:rFonts w:ascii="Arial" w:hAnsi="Arial" w:cs="Arial"/>
+        </w:rPr>
+        <w:t>trits</w:t>
+      </w:r>
+      <w:proofErr w:type="spellEnd"/>
+      <w:r>
+        <w:rPr>
+          <w:rFonts w:ascii="Arial" w:hAnsi="Arial" w:cs="Arial"/>
+        </w:rPr>
+        <w:t>”</w:t>
+      </w:r>
+      <w:r>
+        <w:rPr>
+          <w:rFonts w:ascii="Arial" w:hAnsi="Arial" w:cs="Arial"/>
+        </w:rPr>
+        <w:t xml:space="preserve"> and base-3 </w:t>
+      </w:r>
+      <w:proofErr w:type="gramStart"/>
+      <w:r>
+        <w:rPr>
+          <w:rFonts w:ascii="Arial" w:hAnsi="Arial" w:cs="Arial"/>
+        </w:rPr>
+        <w:t>Parsons</w:t>
+      </w:r>
+      <w:proofErr w:type="gramEnd"/>
+      <w:r>
+        <w:rPr>
+          <w:rFonts w:ascii="Arial" w:hAnsi="Arial" w:cs="Arial"/>
+        </w:rPr>
+        <w:t xml:space="preserve"> </w:t>
       </w:r>
       <w:r>
         <w:rPr>
@@ -2336,7 +2409,21 @@
         <w:rPr>
           <w:rFonts w:ascii="Arial" w:hAnsi="Arial" w:cs="Arial"/>
         </w:rPr>
-        <w:t>Or add a subsampling approach to this paper? Keep thinking about this, because Bayesian modeling of group and individual level variation is really useful and use fewer numbers of groups and individuals in the social environment</w:t>
+        <w:t xml:space="preserve">Or add a subsampling approach to this paper? Keep thinking about this, because Bayesian modeling of group and individual level variation is </w:t>
+      </w:r>
+      <w:proofErr w:type="gramStart"/>
+      <w:r>
+        <w:rPr>
+          <w:rFonts w:ascii="Arial" w:hAnsi="Arial" w:cs="Arial"/>
+        </w:rPr>
+        <w:t>really useful</w:t>
+      </w:r>
+      <w:proofErr w:type="gramEnd"/>
+      <w:r>
+        <w:rPr>
+          <w:rFonts w:ascii="Arial" w:hAnsi="Arial" w:cs="Arial"/>
+        </w:rPr>
+        <w:t xml:space="preserve"> and use fewer numbers of groups and individuals in the social environment</w:t>
       </w:r>
     </w:p>
     <w:p>
@@ -2368,8 +2455,16 @@
         <w:rPr>
           <w:rFonts w:ascii="Arial" w:hAnsi="Arial" w:cs="Arial"/>
         </w:rPr>
-        <w:t>with paRsynth</w:t>
-      </w:r>
+        <w:t xml:space="preserve">with </w:t>
+      </w:r>
+      <w:proofErr w:type="spellStart"/>
+      <w:r>
+        <w:rPr>
+          <w:rFonts w:ascii="Arial" w:hAnsi="Arial" w:cs="Arial"/>
+        </w:rPr>
+        <w:t>paRsynth</w:t>
+      </w:r>
+      <w:proofErr w:type="spellEnd"/>
       <w:r>
         <w:rPr>
           <w:rFonts w:ascii="Arial" w:hAnsi="Arial" w:cs="Arial"/>
@@ -2584,6 +2679,7 @@
         <w:rPr>
           <w:rFonts w:ascii="Arial" w:hAnsi="Arial" w:cs="Arial"/>
         </w:rPr>
+        <w:lastRenderedPageBreak/>
         <w:t xml:space="preserve">Compute </w:t>
       </w:r>
       <w:r>
@@ -2628,7 +2724,6 @@
         <w:rPr>
           <w:rFonts w:ascii="Arial" w:hAnsi="Arial" w:cs="Arial"/>
         </w:rPr>
-        <w:lastRenderedPageBreak/>
         <w:t xml:space="preserve">NMI should be calculated </w:t>
       </w:r>
       <w:r>
@@ -2687,7 +2782,7 @@
           <w:rFonts w:ascii="Arial" w:hAnsi="Arial" w:cs="Arial"/>
         </w:rPr>
       </w:pPr>
-      <w:commentRangeStart w:id="20"/>
+      <w:commentRangeStart w:id="19"/>
       <w:r>
         <w:rPr>
           <w:rFonts w:ascii="Arial" w:hAnsi="Arial" w:cs="Arial"/>
@@ -2700,12 +2795,12 @@
         </w:rPr>
         <w:t xml:space="preserve"> based</w:t>
       </w:r>
-      <w:commentRangeEnd w:id="20"/>
+      <w:commentRangeEnd w:id="19"/>
       <w:r>
         <w:rPr>
           <w:rStyle w:val="CommentReference"/>
         </w:rPr>
-        <w:commentReference w:id="20"/>
+        <w:commentReference w:id="19"/>
       </w:r>
       <w:r>
         <w:rPr>
@@ -2817,11 +2912,35 @@
           <w:rFonts w:ascii="Arial" w:hAnsi="Arial" w:cs="Arial"/>
         </w:rPr>
       </w:pPr>
-      <w:r>
-        <w:rPr>
-          <w:rFonts w:ascii="Arial" w:hAnsi="Arial" w:cs="Arial"/>
-        </w:rPr>
-        <w:t>soundgen::soundgen()</w:t>
+      <w:proofErr w:type="spellStart"/>
+      <w:proofErr w:type="gramStart"/>
+      <w:r>
+        <w:rPr>
+          <w:rFonts w:ascii="Arial" w:hAnsi="Arial" w:cs="Arial"/>
+        </w:rPr>
+        <w:t>soundgen</w:t>
+      </w:r>
+      <w:proofErr w:type="spellEnd"/>
+      <w:r>
+        <w:rPr>
+          <w:rFonts w:ascii="Arial" w:hAnsi="Arial" w:cs="Arial"/>
+        </w:rPr>
+        <w:t>::</w:t>
+      </w:r>
+      <w:proofErr w:type="spellStart"/>
+      <w:proofErr w:type="gramEnd"/>
+      <w:r>
+        <w:rPr>
+          <w:rFonts w:ascii="Arial" w:hAnsi="Arial" w:cs="Arial"/>
+        </w:rPr>
+        <w:t>soundgen</w:t>
+      </w:r>
+      <w:proofErr w:type="spellEnd"/>
+      <w:r>
+        <w:rPr>
+          <w:rFonts w:ascii="Arial" w:hAnsi="Arial" w:cs="Arial"/>
+        </w:rPr>
+        <w:t>()</w:t>
       </w:r>
       <w:r>
         <w:rPr>
@@ -2847,7 +2966,21 @@
         <w:rPr>
           <w:rFonts w:ascii="Arial" w:hAnsi="Arial" w:cs="Arial"/>
         </w:rPr>
-        <w:t>Create spectrograms for 50 audio files, feed them to soundgen using code that Grace has already to pull out the estimated fundamental frequency contour, create spectrograms again with the frequency contour overlaid to check the accuracy of the tracing</w:t>
+        <w:t xml:space="preserve">Create spectrograms for 50 audio files, feed them to </w:t>
+      </w:r>
+      <w:proofErr w:type="spellStart"/>
+      <w:r>
+        <w:rPr>
+          <w:rFonts w:ascii="Arial" w:hAnsi="Arial" w:cs="Arial"/>
+        </w:rPr>
+        <w:t>soundgen</w:t>
+      </w:r>
+      <w:proofErr w:type="spellEnd"/>
+      <w:r>
+        <w:rPr>
+          <w:rFonts w:ascii="Arial" w:hAnsi="Arial" w:cs="Arial"/>
+        </w:rPr>
+        <w:t xml:space="preserve"> using code that Grace has already to pull out the estimated fundamental frequency contour, create spectrograms again with the frequency contour overlaid to check the accuracy of the tracing</w:t>
       </w:r>
     </w:p>
     <w:p>
@@ -2887,7 +3020,21 @@
         <w:rPr>
           <w:rFonts w:ascii="Arial" w:hAnsi="Arial" w:cs="Arial"/>
         </w:rPr>
-        <w:t>But when I create spectrograms in soundgen, the contours look great</w:t>
+        <w:t xml:space="preserve">But when I create spectrograms in </w:t>
+      </w:r>
+      <w:proofErr w:type="spellStart"/>
+      <w:r>
+        <w:rPr>
+          <w:rFonts w:ascii="Arial" w:hAnsi="Arial" w:cs="Arial"/>
+        </w:rPr>
+        <w:t>soundgen</w:t>
+      </w:r>
+      <w:proofErr w:type="spellEnd"/>
+      <w:r>
+        <w:rPr>
+          <w:rFonts w:ascii="Arial" w:hAnsi="Arial" w:cs="Arial"/>
+        </w:rPr>
+        <w:t>, the contours look great</w:t>
       </w:r>
     </w:p>
     <w:p>
@@ -2903,11 +3050,19 @@
           <w:rFonts w:ascii="Arial" w:hAnsi="Arial" w:cs="Arial"/>
         </w:rPr>
       </w:pPr>
-      <w:r>
-        <w:rPr>
-          <w:rFonts w:ascii="Arial" w:hAnsi="Arial" w:cs="Arial"/>
-        </w:rPr>
-        <w:t>Soundgen has a Shiny app in which you can upload audio files and do manual correction of the frequency contour online</w:t>
+      <w:proofErr w:type="spellStart"/>
+      <w:r>
+        <w:rPr>
+          <w:rFonts w:ascii="Arial" w:hAnsi="Arial" w:cs="Arial"/>
+        </w:rPr>
+        <w:t>Soundgen</w:t>
+      </w:r>
+      <w:proofErr w:type="spellEnd"/>
+      <w:r>
+        <w:rPr>
+          <w:rFonts w:ascii="Arial" w:hAnsi="Arial" w:cs="Arial"/>
+        </w:rPr>
+        <w:t xml:space="preserve"> has a Shiny app in which you can upload audio files and do manual correction of the frequency contour online</w:t>
       </w:r>
       <w:r>
         <w:rPr>
@@ -2995,7 +3150,21 @@
         <w:rPr>
           <w:rFonts w:ascii="Arial" w:hAnsi="Arial" w:cs="Arial"/>
         </w:rPr>
-        <w:t>used with the dtw package in R</w:t>
+        <w:t xml:space="preserve">used with the </w:t>
+      </w:r>
+      <w:proofErr w:type="spellStart"/>
+      <w:r>
+        <w:rPr>
+          <w:rFonts w:ascii="Arial" w:hAnsi="Arial" w:cs="Arial"/>
+        </w:rPr>
+        <w:t>dtw</w:t>
+      </w:r>
+      <w:proofErr w:type="spellEnd"/>
+      <w:r>
+        <w:rPr>
+          <w:rFonts w:ascii="Arial" w:hAnsi="Arial" w:cs="Arial"/>
+        </w:rPr>
+        <w:t xml:space="preserve"> package in R</w:t>
       </w:r>
     </w:p>
     <w:p>
@@ -3015,6 +3184,7 @@
         <w:rPr>
           <w:rFonts w:ascii="Arial" w:hAnsi="Arial" w:cs="Arial"/>
         </w:rPr>
+        <w:lastRenderedPageBreak/>
         <w:t>Returns a distance matrix that can be used in downstream analysis</w:t>
       </w:r>
     </w:p>
@@ -3035,7 +3205,6 @@
         <w:rPr>
           <w:rFonts w:ascii="Arial" w:hAnsi="Arial" w:cs="Arial"/>
         </w:rPr>
-        <w:lastRenderedPageBreak/>
         <w:t>Multi-dimensional scaling acoustic space, clustering and Normalized Mutual Information</w:t>
       </w:r>
       <w:r>
@@ -3044,7 +3213,7 @@
         </w:rPr>
         <w:t xml:space="preserve">, </w:t>
       </w:r>
-      <w:commentRangeStart w:id="21"/>
+      <w:commentRangeStart w:id="20"/>
       <w:r>
         <w:rPr>
           <w:rFonts w:ascii="Arial" w:hAnsi="Arial" w:cs="Arial"/>
@@ -3057,12 +3226,12 @@
         </w:rPr>
         <w:t>models</w:t>
       </w:r>
-      <w:commentRangeEnd w:id="21"/>
+      <w:commentRangeEnd w:id="20"/>
       <w:r>
         <w:rPr>
           <w:rStyle w:val="CommentReference"/>
         </w:rPr>
-        <w:commentReference w:id="21"/>
+        <w:commentReference w:id="20"/>
       </w:r>
     </w:p>
     <w:p>
@@ -3082,7 +3251,21 @@
         <w:rPr>
           <w:rFonts w:ascii="Arial" w:hAnsi="Arial" w:cs="Arial"/>
         </w:rPr>
-        <w:t>This part of the pipeline will be really similar to the SPCC pipeline above</w:t>
+        <w:t xml:space="preserve">This part of the pipeline will be really </w:t>
+      </w:r>
+      <w:proofErr w:type="gramStart"/>
+      <w:r>
+        <w:rPr>
+          <w:rFonts w:ascii="Arial" w:hAnsi="Arial" w:cs="Arial"/>
+        </w:rPr>
+        <w:t>similar to</w:t>
+      </w:r>
+      <w:proofErr w:type="gramEnd"/>
+      <w:r>
+        <w:rPr>
+          <w:rFonts w:ascii="Arial" w:hAnsi="Arial" w:cs="Arial"/>
+        </w:rPr>
+        <w:t xml:space="preserve"> the SPCC pipeline above</w:t>
       </w:r>
     </w:p>
     <w:p>
@@ -3096,19 +3279,19 @@
           <w:rFonts w:ascii="Arial" w:hAnsi="Arial" w:cs="Arial"/>
         </w:rPr>
       </w:pPr>
-      <w:commentRangeStart w:id="22"/>
+      <w:commentRangeStart w:id="21"/>
       <w:r>
         <w:rPr>
           <w:rFonts w:ascii="Arial" w:hAnsi="Arial" w:cs="Arial"/>
         </w:rPr>
         <w:t>Figures</w:t>
       </w:r>
-      <w:commentRangeEnd w:id="22"/>
+      <w:commentRangeEnd w:id="21"/>
       <w:r>
         <w:rPr>
           <w:rStyle w:val="CommentReference"/>
         </w:rPr>
-        <w:commentReference w:id="22"/>
+        <w:commentReference w:id="21"/>
       </w:r>
       <w:r>
         <w:rPr>
@@ -3241,6 +3424,1492 @@
     <w:p>
       <w:pPr>
         <w:pStyle w:val="Bibliography"/>
+        <w:rPr>
+          <w:rFonts w:ascii="Arial" w:hAnsi="Arial" w:cs="Arial"/>
+        </w:rPr>
+      </w:pPr>
+      <w:r>
+        <w:rPr>
+          <w:rFonts w:ascii="Arial" w:hAnsi="Arial" w:cs="Arial"/>
+        </w:rPr>
+        <w:fldChar w:fldCharType="begin"/>
+      </w:r>
+      <w:r>
+        <w:rPr>
+          <w:rFonts w:ascii="Arial" w:hAnsi="Arial" w:cs="Arial"/>
+        </w:rPr>
+        <w:instrText xml:space="preserve"> ADDIN ZOTERO_BIBL {"uncited":[],"omitted":[],"custom":[]} CSL_BIBLIOGRAPHY </w:instrText>
+      </w:r>
+      <w:r>
+        <w:rPr>
+          <w:rFonts w:ascii="Arial" w:hAnsi="Arial" w:cs="Arial"/>
+        </w:rPr>
+        <w:fldChar w:fldCharType="separate"/>
+      </w:r>
+      <w:r>
+        <w:rPr>
+          <w:rFonts w:ascii="Arial" w:hAnsi="Arial" w:cs="Arial"/>
+        </w:rPr>
+        <w:t xml:space="preserve">Araya-Salas, M., Smith-Vidaurre, G., </w:t>
+      </w:r>
+      <w:proofErr w:type="spellStart"/>
+      <w:r>
+        <w:rPr>
+          <w:rFonts w:ascii="Arial" w:hAnsi="Arial" w:cs="Arial"/>
+        </w:rPr>
+        <w:t>Mennill</w:t>
+      </w:r>
+      <w:proofErr w:type="spellEnd"/>
+      <w:r>
+        <w:rPr>
+          <w:rFonts w:ascii="Arial" w:hAnsi="Arial" w:cs="Arial"/>
+        </w:rPr>
+        <w:t xml:space="preserve">, D. J., González-Gómez, P. L., Cahill, J., &amp; Wright, T. F. (2019). Social group signatures in hummingbird displays provide evidence of co-occurrence of vocal and visual learning. </w:t>
+      </w:r>
+      <w:r>
+        <w:rPr>
+          <w:rFonts w:ascii="Arial" w:hAnsi="Arial" w:cs="Arial"/>
+          <w:i/>
+          <w:iCs/>
+        </w:rPr>
+        <w:t>Proceedings of the Royal Society B: Biological Sciences</w:t>
+      </w:r>
+      <w:r>
+        <w:rPr>
+          <w:rFonts w:ascii="Arial" w:hAnsi="Arial" w:cs="Arial"/>
+        </w:rPr>
+        <w:t xml:space="preserve">, </w:t>
+      </w:r>
+      <w:r>
+        <w:rPr>
+          <w:rFonts w:ascii="Arial" w:hAnsi="Arial" w:cs="Arial"/>
+          <w:i/>
+          <w:iCs/>
+        </w:rPr>
+        <w:t>286</w:t>
+      </w:r>
+      <w:r>
+        <w:rPr>
+          <w:rFonts w:ascii="Arial" w:hAnsi="Arial" w:cs="Arial"/>
+        </w:rPr>
+        <w:t>(1903), 20190666. https://doi.org/10.1098/rspb.2019.0666</w:t>
+      </w:r>
+    </w:p>
+    <w:p>
+      <w:pPr>
+        <w:pStyle w:val="Bibliography"/>
+        <w:rPr>
+          <w:rFonts w:ascii="Arial" w:hAnsi="Arial" w:cs="Arial"/>
+        </w:rPr>
+      </w:pPr>
+      <w:r>
+        <w:rPr>
+          <w:rFonts w:ascii="Arial" w:hAnsi="Arial" w:cs="Arial"/>
+        </w:rPr>
+        <w:t xml:space="preserve">Berg, K. S., Delgado, S., Cortopassi, K. A., </w:t>
+      </w:r>
+      <w:proofErr w:type="spellStart"/>
+      <w:r>
+        <w:rPr>
+          <w:rFonts w:ascii="Arial" w:hAnsi="Arial" w:cs="Arial"/>
+        </w:rPr>
+        <w:t>Beissinger</w:t>
+      </w:r>
+      <w:proofErr w:type="spellEnd"/>
+      <w:r>
+        <w:rPr>
+          <w:rFonts w:ascii="Arial" w:hAnsi="Arial" w:cs="Arial"/>
+        </w:rPr>
+        <w:t xml:space="preserve">, S. R., &amp; Bradbury, J. W. (2011). Vertical transmission of learned signatures in a wild parrot. </w:t>
+      </w:r>
+      <w:r>
+        <w:rPr>
+          <w:rFonts w:ascii="Arial" w:hAnsi="Arial" w:cs="Arial"/>
+          <w:i/>
+          <w:iCs/>
+        </w:rPr>
+        <w:t>Proceedings of the Royal Society B: Biological Sciences</w:t>
+      </w:r>
+      <w:r>
+        <w:rPr>
+          <w:rFonts w:ascii="Arial" w:hAnsi="Arial" w:cs="Arial"/>
+        </w:rPr>
+        <w:t xml:space="preserve">, </w:t>
+      </w:r>
+      <w:r>
+        <w:rPr>
+          <w:rFonts w:ascii="Arial" w:hAnsi="Arial" w:cs="Arial"/>
+          <w:i/>
+          <w:iCs/>
+        </w:rPr>
+        <w:t>279</w:t>
+      </w:r>
+      <w:r>
+        <w:rPr>
+          <w:rFonts w:ascii="Arial" w:hAnsi="Arial" w:cs="Arial"/>
+        </w:rPr>
+        <w:t>(1728), 585–591. https://doi.org/10.1098/rspb.2011.0932</w:t>
+      </w:r>
+    </w:p>
+    <w:p>
+      <w:pPr>
+        <w:pStyle w:val="Bibliography"/>
+        <w:rPr>
+          <w:rFonts w:ascii="Arial" w:hAnsi="Arial" w:cs="Arial"/>
+        </w:rPr>
+      </w:pPr>
+      <w:r>
+        <w:rPr>
+          <w:rFonts w:ascii="Arial" w:hAnsi="Arial" w:cs="Arial"/>
+        </w:rPr>
+        <w:t xml:space="preserve">Berg, K. S., Delgado, S., Okawa, R., </w:t>
+      </w:r>
+      <w:proofErr w:type="spellStart"/>
+      <w:r>
+        <w:rPr>
+          <w:rFonts w:ascii="Arial" w:hAnsi="Arial" w:cs="Arial"/>
+        </w:rPr>
+        <w:t>Beissinger</w:t>
+      </w:r>
+      <w:proofErr w:type="spellEnd"/>
+      <w:r>
+        <w:rPr>
+          <w:rFonts w:ascii="Arial" w:hAnsi="Arial" w:cs="Arial"/>
+        </w:rPr>
+        <w:t>, S. R., &amp; Bradbury, J. W. (2011). Contact calls are used for individual mate recognition in free-ranging green-</w:t>
+      </w:r>
+      <w:proofErr w:type="spellStart"/>
+      <w:r>
+        <w:rPr>
+          <w:rFonts w:ascii="Arial" w:hAnsi="Arial" w:cs="Arial"/>
+        </w:rPr>
+        <w:t>rumped</w:t>
+      </w:r>
+      <w:proofErr w:type="spellEnd"/>
+      <w:r>
+        <w:rPr>
+          <w:rFonts w:ascii="Arial" w:hAnsi="Arial" w:cs="Arial"/>
+        </w:rPr>
+        <w:t xml:space="preserve"> parrotlets, </w:t>
+      </w:r>
+      <w:proofErr w:type="spellStart"/>
+      <w:r>
+        <w:rPr>
+          <w:rFonts w:ascii="Arial" w:hAnsi="Arial" w:cs="Arial"/>
+          <w:i/>
+          <w:iCs/>
+        </w:rPr>
+        <w:t>Forpus</w:t>
+      </w:r>
+      <w:proofErr w:type="spellEnd"/>
+      <w:r>
+        <w:rPr>
+          <w:rFonts w:ascii="Arial" w:hAnsi="Arial" w:cs="Arial"/>
+          <w:i/>
+          <w:iCs/>
+        </w:rPr>
+        <w:t xml:space="preserve"> </w:t>
+      </w:r>
+      <w:proofErr w:type="spellStart"/>
+      <w:r>
+        <w:rPr>
+          <w:rFonts w:ascii="Arial" w:hAnsi="Arial" w:cs="Arial"/>
+          <w:i/>
+          <w:iCs/>
+        </w:rPr>
+        <w:t>passerinus</w:t>
+      </w:r>
+      <w:proofErr w:type="spellEnd"/>
+      <w:r>
+        <w:rPr>
+          <w:rFonts w:ascii="Arial" w:hAnsi="Arial" w:cs="Arial"/>
+        </w:rPr>
+        <w:t xml:space="preserve">. </w:t>
+      </w:r>
+      <w:r>
+        <w:rPr>
+          <w:rFonts w:ascii="Arial" w:hAnsi="Arial" w:cs="Arial"/>
+          <w:i/>
+          <w:iCs/>
+        </w:rPr>
+        <w:t xml:space="preserve">Animal </w:t>
+      </w:r>
+      <w:proofErr w:type="spellStart"/>
+      <w:r>
+        <w:rPr>
+          <w:rFonts w:ascii="Arial" w:hAnsi="Arial" w:cs="Arial"/>
+          <w:i/>
+          <w:iCs/>
+        </w:rPr>
+        <w:t>Behaviour</w:t>
+      </w:r>
+      <w:proofErr w:type="spellEnd"/>
+      <w:r>
+        <w:rPr>
+          <w:rFonts w:ascii="Arial" w:hAnsi="Arial" w:cs="Arial"/>
+        </w:rPr>
+        <w:t xml:space="preserve">, </w:t>
+      </w:r>
+      <w:r>
+        <w:rPr>
+          <w:rFonts w:ascii="Arial" w:hAnsi="Arial" w:cs="Arial"/>
+          <w:i/>
+          <w:iCs/>
+        </w:rPr>
+        <w:t>81</w:t>
+      </w:r>
+      <w:r>
+        <w:rPr>
+          <w:rFonts w:ascii="Arial" w:hAnsi="Arial" w:cs="Arial"/>
+        </w:rPr>
+        <w:t>(1), 241–248. https://doi.org/10.1016/j.anbehav.2010.10.012</w:t>
+      </w:r>
+    </w:p>
+    <w:p>
+      <w:pPr>
+        <w:pStyle w:val="Bibliography"/>
+        <w:rPr>
+          <w:rFonts w:ascii="Arial" w:hAnsi="Arial" w:cs="Arial"/>
+        </w:rPr>
+      </w:pPr>
+      <w:proofErr w:type="spellStart"/>
+      <w:r>
+        <w:rPr>
+          <w:rFonts w:ascii="Arial" w:hAnsi="Arial" w:cs="Arial"/>
+        </w:rPr>
+        <w:t>Carouso</w:t>
+      </w:r>
+      <w:proofErr w:type="spellEnd"/>
+      <w:r>
+        <w:rPr>
+          <w:rFonts w:ascii="Arial" w:hAnsi="Arial" w:cs="Arial"/>
+        </w:rPr>
+        <w:t xml:space="preserve">-Peck, S., Goldstein, M. H., &amp; Fitch, W. T. (2021). The many functions of vocal learning. </w:t>
+      </w:r>
+      <w:r>
+        <w:rPr>
+          <w:rFonts w:ascii="Arial" w:hAnsi="Arial" w:cs="Arial"/>
+          <w:i/>
+          <w:iCs/>
+        </w:rPr>
+        <w:t>Philosophical Transactions of the Royal Society B: Biological Sciences</w:t>
+      </w:r>
+      <w:r>
+        <w:rPr>
+          <w:rFonts w:ascii="Arial" w:hAnsi="Arial" w:cs="Arial"/>
+        </w:rPr>
+        <w:t xml:space="preserve">, </w:t>
+      </w:r>
+      <w:r>
+        <w:rPr>
+          <w:rFonts w:ascii="Arial" w:hAnsi="Arial" w:cs="Arial"/>
+          <w:i/>
+          <w:iCs/>
+        </w:rPr>
+        <w:t>376</w:t>
+      </w:r>
+      <w:r>
+        <w:rPr>
+          <w:rFonts w:ascii="Arial" w:hAnsi="Arial" w:cs="Arial"/>
+        </w:rPr>
+        <w:t>(1836), 20200235. https://doi.org/10.1098/rstb.2020.0235</w:t>
+      </w:r>
+    </w:p>
+    <w:p>
+      <w:pPr>
+        <w:pStyle w:val="Bibliography"/>
+        <w:rPr>
+          <w:rFonts w:ascii="Arial" w:hAnsi="Arial" w:cs="Arial"/>
+        </w:rPr>
+      </w:pPr>
+      <w:r>
+        <w:rPr>
+          <w:rFonts w:ascii="Arial" w:hAnsi="Arial" w:cs="Arial"/>
+        </w:rPr>
+        <w:t xml:space="preserve">Coppinger, B. A., Davis, J. E., &amp; Freeberg, T. M. (2019). Flock-mate familiarity affects note composition of chickadee calls. </w:t>
+      </w:r>
+      <w:r>
+        <w:rPr>
+          <w:rFonts w:ascii="Arial" w:hAnsi="Arial" w:cs="Arial"/>
+          <w:i/>
+          <w:iCs/>
+        </w:rPr>
+        <w:t xml:space="preserve">Acta </w:t>
+      </w:r>
+      <w:proofErr w:type="spellStart"/>
+      <w:r>
+        <w:rPr>
+          <w:rFonts w:ascii="Arial" w:hAnsi="Arial" w:cs="Arial"/>
+          <w:i/>
+          <w:iCs/>
+        </w:rPr>
+        <w:t>Ethologica</w:t>
+      </w:r>
+      <w:proofErr w:type="spellEnd"/>
+      <w:r>
+        <w:rPr>
+          <w:rFonts w:ascii="Arial" w:hAnsi="Arial" w:cs="Arial"/>
+        </w:rPr>
+        <w:t xml:space="preserve">, </w:t>
+      </w:r>
+      <w:r>
+        <w:rPr>
+          <w:rFonts w:ascii="Arial" w:hAnsi="Arial" w:cs="Arial"/>
+          <w:i/>
+          <w:iCs/>
+        </w:rPr>
+        <w:t>22</w:t>
+      </w:r>
+      <w:r>
+        <w:rPr>
+          <w:rFonts w:ascii="Arial" w:hAnsi="Arial" w:cs="Arial"/>
+        </w:rPr>
+        <w:t>(1), 73–77. https://doi.org/10.1007/s10211-019-00308-8</w:t>
+      </w:r>
+    </w:p>
+    <w:p>
+      <w:pPr>
+        <w:pStyle w:val="Bibliography"/>
+        <w:rPr>
+          <w:rFonts w:ascii="Arial" w:hAnsi="Arial" w:cs="Arial"/>
+        </w:rPr>
+      </w:pPr>
+      <w:proofErr w:type="spellStart"/>
+      <w:r>
+        <w:rPr>
+          <w:rFonts w:ascii="Arial" w:hAnsi="Arial" w:cs="Arial"/>
+        </w:rPr>
+        <w:t>Deecke</w:t>
+      </w:r>
+      <w:proofErr w:type="spellEnd"/>
+      <w:r>
+        <w:rPr>
+          <w:rFonts w:ascii="Arial" w:hAnsi="Arial" w:cs="Arial"/>
+        </w:rPr>
+        <w:t xml:space="preserve">, V. B., Ford, J. K. B., &amp; Spong, P. (2000). Dialect </w:t>
+      </w:r>
+      <w:proofErr w:type="gramStart"/>
+      <w:r>
+        <w:rPr>
+          <w:rFonts w:ascii="Arial" w:hAnsi="Arial" w:cs="Arial"/>
+        </w:rPr>
+        <w:t>change</w:t>
+      </w:r>
+      <w:proofErr w:type="gramEnd"/>
+      <w:r>
+        <w:rPr>
+          <w:rFonts w:ascii="Arial" w:hAnsi="Arial" w:cs="Arial"/>
+        </w:rPr>
+        <w:t xml:space="preserve"> in resident killer whales: Implications for vocal learning and cultural transmission. </w:t>
+      </w:r>
+      <w:r>
+        <w:rPr>
+          <w:rFonts w:ascii="Arial" w:hAnsi="Arial" w:cs="Arial"/>
+          <w:i/>
+          <w:iCs/>
+        </w:rPr>
+        <w:t xml:space="preserve">Animal </w:t>
+      </w:r>
+      <w:proofErr w:type="spellStart"/>
+      <w:r>
+        <w:rPr>
+          <w:rFonts w:ascii="Arial" w:hAnsi="Arial" w:cs="Arial"/>
+          <w:i/>
+          <w:iCs/>
+        </w:rPr>
+        <w:t>Behaviour</w:t>
+      </w:r>
+      <w:proofErr w:type="spellEnd"/>
+      <w:r>
+        <w:rPr>
+          <w:rFonts w:ascii="Arial" w:hAnsi="Arial" w:cs="Arial"/>
+        </w:rPr>
+        <w:t xml:space="preserve">, </w:t>
+      </w:r>
+      <w:r>
+        <w:rPr>
+          <w:rFonts w:ascii="Arial" w:hAnsi="Arial" w:cs="Arial"/>
+          <w:i/>
+          <w:iCs/>
+        </w:rPr>
+        <w:t>60</w:t>
+      </w:r>
+      <w:r>
+        <w:rPr>
+          <w:rFonts w:ascii="Arial" w:hAnsi="Arial" w:cs="Arial"/>
+        </w:rPr>
+        <w:t>(5), 629–638. https://doi.org/10.1006/anbe.2000.1454</w:t>
+      </w:r>
+    </w:p>
+    <w:p>
+      <w:pPr>
+        <w:pStyle w:val="Bibliography"/>
+        <w:rPr>
+          <w:rFonts w:ascii="Arial" w:hAnsi="Arial" w:cs="Arial"/>
+        </w:rPr>
+      </w:pPr>
+      <w:r>
+        <w:rPr>
+          <w:rFonts w:ascii="Arial" w:hAnsi="Arial" w:cs="Arial"/>
+        </w:rPr>
+        <w:t xml:space="preserve">Freeberg, T. M. (2006). Social Complexity Can Drive Vocal Complexity: Group Size Influences Vocal Information in Carolina Chickadees. </w:t>
+      </w:r>
+      <w:r>
+        <w:rPr>
+          <w:rFonts w:ascii="Arial" w:hAnsi="Arial" w:cs="Arial"/>
+          <w:i/>
+          <w:iCs/>
+        </w:rPr>
+        <w:t>Psychological Science</w:t>
+      </w:r>
+      <w:r>
+        <w:rPr>
+          <w:rFonts w:ascii="Arial" w:hAnsi="Arial" w:cs="Arial"/>
+        </w:rPr>
+        <w:t xml:space="preserve">, </w:t>
+      </w:r>
+      <w:r>
+        <w:rPr>
+          <w:rFonts w:ascii="Arial" w:hAnsi="Arial" w:cs="Arial"/>
+          <w:i/>
+          <w:iCs/>
+        </w:rPr>
+        <w:t>17</w:t>
+      </w:r>
+      <w:r>
+        <w:rPr>
+          <w:rFonts w:ascii="Arial" w:hAnsi="Arial" w:cs="Arial"/>
+        </w:rPr>
+        <w:t>(7), 557–561. https://doi.org/10.1111/j.1467-9280.2006.01743.x</w:t>
+      </w:r>
+    </w:p>
+    <w:p>
+      <w:pPr>
+        <w:pStyle w:val="Bibliography"/>
+        <w:rPr>
+          <w:rFonts w:ascii="Arial" w:hAnsi="Arial" w:cs="Arial"/>
+        </w:rPr>
+      </w:pPr>
+      <w:r>
+        <w:rPr>
+          <w:rFonts w:ascii="Arial" w:hAnsi="Arial" w:cs="Arial"/>
+        </w:rPr>
+        <w:t xml:space="preserve">Hile, A. G., Plummer, T. K., &amp; </w:t>
+      </w:r>
+      <w:proofErr w:type="spellStart"/>
+      <w:r>
+        <w:rPr>
+          <w:rFonts w:ascii="Arial" w:hAnsi="Arial" w:cs="Arial"/>
+        </w:rPr>
+        <w:t>Striedter</w:t>
+      </w:r>
+      <w:proofErr w:type="spellEnd"/>
+      <w:r>
+        <w:rPr>
+          <w:rFonts w:ascii="Arial" w:hAnsi="Arial" w:cs="Arial"/>
+        </w:rPr>
+        <w:t xml:space="preserve">, G. F. (2000). Male vocal imitation produces call convergence during pair bonding in budgerigars, </w:t>
+      </w:r>
+      <w:r>
+        <w:rPr>
+          <w:rFonts w:ascii="Arial" w:hAnsi="Arial" w:cs="Arial"/>
+          <w:i/>
+          <w:iCs/>
+        </w:rPr>
+        <w:t>Melopsittacus undulatus</w:t>
+      </w:r>
+      <w:r>
+        <w:rPr>
+          <w:rFonts w:ascii="Arial" w:hAnsi="Arial" w:cs="Arial"/>
+        </w:rPr>
+        <w:t xml:space="preserve">. </w:t>
+      </w:r>
+      <w:r>
+        <w:rPr>
+          <w:rFonts w:ascii="Arial" w:hAnsi="Arial" w:cs="Arial"/>
+          <w:i/>
+          <w:iCs/>
+        </w:rPr>
+        <w:t xml:space="preserve">Animal </w:t>
+      </w:r>
+      <w:proofErr w:type="spellStart"/>
+      <w:r>
+        <w:rPr>
+          <w:rFonts w:ascii="Arial" w:hAnsi="Arial" w:cs="Arial"/>
+          <w:i/>
+          <w:iCs/>
+        </w:rPr>
+        <w:t>Behaviour</w:t>
+      </w:r>
+      <w:proofErr w:type="spellEnd"/>
+      <w:r>
+        <w:rPr>
+          <w:rFonts w:ascii="Arial" w:hAnsi="Arial" w:cs="Arial"/>
+        </w:rPr>
+        <w:t xml:space="preserve">, </w:t>
+      </w:r>
+      <w:r>
+        <w:rPr>
+          <w:rFonts w:ascii="Arial" w:hAnsi="Arial" w:cs="Arial"/>
+          <w:i/>
+          <w:iCs/>
+        </w:rPr>
+        <w:t>59</w:t>
+      </w:r>
+      <w:r>
+        <w:rPr>
+          <w:rFonts w:ascii="Arial" w:hAnsi="Arial" w:cs="Arial"/>
+        </w:rPr>
+        <w:t>(6), 1209–1218. https://doi.org/10.1006/anbe.1999.1438</w:t>
+      </w:r>
+    </w:p>
+    <w:p>
+      <w:pPr>
+        <w:pStyle w:val="Bibliography"/>
+        <w:rPr>
+          <w:rFonts w:ascii="Arial" w:hAnsi="Arial" w:cs="Arial"/>
+        </w:rPr>
+      </w:pPr>
+      <w:r>
+        <w:rPr>
+          <w:rFonts w:ascii="Arial" w:hAnsi="Arial" w:cs="Arial"/>
+        </w:rPr>
+        <w:t xml:space="preserve">Janik, V. M., &amp; </w:t>
+      </w:r>
+      <w:proofErr w:type="spellStart"/>
+      <w:r>
+        <w:rPr>
+          <w:rFonts w:ascii="Arial" w:hAnsi="Arial" w:cs="Arial"/>
+        </w:rPr>
+        <w:t>Sayigh</w:t>
+      </w:r>
+      <w:proofErr w:type="spellEnd"/>
+      <w:r>
+        <w:rPr>
+          <w:rFonts w:ascii="Arial" w:hAnsi="Arial" w:cs="Arial"/>
+        </w:rPr>
+        <w:t xml:space="preserve">, L. S. (2013). Communication in bottlenose dolphins: 50 years of signature whistle research. </w:t>
+      </w:r>
+      <w:r>
+        <w:rPr>
+          <w:rFonts w:ascii="Arial" w:hAnsi="Arial" w:cs="Arial"/>
+          <w:i/>
+          <w:iCs/>
+        </w:rPr>
+        <w:t>Journal of Comparative Physiology A</w:t>
+      </w:r>
+      <w:r>
+        <w:rPr>
+          <w:rFonts w:ascii="Arial" w:hAnsi="Arial" w:cs="Arial"/>
+        </w:rPr>
+        <w:t xml:space="preserve">, </w:t>
+      </w:r>
+      <w:r>
+        <w:rPr>
+          <w:rFonts w:ascii="Arial" w:hAnsi="Arial" w:cs="Arial"/>
+          <w:i/>
+          <w:iCs/>
+        </w:rPr>
+        <w:t>199</w:t>
+      </w:r>
+      <w:r>
+        <w:rPr>
+          <w:rFonts w:ascii="Arial" w:hAnsi="Arial" w:cs="Arial"/>
+        </w:rPr>
+        <w:t>(6), 479–489. https://doi.org/10.1007/s00359-013-0817-7</w:t>
+      </w:r>
+    </w:p>
+    <w:p>
+      <w:pPr>
+        <w:pStyle w:val="Bibliography"/>
+        <w:rPr>
+          <w:rFonts w:ascii="Arial" w:hAnsi="Arial" w:cs="Arial"/>
+        </w:rPr>
+      </w:pPr>
+      <w:r>
+        <w:rPr>
+          <w:rFonts w:ascii="Arial" w:hAnsi="Arial" w:cs="Arial"/>
+        </w:rPr>
+        <w:t xml:space="preserve">Janik, V. M., </w:t>
+      </w:r>
+      <w:proofErr w:type="spellStart"/>
+      <w:r>
+        <w:rPr>
+          <w:rFonts w:ascii="Arial" w:hAnsi="Arial" w:cs="Arial"/>
+        </w:rPr>
+        <w:t>Sayigh</w:t>
+      </w:r>
+      <w:proofErr w:type="spellEnd"/>
+      <w:r>
+        <w:rPr>
+          <w:rFonts w:ascii="Arial" w:hAnsi="Arial" w:cs="Arial"/>
+        </w:rPr>
+        <w:t xml:space="preserve">, L. S., &amp; Wells, R. S. (2006). </w:t>
+      </w:r>
+      <w:proofErr w:type="gramStart"/>
+      <w:r>
+        <w:rPr>
+          <w:rFonts w:ascii="Arial" w:hAnsi="Arial" w:cs="Arial"/>
+        </w:rPr>
+        <w:t>Signature</w:t>
+      </w:r>
+      <w:proofErr w:type="gramEnd"/>
+      <w:r>
+        <w:rPr>
+          <w:rFonts w:ascii="Arial" w:hAnsi="Arial" w:cs="Arial"/>
+        </w:rPr>
+        <w:t xml:space="preserve"> whistle shape conveys identity information to bottlenose dolphins. </w:t>
+      </w:r>
+      <w:r>
+        <w:rPr>
+          <w:rFonts w:ascii="Arial" w:hAnsi="Arial" w:cs="Arial"/>
+          <w:i/>
+          <w:iCs/>
+        </w:rPr>
+        <w:t>PNAS</w:t>
+      </w:r>
+      <w:r>
+        <w:rPr>
+          <w:rFonts w:ascii="Arial" w:hAnsi="Arial" w:cs="Arial"/>
+        </w:rPr>
+        <w:t xml:space="preserve">, </w:t>
+      </w:r>
+      <w:r>
+        <w:rPr>
+          <w:rFonts w:ascii="Arial" w:hAnsi="Arial" w:cs="Arial"/>
+          <w:i/>
+          <w:iCs/>
+        </w:rPr>
+        <w:t>103</w:t>
+      </w:r>
+      <w:r>
+        <w:rPr>
+          <w:rFonts w:ascii="Arial" w:hAnsi="Arial" w:cs="Arial"/>
+        </w:rPr>
+        <w:t>(21), 8293–8297.</w:t>
+      </w:r>
+    </w:p>
+    <w:p>
+      <w:pPr>
+        <w:pStyle w:val="Bibliography"/>
+        <w:rPr>
+          <w:rFonts w:ascii="Arial" w:hAnsi="Arial" w:cs="Arial"/>
+        </w:rPr>
+      </w:pPr>
+      <w:r>
+        <w:rPr>
+          <w:rFonts w:ascii="Arial" w:hAnsi="Arial" w:cs="Arial"/>
+        </w:rPr>
+        <w:t xml:space="preserve">Janik, V. M., &amp; Slater, P. J. B. (2000). The different roles of social learning in vocal communication. </w:t>
+      </w:r>
+      <w:r>
+        <w:rPr>
+          <w:rFonts w:ascii="Arial" w:hAnsi="Arial" w:cs="Arial"/>
+          <w:i/>
+          <w:iCs/>
+        </w:rPr>
+        <w:t xml:space="preserve">Animal </w:t>
+      </w:r>
+      <w:proofErr w:type="spellStart"/>
+      <w:r>
+        <w:rPr>
+          <w:rFonts w:ascii="Arial" w:hAnsi="Arial" w:cs="Arial"/>
+          <w:i/>
+          <w:iCs/>
+        </w:rPr>
+        <w:t>Behaviour</w:t>
+      </w:r>
+      <w:proofErr w:type="spellEnd"/>
+      <w:r>
+        <w:rPr>
+          <w:rFonts w:ascii="Arial" w:hAnsi="Arial" w:cs="Arial"/>
+        </w:rPr>
+        <w:t xml:space="preserve">, </w:t>
+      </w:r>
+      <w:r>
+        <w:rPr>
+          <w:rFonts w:ascii="Arial" w:hAnsi="Arial" w:cs="Arial"/>
+          <w:i/>
+          <w:iCs/>
+        </w:rPr>
+        <w:t>60</w:t>
+      </w:r>
+      <w:r>
+        <w:rPr>
+          <w:rFonts w:ascii="Arial" w:hAnsi="Arial" w:cs="Arial"/>
+        </w:rPr>
+        <w:t>(1), 1–11. https://doi.org/10.1006/anbe.2000.1410</w:t>
+      </w:r>
+    </w:p>
+    <w:p>
+      <w:pPr>
+        <w:pStyle w:val="Bibliography"/>
+        <w:rPr>
+          <w:rFonts w:ascii="Arial" w:hAnsi="Arial" w:cs="Arial"/>
+        </w:rPr>
+      </w:pPr>
+      <w:r>
+        <w:rPr>
+          <w:rFonts w:ascii="Arial" w:hAnsi="Arial" w:cs="Arial"/>
+        </w:rPr>
+        <w:t xml:space="preserve">Keen, S. C., Odom, K. J., Webster, M. S., Kohn, G. M., Wright, T. F., &amp; Araya-Salas, M. (2021). A machine learning approach for classifying and quantifying acoustic diversity. </w:t>
+      </w:r>
+      <w:r>
+        <w:rPr>
+          <w:rFonts w:ascii="Arial" w:hAnsi="Arial" w:cs="Arial"/>
+          <w:i/>
+          <w:iCs/>
+        </w:rPr>
+        <w:t>Methods in Ecology and Evolution</w:t>
+      </w:r>
+      <w:r>
+        <w:rPr>
+          <w:rFonts w:ascii="Arial" w:hAnsi="Arial" w:cs="Arial"/>
+        </w:rPr>
+        <w:t xml:space="preserve">, </w:t>
+      </w:r>
+      <w:r>
+        <w:rPr>
+          <w:rFonts w:ascii="Arial" w:hAnsi="Arial" w:cs="Arial"/>
+          <w:i/>
+          <w:iCs/>
+        </w:rPr>
+        <w:t>12</w:t>
+      </w:r>
+      <w:r>
+        <w:rPr>
+          <w:rFonts w:ascii="Arial" w:hAnsi="Arial" w:cs="Arial"/>
+        </w:rPr>
+        <w:t>(7), 1213–1225. https://doi.org/10.1111/2041-210X.13599</w:t>
+      </w:r>
+    </w:p>
+    <w:p>
+      <w:pPr>
+        <w:pStyle w:val="Bibliography"/>
+        <w:rPr>
+          <w:rFonts w:ascii="Arial" w:hAnsi="Arial" w:cs="Arial"/>
+        </w:rPr>
+      </w:pPr>
+      <w:proofErr w:type="spellStart"/>
+      <w:r>
+        <w:rPr>
+          <w:rFonts w:ascii="Arial" w:hAnsi="Arial" w:cs="Arial"/>
+        </w:rPr>
+        <w:t>Kershenbaum</w:t>
+      </w:r>
+      <w:proofErr w:type="spellEnd"/>
+      <w:r>
+        <w:rPr>
+          <w:rFonts w:ascii="Arial" w:hAnsi="Arial" w:cs="Arial"/>
+        </w:rPr>
+        <w:t xml:space="preserve">, A. (2014). Entropy rate as a measure of animal vocal complexity. </w:t>
+      </w:r>
+      <w:r>
+        <w:rPr>
+          <w:rFonts w:ascii="Arial" w:hAnsi="Arial" w:cs="Arial"/>
+          <w:i/>
+          <w:iCs/>
+        </w:rPr>
+        <w:t>Bioacoustics</w:t>
+      </w:r>
+      <w:r>
+        <w:rPr>
+          <w:rFonts w:ascii="Arial" w:hAnsi="Arial" w:cs="Arial"/>
+        </w:rPr>
+        <w:t xml:space="preserve">, </w:t>
+      </w:r>
+      <w:r>
+        <w:rPr>
+          <w:rFonts w:ascii="Arial" w:hAnsi="Arial" w:cs="Arial"/>
+          <w:i/>
+          <w:iCs/>
+        </w:rPr>
+        <w:t>23</w:t>
+      </w:r>
+      <w:r>
+        <w:rPr>
+          <w:rFonts w:ascii="Arial" w:hAnsi="Arial" w:cs="Arial"/>
+        </w:rPr>
+        <w:t>(3), 195–208. https://doi.org/10.1080/09524622.2013.850040</w:t>
+      </w:r>
+    </w:p>
+    <w:p>
+      <w:pPr>
+        <w:pStyle w:val="Bibliography"/>
+        <w:rPr>
+          <w:rFonts w:ascii="Arial" w:hAnsi="Arial" w:cs="Arial"/>
+        </w:rPr>
+      </w:pPr>
+      <w:proofErr w:type="spellStart"/>
+      <w:r>
+        <w:rPr>
+          <w:rFonts w:ascii="Arial" w:hAnsi="Arial" w:cs="Arial"/>
+        </w:rPr>
+        <w:t>Kershenbaum</w:t>
+      </w:r>
+      <w:proofErr w:type="spellEnd"/>
+      <w:r>
+        <w:rPr>
+          <w:rFonts w:ascii="Arial" w:hAnsi="Arial" w:cs="Arial"/>
+        </w:rPr>
+        <w:t xml:space="preserve">, A., &amp; Garland, E. C. (2015). Quantifying similarity in animal vocal sequences: Which metric performs best? </w:t>
+      </w:r>
+      <w:r>
+        <w:rPr>
+          <w:rFonts w:ascii="Arial" w:hAnsi="Arial" w:cs="Arial"/>
+          <w:i/>
+          <w:iCs/>
+        </w:rPr>
+        <w:t>Methods in Ecology and Evolution</w:t>
+      </w:r>
+      <w:r>
+        <w:rPr>
+          <w:rFonts w:ascii="Arial" w:hAnsi="Arial" w:cs="Arial"/>
+        </w:rPr>
+        <w:t xml:space="preserve">, </w:t>
+      </w:r>
+      <w:r>
+        <w:rPr>
+          <w:rFonts w:ascii="Arial" w:hAnsi="Arial" w:cs="Arial"/>
+          <w:i/>
+          <w:iCs/>
+        </w:rPr>
+        <w:t>6</w:t>
+      </w:r>
+      <w:r>
+        <w:rPr>
+          <w:rFonts w:ascii="Arial" w:hAnsi="Arial" w:cs="Arial"/>
+        </w:rPr>
+        <w:t>(12), 1452–1461. https://doi.org/10.1111/2041-210X.12433</w:t>
+      </w:r>
+    </w:p>
+    <w:p>
+      <w:pPr>
+        <w:pStyle w:val="Bibliography"/>
+        <w:rPr>
+          <w:rFonts w:ascii="Arial" w:hAnsi="Arial" w:cs="Arial"/>
+        </w:rPr>
+      </w:pPr>
+      <w:proofErr w:type="spellStart"/>
+      <w:r>
+        <w:rPr>
+          <w:rFonts w:ascii="Arial" w:hAnsi="Arial" w:cs="Arial"/>
+        </w:rPr>
+        <w:lastRenderedPageBreak/>
+        <w:t>Kershenbaum</w:t>
+      </w:r>
+      <w:proofErr w:type="spellEnd"/>
+      <w:r>
+        <w:rPr>
+          <w:rFonts w:ascii="Arial" w:hAnsi="Arial" w:cs="Arial"/>
+        </w:rPr>
+        <w:t xml:space="preserve">, A., Ilany, A., Blaustein, L., &amp; Geffen, E. (2012). Syntactic structure and geographical dialects in the songs of male rock hyraxes. </w:t>
+      </w:r>
+      <w:r>
+        <w:rPr>
+          <w:rFonts w:ascii="Arial" w:hAnsi="Arial" w:cs="Arial"/>
+          <w:i/>
+          <w:iCs/>
+        </w:rPr>
+        <w:t>Proceedings of the Royal Society B: Biological Sciences</w:t>
+      </w:r>
+      <w:r>
+        <w:rPr>
+          <w:rFonts w:ascii="Arial" w:hAnsi="Arial" w:cs="Arial"/>
+        </w:rPr>
+        <w:t xml:space="preserve">, </w:t>
+      </w:r>
+      <w:r>
+        <w:rPr>
+          <w:rFonts w:ascii="Arial" w:hAnsi="Arial" w:cs="Arial"/>
+          <w:i/>
+          <w:iCs/>
+        </w:rPr>
+        <w:t>279</w:t>
+      </w:r>
+      <w:r>
+        <w:rPr>
+          <w:rFonts w:ascii="Arial" w:hAnsi="Arial" w:cs="Arial"/>
+        </w:rPr>
+        <w:t>(1740), 2974. https://doi.org/10.1098/rspb.2012.0322</w:t>
+      </w:r>
+    </w:p>
+    <w:p>
+      <w:pPr>
+        <w:pStyle w:val="Bibliography"/>
+        <w:rPr>
+          <w:rFonts w:ascii="Arial" w:hAnsi="Arial" w:cs="Arial"/>
+        </w:rPr>
+      </w:pPr>
+      <w:r>
+        <w:rPr>
+          <w:rFonts w:ascii="Arial" w:hAnsi="Arial" w:cs="Arial"/>
+        </w:rPr>
+        <w:t xml:space="preserve">MacDougall-Shackleton, E. A., &amp; MacDougall-Shackleton, S. A. (2001). Cultural and Genetic Evolution in Mountain White-Crowned Sparrows: Song Dialects Are Associated with Population Structure. </w:t>
+      </w:r>
+      <w:r>
+        <w:rPr>
+          <w:rFonts w:ascii="Arial" w:hAnsi="Arial" w:cs="Arial"/>
+          <w:i/>
+          <w:iCs/>
+        </w:rPr>
+        <w:t>Evolution</w:t>
+      </w:r>
+      <w:r>
+        <w:rPr>
+          <w:rFonts w:ascii="Arial" w:hAnsi="Arial" w:cs="Arial"/>
+        </w:rPr>
+        <w:t xml:space="preserve">, </w:t>
+      </w:r>
+      <w:r>
+        <w:rPr>
+          <w:rFonts w:ascii="Arial" w:hAnsi="Arial" w:cs="Arial"/>
+          <w:i/>
+          <w:iCs/>
+        </w:rPr>
+        <w:t>55</w:t>
+      </w:r>
+      <w:r>
+        <w:rPr>
+          <w:rFonts w:ascii="Arial" w:hAnsi="Arial" w:cs="Arial"/>
+        </w:rPr>
+        <w:t>(12), 2568–2575. https://doi.org/10.1111/j.0014-3820.2001.tb00769.x</w:t>
+      </w:r>
+    </w:p>
+    <w:p>
+      <w:pPr>
+        <w:pStyle w:val="Bibliography"/>
+        <w:rPr>
+          <w:rFonts w:ascii="Arial" w:hAnsi="Arial" w:cs="Arial"/>
+        </w:rPr>
+      </w:pPr>
+      <w:r>
+        <w:rPr>
+          <w:rFonts w:ascii="Arial" w:hAnsi="Arial" w:cs="Arial"/>
+        </w:rPr>
+        <w:t xml:space="preserve">McDonald, M. A., Mesnick, S. L., &amp; Hildebrand, J. A. (2006). Biogeographic characterization of blue whale song worldwide: Using song to identify populations. </w:t>
+      </w:r>
+      <w:r>
+        <w:rPr>
+          <w:rFonts w:ascii="Arial" w:hAnsi="Arial" w:cs="Arial"/>
+          <w:i/>
+          <w:iCs/>
+        </w:rPr>
+        <w:t>Journal of Cetacean Research and Management</w:t>
+      </w:r>
+      <w:r>
+        <w:rPr>
+          <w:rFonts w:ascii="Arial" w:hAnsi="Arial" w:cs="Arial"/>
+        </w:rPr>
+        <w:t xml:space="preserve">, </w:t>
+      </w:r>
+      <w:r>
+        <w:rPr>
+          <w:rFonts w:ascii="Arial" w:hAnsi="Arial" w:cs="Arial"/>
+          <w:i/>
+          <w:iCs/>
+        </w:rPr>
+        <w:t>8</w:t>
+      </w:r>
+      <w:r>
+        <w:rPr>
+          <w:rFonts w:ascii="Arial" w:hAnsi="Arial" w:cs="Arial"/>
+        </w:rPr>
+        <w:t>(1), 55–65.</w:t>
+      </w:r>
+    </w:p>
+    <w:p>
+      <w:pPr>
+        <w:pStyle w:val="Bibliography"/>
+        <w:rPr>
+          <w:rFonts w:ascii="Arial" w:hAnsi="Arial" w:cs="Arial"/>
+        </w:rPr>
+      </w:pPr>
+      <w:r>
+        <w:rPr>
+          <w:rFonts w:ascii="Arial" w:hAnsi="Arial" w:cs="Arial"/>
+        </w:rPr>
+        <w:t xml:space="preserve">Nowicki, S., &amp; Searcy, W. A. (2014). The evolution of vocal learning. </w:t>
+      </w:r>
+      <w:r>
+        <w:rPr>
+          <w:rFonts w:ascii="Arial" w:hAnsi="Arial" w:cs="Arial"/>
+          <w:i/>
+          <w:iCs/>
+        </w:rPr>
+        <w:t>Current Opinion in Neurobiology</w:t>
+      </w:r>
+      <w:r>
+        <w:rPr>
+          <w:rFonts w:ascii="Arial" w:hAnsi="Arial" w:cs="Arial"/>
+        </w:rPr>
+        <w:t xml:space="preserve">, </w:t>
+      </w:r>
+      <w:r>
+        <w:rPr>
+          <w:rFonts w:ascii="Arial" w:hAnsi="Arial" w:cs="Arial"/>
+          <w:i/>
+          <w:iCs/>
+        </w:rPr>
+        <w:t>28</w:t>
+      </w:r>
+      <w:r>
+        <w:rPr>
+          <w:rFonts w:ascii="Arial" w:hAnsi="Arial" w:cs="Arial"/>
+        </w:rPr>
+        <w:t>, 48–53. https://doi.org/10.1016/j.conb.2014.06.007</w:t>
+      </w:r>
+    </w:p>
+    <w:p>
+      <w:pPr>
+        <w:pStyle w:val="Bibliography"/>
+        <w:rPr>
+          <w:rFonts w:ascii="Arial" w:hAnsi="Arial" w:cs="Arial"/>
+        </w:rPr>
+      </w:pPr>
+      <w:proofErr w:type="spellStart"/>
+      <w:r>
+        <w:rPr>
+          <w:rFonts w:ascii="Arial" w:hAnsi="Arial" w:cs="Arial"/>
+        </w:rPr>
+        <w:t>Sainburg</w:t>
+      </w:r>
+      <w:proofErr w:type="spellEnd"/>
+      <w:r>
+        <w:rPr>
+          <w:rFonts w:ascii="Arial" w:hAnsi="Arial" w:cs="Arial"/>
+        </w:rPr>
+        <w:t xml:space="preserve">, T., &amp; Gentner, T. Q. (2021). Toward a Computational Neuroethology of Vocal Communication: From Bioacoustics to Neurophysiology, Emerging Tools and Future Directions. </w:t>
+      </w:r>
+      <w:r>
+        <w:rPr>
+          <w:rFonts w:ascii="Arial" w:hAnsi="Arial" w:cs="Arial"/>
+          <w:i/>
+          <w:iCs/>
+        </w:rPr>
+        <w:t>Frontiers in Behavioral Neuroscience</w:t>
+      </w:r>
+      <w:r>
+        <w:rPr>
+          <w:rFonts w:ascii="Arial" w:hAnsi="Arial" w:cs="Arial"/>
+        </w:rPr>
+        <w:t xml:space="preserve">, </w:t>
+      </w:r>
+      <w:r>
+        <w:rPr>
+          <w:rFonts w:ascii="Arial" w:hAnsi="Arial" w:cs="Arial"/>
+          <w:i/>
+          <w:iCs/>
+        </w:rPr>
+        <w:t>15</w:t>
+      </w:r>
+      <w:r>
+        <w:rPr>
+          <w:rFonts w:ascii="Arial" w:hAnsi="Arial" w:cs="Arial"/>
+        </w:rPr>
+        <w:t>. https://doi.org/10.3389/fnbeh.2021.811737</w:t>
+      </w:r>
+    </w:p>
+    <w:p>
+      <w:pPr>
+        <w:pStyle w:val="Bibliography"/>
+        <w:rPr>
+          <w:rFonts w:ascii="Arial" w:hAnsi="Arial" w:cs="Arial"/>
+        </w:rPr>
+      </w:pPr>
+      <w:r>
+        <w:rPr>
+          <w:rFonts w:ascii="Arial" w:hAnsi="Arial" w:cs="Arial"/>
+        </w:rPr>
+        <w:t xml:space="preserve">Sawant, S., Arvind, C., Joshi, V., &amp; Robin, V. V. (2022). Spectrogram cross-correlation can be used to measure the complexity of bird vocalizations. </w:t>
+      </w:r>
+      <w:r>
+        <w:rPr>
+          <w:rFonts w:ascii="Arial" w:hAnsi="Arial" w:cs="Arial"/>
+          <w:i/>
+          <w:iCs/>
+        </w:rPr>
+        <w:t>Methods in Ecology and Evolution</w:t>
+      </w:r>
+      <w:r>
+        <w:rPr>
+          <w:rFonts w:ascii="Arial" w:hAnsi="Arial" w:cs="Arial"/>
+        </w:rPr>
+        <w:t xml:space="preserve">, </w:t>
+      </w:r>
+      <w:r>
+        <w:rPr>
+          <w:rFonts w:ascii="Arial" w:hAnsi="Arial" w:cs="Arial"/>
+          <w:i/>
+          <w:iCs/>
+        </w:rPr>
+        <w:t>13</w:t>
+      </w:r>
+      <w:r>
+        <w:rPr>
+          <w:rFonts w:ascii="Arial" w:hAnsi="Arial" w:cs="Arial"/>
+        </w:rPr>
+        <w:t>(2), 459–472. https://doi.org/10.1111/2041-210X.13765</w:t>
+      </w:r>
+    </w:p>
+    <w:p>
+      <w:pPr>
+        <w:pStyle w:val="Bibliography"/>
+        <w:rPr>
+          <w:rFonts w:ascii="Arial" w:hAnsi="Arial" w:cs="Arial"/>
+        </w:rPr>
+      </w:pPr>
+      <w:r>
+        <w:rPr>
+          <w:rFonts w:ascii="Arial" w:hAnsi="Arial" w:cs="Arial"/>
+        </w:rPr>
+        <w:t>Selman, Z. A., &amp; Freeberg, T. M. (2024). Complexity in Chick-a-Dee Calls of Mountain Chickadees (</w:t>
+      </w:r>
+      <w:proofErr w:type="spellStart"/>
+      <w:r>
+        <w:rPr>
+          <w:rFonts w:ascii="Arial" w:hAnsi="Arial" w:cs="Arial"/>
+        </w:rPr>
+        <w:t>Poecile</w:t>
+      </w:r>
+      <w:proofErr w:type="spellEnd"/>
+      <w:r>
+        <w:rPr>
+          <w:rFonts w:ascii="Arial" w:hAnsi="Arial" w:cs="Arial"/>
+        </w:rPr>
+        <w:t xml:space="preserve"> </w:t>
+      </w:r>
+      <w:proofErr w:type="spellStart"/>
+      <w:r>
+        <w:rPr>
+          <w:rFonts w:ascii="Arial" w:hAnsi="Arial" w:cs="Arial"/>
+        </w:rPr>
+        <w:t>gambeli</w:t>
+      </w:r>
+      <w:proofErr w:type="spellEnd"/>
+      <w:r>
+        <w:rPr>
+          <w:rFonts w:ascii="Arial" w:hAnsi="Arial" w:cs="Arial"/>
+        </w:rPr>
+        <w:t xml:space="preserve">): Call Variation Associated </w:t>
+      </w:r>
+      <w:proofErr w:type="gramStart"/>
+      <w:r>
+        <w:rPr>
+          <w:rFonts w:ascii="Arial" w:hAnsi="Arial" w:cs="Arial"/>
+        </w:rPr>
+        <w:t>With</w:t>
+      </w:r>
+      <w:proofErr w:type="gramEnd"/>
+      <w:r>
+        <w:rPr>
+          <w:rFonts w:ascii="Arial" w:hAnsi="Arial" w:cs="Arial"/>
+        </w:rPr>
+        <w:t xml:space="preserve"> Flock Size and Flight. </w:t>
+      </w:r>
+      <w:r>
+        <w:rPr>
+          <w:rFonts w:ascii="Arial" w:hAnsi="Arial" w:cs="Arial"/>
+          <w:i/>
+          <w:iCs/>
+        </w:rPr>
+        <w:t>Ethology</w:t>
+      </w:r>
+      <w:r>
+        <w:rPr>
+          <w:rFonts w:ascii="Arial" w:hAnsi="Arial" w:cs="Arial"/>
+        </w:rPr>
+        <w:t xml:space="preserve">, </w:t>
+      </w:r>
+      <w:r>
+        <w:rPr>
+          <w:rFonts w:ascii="Arial" w:hAnsi="Arial" w:cs="Arial"/>
+          <w:i/>
+          <w:iCs/>
+        </w:rPr>
+        <w:t>n/a</w:t>
+      </w:r>
+      <w:r>
+        <w:rPr>
+          <w:rFonts w:ascii="Arial" w:hAnsi="Arial" w:cs="Arial"/>
+        </w:rPr>
+        <w:t>(n/a), e13523. https://doi.org/10.1111/eth.13523</w:t>
+      </w:r>
+    </w:p>
+    <w:p>
+      <w:pPr>
+        <w:pStyle w:val="Bibliography"/>
+        <w:rPr>
+          <w:rFonts w:ascii="Arial" w:hAnsi="Arial" w:cs="Arial"/>
+        </w:rPr>
+      </w:pPr>
+      <w:r>
+        <w:rPr>
+          <w:rFonts w:ascii="Arial" w:hAnsi="Arial" w:cs="Arial"/>
+        </w:rPr>
+        <w:t xml:space="preserve">Sewall, K. B., Young, A. M., &amp; Wright, T. F. (2016). Social calls provide novel insights into the evolution of vocal learning. </w:t>
+      </w:r>
+      <w:r>
+        <w:rPr>
+          <w:rFonts w:ascii="Arial" w:hAnsi="Arial" w:cs="Arial"/>
+          <w:i/>
+          <w:iCs/>
+        </w:rPr>
+        <w:t xml:space="preserve">Animal </w:t>
+      </w:r>
+      <w:proofErr w:type="spellStart"/>
+      <w:r>
+        <w:rPr>
+          <w:rFonts w:ascii="Arial" w:hAnsi="Arial" w:cs="Arial"/>
+          <w:i/>
+          <w:iCs/>
+        </w:rPr>
+        <w:t>Behaviour</w:t>
+      </w:r>
+      <w:proofErr w:type="spellEnd"/>
+      <w:r>
+        <w:rPr>
+          <w:rFonts w:ascii="Arial" w:hAnsi="Arial" w:cs="Arial"/>
+        </w:rPr>
+        <w:t xml:space="preserve">, </w:t>
+      </w:r>
+      <w:r>
+        <w:rPr>
+          <w:rFonts w:ascii="Arial" w:hAnsi="Arial" w:cs="Arial"/>
+          <w:i/>
+          <w:iCs/>
+        </w:rPr>
+        <w:t>120</w:t>
+      </w:r>
+      <w:r>
+        <w:rPr>
+          <w:rFonts w:ascii="Arial" w:hAnsi="Arial" w:cs="Arial"/>
+        </w:rPr>
+        <w:t>, 163–172. https://doi.org/10.1016/j.anbehav.2016.07.031</w:t>
+      </w:r>
+    </w:p>
+    <w:p>
+      <w:pPr>
+        <w:pStyle w:val="Bibliography"/>
+        <w:rPr>
+          <w:rFonts w:ascii="Arial" w:hAnsi="Arial" w:cs="Arial"/>
+        </w:rPr>
+      </w:pPr>
+      <w:r>
+        <w:rPr>
+          <w:rFonts w:ascii="Arial" w:hAnsi="Arial" w:cs="Arial"/>
+        </w:rPr>
+        <w:t xml:space="preserve">Smith-Vidaurre, G., Araya-Salas, M., &amp; Wright, T. F. (2020). Individual signatures outweigh social group identity in contact calls of a communally nesting parrot. </w:t>
+      </w:r>
+      <w:r>
+        <w:rPr>
+          <w:rFonts w:ascii="Arial" w:hAnsi="Arial" w:cs="Arial"/>
+          <w:i/>
+          <w:iCs/>
+        </w:rPr>
+        <w:t>Behavioral Ecology</w:t>
+      </w:r>
+      <w:r>
+        <w:rPr>
+          <w:rFonts w:ascii="Arial" w:hAnsi="Arial" w:cs="Arial"/>
+        </w:rPr>
+        <w:t xml:space="preserve">, </w:t>
+      </w:r>
+      <w:r>
+        <w:rPr>
+          <w:rFonts w:ascii="Arial" w:hAnsi="Arial" w:cs="Arial"/>
+          <w:i/>
+          <w:iCs/>
+        </w:rPr>
+        <w:t>31</w:t>
+      </w:r>
+      <w:r>
+        <w:rPr>
+          <w:rFonts w:ascii="Arial" w:hAnsi="Arial" w:cs="Arial"/>
+        </w:rPr>
+        <w:t>(2), 448–458. https://doi.org/10.1093/beheco/arz202</w:t>
+      </w:r>
+    </w:p>
+    <w:p>
+      <w:pPr>
+        <w:pStyle w:val="Bibliography"/>
+        <w:rPr>
+          <w:rFonts w:ascii="Arial" w:hAnsi="Arial" w:cs="Arial"/>
+        </w:rPr>
+      </w:pPr>
+      <w:r>
+        <w:rPr>
+          <w:rFonts w:ascii="Arial" w:hAnsi="Arial" w:cs="Arial"/>
+        </w:rPr>
+        <w:t xml:space="preserve">Smith-Vidaurre, G., Pérez-Marrufo, V., Hobson, E. A., Salinas-Melgoza, A., &amp; Wright, T. F. (2023). Individual identity information persists in learned calls of introduced parrot populations. </w:t>
+      </w:r>
+      <w:r>
+        <w:rPr>
+          <w:rFonts w:ascii="Arial" w:hAnsi="Arial" w:cs="Arial"/>
+          <w:i/>
+          <w:iCs/>
+        </w:rPr>
+        <w:t>PLOS Computational Biology</w:t>
+      </w:r>
+      <w:r>
+        <w:rPr>
+          <w:rFonts w:ascii="Arial" w:hAnsi="Arial" w:cs="Arial"/>
+        </w:rPr>
+        <w:t xml:space="preserve">, </w:t>
+      </w:r>
+      <w:r>
+        <w:rPr>
+          <w:rFonts w:ascii="Arial" w:hAnsi="Arial" w:cs="Arial"/>
+          <w:i/>
+          <w:iCs/>
+        </w:rPr>
+        <w:t>19</w:t>
+      </w:r>
+      <w:r>
+        <w:rPr>
+          <w:rFonts w:ascii="Arial" w:hAnsi="Arial" w:cs="Arial"/>
+        </w:rPr>
+        <w:t>(7), e1011231. https://doi.org/10.1371/journal.pcbi.1011231</w:t>
+      </w:r>
+    </w:p>
+    <w:p>
+      <w:pPr>
+        <w:pStyle w:val="Bibliography"/>
+        <w:rPr>
+          <w:rFonts w:ascii="Arial" w:hAnsi="Arial" w:cs="Arial"/>
+        </w:rPr>
+      </w:pPr>
+      <w:r>
+        <w:rPr>
+          <w:rFonts w:ascii="Arial" w:hAnsi="Arial" w:cs="Arial"/>
+        </w:rPr>
+        <w:t xml:space="preserve">Smith-Vidaurre, G., Perez-Marrufo, V., &amp; Wright, T. F. (2021). Individual vocal signatures show reduced complexity following invasion. </w:t>
+      </w:r>
+      <w:r>
+        <w:rPr>
+          <w:rFonts w:ascii="Arial" w:hAnsi="Arial" w:cs="Arial"/>
+          <w:i/>
+          <w:iCs/>
+        </w:rPr>
+        <w:t xml:space="preserve">Animal </w:t>
+      </w:r>
+      <w:proofErr w:type="spellStart"/>
+      <w:r>
+        <w:rPr>
+          <w:rFonts w:ascii="Arial" w:hAnsi="Arial" w:cs="Arial"/>
+          <w:i/>
+          <w:iCs/>
+        </w:rPr>
+        <w:t>Behaviour</w:t>
+      </w:r>
+      <w:proofErr w:type="spellEnd"/>
+      <w:r>
+        <w:rPr>
+          <w:rFonts w:ascii="Arial" w:hAnsi="Arial" w:cs="Arial"/>
+        </w:rPr>
+        <w:t xml:space="preserve">, </w:t>
+      </w:r>
+      <w:r>
+        <w:rPr>
+          <w:rFonts w:ascii="Arial" w:hAnsi="Arial" w:cs="Arial"/>
+          <w:i/>
+          <w:iCs/>
+        </w:rPr>
+        <w:t>179</w:t>
+      </w:r>
+      <w:r>
+        <w:rPr>
+          <w:rFonts w:ascii="Arial" w:hAnsi="Arial" w:cs="Arial"/>
+        </w:rPr>
+        <w:t>, 15–39. https://doi.org/10.1016/j.anbehav.2021.06.020</w:t>
+      </w:r>
+    </w:p>
+    <w:p>
+      <w:pPr>
+        <w:pStyle w:val="Bibliography"/>
+        <w:rPr>
+          <w:rFonts w:ascii="Arial" w:hAnsi="Arial" w:cs="Arial"/>
+        </w:rPr>
+      </w:pPr>
+      <w:r>
+        <w:rPr>
+          <w:rFonts w:ascii="Arial" w:hAnsi="Arial" w:cs="Arial"/>
+        </w:rPr>
+        <w:t xml:space="preserve">Wright, T. F. (1997a). Regional dialects in the contact call of a parrot. </w:t>
+      </w:r>
+      <w:r>
+        <w:rPr>
+          <w:rFonts w:ascii="Arial" w:hAnsi="Arial" w:cs="Arial"/>
+          <w:i/>
+          <w:iCs/>
+        </w:rPr>
+        <w:t>Proceedings of the Royal Society of London. Series B: Biological Sciences</w:t>
+      </w:r>
+      <w:r>
+        <w:rPr>
+          <w:rFonts w:ascii="Arial" w:hAnsi="Arial" w:cs="Arial"/>
+        </w:rPr>
+        <w:t xml:space="preserve">, </w:t>
+      </w:r>
+      <w:r>
+        <w:rPr>
+          <w:rFonts w:ascii="Arial" w:hAnsi="Arial" w:cs="Arial"/>
+          <w:i/>
+          <w:iCs/>
+        </w:rPr>
+        <w:t>263</w:t>
+      </w:r>
+      <w:r>
+        <w:rPr>
+          <w:rFonts w:ascii="Arial" w:hAnsi="Arial" w:cs="Arial"/>
+        </w:rPr>
+        <w:t>(1372), 867–872. https://doi.org/10.1098/rspb.1996.0128</w:t>
+      </w:r>
+    </w:p>
+    <w:p>
+      <w:pPr>
+        <w:pStyle w:val="Bibliography"/>
+        <w:rPr>
+          <w:rFonts w:ascii="Arial" w:hAnsi="Arial" w:cs="Arial"/>
+        </w:rPr>
+      </w:pPr>
+      <w:r>
+        <w:rPr>
+          <w:rFonts w:ascii="Arial" w:hAnsi="Arial" w:cs="Arial"/>
+        </w:rPr>
+        <w:t xml:space="preserve">Wright, T. F. (1997b). Regional dialects in the contact call of a parrot. </w:t>
+      </w:r>
+      <w:r>
+        <w:rPr>
+          <w:rFonts w:ascii="Arial" w:hAnsi="Arial" w:cs="Arial"/>
+          <w:i/>
+          <w:iCs/>
+        </w:rPr>
+        <w:t>Proceedings of the Royal Society of London. Series B: Biological Sciences</w:t>
+      </w:r>
+      <w:r>
+        <w:rPr>
+          <w:rFonts w:ascii="Arial" w:hAnsi="Arial" w:cs="Arial"/>
+        </w:rPr>
+        <w:t xml:space="preserve">, </w:t>
+      </w:r>
+      <w:r>
+        <w:rPr>
+          <w:rFonts w:ascii="Arial" w:hAnsi="Arial" w:cs="Arial"/>
+          <w:i/>
+          <w:iCs/>
+        </w:rPr>
+        <w:t>263</w:t>
+      </w:r>
+      <w:r>
+        <w:rPr>
+          <w:rFonts w:ascii="Arial" w:hAnsi="Arial" w:cs="Arial"/>
+        </w:rPr>
+        <w:t>(1372), 867–872. https://doi.org/10.1098/rspb.1996.0128</w:t>
+      </w:r>
+    </w:p>
+    <w:p>
+      <w:pPr>
         <w:spacing w:line="360" w:lineRule="auto"/>
         <w:ind w:left="720" w:hanging="720"/>
         <w:rPr>
@@ -3251,933 +4920,6 @@
         <w:rPr>
           <w:rFonts w:ascii="Arial" w:hAnsi="Arial" w:cs="Arial"/>
         </w:rPr>
-        <w:fldChar w:fldCharType="begin"/>
-      </w:r>
-      <w:r>
-        <w:rPr>
-          <w:rFonts w:ascii="Arial" w:hAnsi="Arial" w:cs="Arial"/>
-        </w:rPr>
-        <w:instrText xml:space="preserve"> ADDIN ZOTERO_BIBL {"uncited":[],"omitted":[],"custom":[]} CSL_BIBLIOGRAPHY </w:instrText>
-      </w:r>
-      <w:r>
-        <w:rPr>
-          <w:rFonts w:ascii="Arial" w:hAnsi="Arial" w:cs="Arial"/>
-        </w:rPr>
-        <w:fldChar w:fldCharType="separate"/>
-      </w:r>
-      <w:r>
-        <w:rPr>
-          <w:rFonts w:ascii="Arial" w:hAnsi="Arial" w:cs="Arial"/>
-        </w:rPr>
-        <w:t xml:space="preserve">Araya-Salas, M., Smith-Vidaurre, G., Mennill, D. J., González-Gómez, P. L., Cahill, J., &amp; Wright, T. F. (2019). Social group signatures in hummingbird displays provide evidence of co-occurrence of vocal and visual learning. </w:t>
-      </w:r>
-      <w:r>
-        <w:rPr>
-          <w:rFonts w:ascii="Arial" w:hAnsi="Arial" w:cs="Arial"/>
-          <w:i/>
-          <w:iCs/>
-        </w:rPr>
-        <w:t>Proceedings of the Royal Society B: Biological Sciences</w:t>
-      </w:r>
-      <w:r>
-        <w:rPr>
-          <w:rFonts w:ascii="Arial" w:hAnsi="Arial" w:cs="Arial"/>
-        </w:rPr>
-        <w:t xml:space="preserve">, </w:t>
-      </w:r>
-      <w:r>
-        <w:rPr>
-          <w:rFonts w:ascii="Arial" w:hAnsi="Arial" w:cs="Arial"/>
-          <w:i/>
-          <w:iCs/>
-        </w:rPr>
-        <w:t>286</w:t>
-      </w:r>
-      <w:r>
-        <w:rPr>
-          <w:rFonts w:ascii="Arial" w:hAnsi="Arial" w:cs="Arial"/>
-        </w:rPr>
-        <w:t>(1903), 20190666. https://doi.org/10.1098/rspb.2019.0666</w:t>
-      </w:r>
-    </w:p>
-    <w:p>
-      <w:pPr>
-        <w:pStyle w:val="Bibliography"/>
-        <w:spacing w:line="360" w:lineRule="auto"/>
-        <w:ind w:left="720" w:hanging="720"/>
-        <w:rPr>
-          <w:rFonts w:ascii="Arial" w:hAnsi="Arial" w:cs="Arial"/>
-        </w:rPr>
-      </w:pPr>
-      <w:r>
-        <w:rPr>
-          <w:rFonts w:ascii="Arial" w:hAnsi="Arial" w:cs="Arial"/>
-        </w:rPr>
-        <w:t xml:space="preserve">Berg, K. S., Delgado, S., Cortopassi, K. A., Beissinger, S. R., &amp; Bradbury, J. W. (2011). Vertical transmission of learned signatures in a wild parrot. </w:t>
-      </w:r>
-      <w:r>
-        <w:rPr>
-          <w:rFonts w:ascii="Arial" w:hAnsi="Arial" w:cs="Arial"/>
-          <w:i/>
-          <w:iCs/>
-        </w:rPr>
-        <w:t>Proceedings of the Royal Society B: Biological Sciences</w:t>
-      </w:r>
-      <w:r>
-        <w:rPr>
-          <w:rFonts w:ascii="Arial" w:hAnsi="Arial" w:cs="Arial"/>
-        </w:rPr>
-        <w:t xml:space="preserve">, </w:t>
-      </w:r>
-      <w:r>
-        <w:rPr>
-          <w:rFonts w:ascii="Arial" w:hAnsi="Arial" w:cs="Arial"/>
-          <w:i/>
-          <w:iCs/>
-        </w:rPr>
-        <w:t>279</w:t>
-      </w:r>
-      <w:r>
-        <w:rPr>
-          <w:rFonts w:ascii="Arial" w:hAnsi="Arial" w:cs="Arial"/>
-        </w:rPr>
-        <w:t>(1728), 585–591. https://doi.org/10.1098/rspb.2011.0932</w:t>
-      </w:r>
-    </w:p>
-    <w:p>
-      <w:pPr>
-        <w:pStyle w:val="Bibliography"/>
-        <w:spacing w:line="360" w:lineRule="auto"/>
-        <w:ind w:left="720" w:hanging="720"/>
-        <w:rPr>
-          <w:rFonts w:ascii="Arial" w:hAnsi="Arial" w:cs="Arial"/>
-        </w:rPr>
-      </w:pPr>
-      <w:r>
-        <w:rPr>
-          <w:rFonts w:ascii="Arial" w:hAnsi="Arial" w:cs="Arial"/>
-        </w:rPr>
-        <w:t xml:space="preserve">Berg, K. S., Delgado, S., Okawa, R., Beissinger, S. R., &amp; Bradbury, J. W. (2011). Contact calls are used for individual mate recognition in free-ranging green-rumped parrotlets, </w:t>
-      </w:r>
-      <w:r>
-        <w:rPr>
-          <w:rFonts w:ascii="Arial" w:hAnsi="Arial" w:cs="Arial"/>
-          <w:i/>
-          <w:iCs/>
-        </w:rPr>
-        <w:t>Forpus passerinus</w:t>
-      </w:r>
-      <w:r>
-        <w:rPr>
-          <w:rFonts w:ascii="Arial" w:hAnsi="Arial" w:cs="Arial"/>
-        </w:rPr>
-        <w:t xml:space="preserve">. </w:t>
-      </w:r>
-      <w:r>
-        <w:rPr>
-          <w:rFonts w:ascii="Arial" w:hAnsi="Arial" w:cs="Arial"/>
-          <w:i/>
-          <w:iCs/>
-        </w:rPr>
-        <w:t>Animal Behaviour</w:t>
-      </w:r>
-      <w:r>
-        <w:rPr>
-          <w:rFonts w:ascii="Arial" w:hAnsi="Arial" w:cs="Arial"/>
-        </w:rPr>
-        <w:t xml:space="preserve">, </w:t>
-      </w:r>
-      <w:r>
-        <w:rPr>
-          <w:rFonts w:ascii="Arial" w:hAnsi="Arial" w:cs="Arial"/>
-          <w:i/>
-          <w:iCs/>
-        </w:rPr>
-        <w:t>81</w:t>
-      </w:r>
-      <w:r>
-        <w:rPr>
-          <w:rFonts w:ascii="Arial" w:hAnsi="Arial" w:cs="Arial"/>
-        </w:rPr>
-        <w:t>(1), 241–248. https://doi.org/10.1016/j.anbehav.2010.10.012</w:t>
-      </w:r>
-    </w:p>
-    <w:p>
-      <w:pPr>
-        <w:pStyle w:val="Bibliography"/>
-        <w:spacing w:line="360" w:lineRule="auto"/>
-        <w:ind w:left="720" w:hanging="720"/>
-        <w:rPr>
-          <w:rFonts w:ascii="Arial" w:hAnsi="Arial" w:cs="Arial"/>
-        </w:rPr>
-      </w:pPr>
-      <w:r>
-        <w:rPr>
-          <w:rFonts w:ascii="Arial" w:hAnsi="Arial" w:cs="Arial"/>
-        </w:rPr>
-        <w:t xml:space="preserve">Carouso-Peck, S., Goldstein, M. H., &amp; Fitch, W. T. (2021). The many functions of vocal learning. </w:t>
-      </w:r>
-      <w:r>
-        <w:rPr>
-          <w:rFonts w:ascii="Arial" w:hAnsi="Arial" w:cs="Arial"/>
-          <w:i/>
-          <w:iCs/>
-        </w:rPr>
-        <w:t>Philosophical Transactions of the Royal Society B: Biological Sciences</w:t>
-      </w:r>
-      <w:r>
-        <w:rPr>
-          <w:rFonts w:ascii="Arial" w:hAnsi="Arial" w:cs="Arial"/>
-        </w:rPr>
-        <w:t xml:space="preserve">, </w:t>
-      </w:r>
-      <w:r>
-        <w:rPr>
-          <w:rFonts w:ascii="Arial" w:hAnsi="Arial" w:cs="Arial"/>
-          <w:i/>
-          <w:iCs/>
-        </w:rPr>
-        <w:t>376</w:t>
-      </w:r>
-      <w:r>
-        <w:rPr>
-          <w:rFonts w:ascii="Arial" w:hAnsi="Arial" w:cs="Arial"/>
-        </w:rPr>
-        <w:t>(1836), 20200235. https://doi.org/10.1098/rstb.2020.0235</w:t>
-      </w:r>
-    </w:p>
-    <w:p>
-      <w:pPr>
-        <w:pStyle w:val="Bibliography"/>
-        <w:spacing w:line="360" w:lineRule="auto"/>
-        <w:ind w:left="720" w:hanging="720"/>
-        <w:rPr>
-          <w:rFonts w:ascii="Arial" w:hAnsi="Arial" w:cs="Arial"/>
-        </w:rPr>
-      </w:pPr>
-      <w:r>
-        <w:rPr>
-          <w:rFonts w:ascii="Arial" w:hAnsi="Arial" w:cs="Arial"/>
-        </w:rPr>
-        <w:t xml:space="preserve">Coppinger, B. A., Davis, J. E., &amp; Freeberg, T. M. (2019). Flock-mate familiarity affects note composition of chickadee calls. </w:t>
-      </w:r>
-      <w:r>
-        <w:rPr>
-          <w:rFonts w:ascii="Arial" w:hAnsi="Arial" w:cs="Arial"/>
-          <w:i/>
-          <w:iCs/>
-        </w:rPr>
-        <w:t>Acta Ethologica</w:t>
-      </w:r>
-      <w:r>
-        <w:rPr>
-          <w:rFonts w:ascii="Arial" w:hAnsi="Arial" w:cs="Arial"/>
-        </w:rPr>
-        <w:t xml:space="preserve">, </w:t>
-      </w:r>
-      <w:r>
-        <w:rPr>
-          <w:rFonts w:ascii="Arial" w:hAnsi="Arial" w:cs="Arial"/>
-          <w:i/>
-          <w:iCs/>
-        </w:rPr>
-        <w:t>22</w:t>
-      </w:r>
-      <w:r>
-        <w:rPr>
-          <w:rFonts w:ascii="Arial" w:hAnsi="Arial" w:cs="Arial"/>
-        </w:rPr>
-        <w:t>(1), 73–77. https://doi.org/10.1007/s10211-019-00308-8</w:t>
-      </w:r>
-    </w:p>
-    <w:p>
-      <w:pPr>
-        <w:pStyle w:val="Bibliography"/>
-        <w:spacing w:line="360" w:lineRule="auto"/>
-        <w:ind w:left="720" w:hanging="720"/>
-        <w:rPr>
-          <w:rFonts w:ascii="Arial" w:hAnsi="Arial" w:cs="Arial"/>
-        </w:rPr>
-      </w:pPr>
-      <w:r>
-        <w:rPr>
-          <w:rFonts w:ascii="Arial" w:hAnsi="Arial" w:cs="Arial"/>
-        </w:rPr>
-        <w:t xml:space="preserve">Deecke, V. B., Ford, J. K. B., &amp; Spong, P. (2000). Dialect change in resident killer whales: Implications for vocal learning and cultural transmission. </w:t>
-      </w:r>
-      <w:r>
-        <w:rPr>
-          <w:rFonts w:ascii="Arial" w:hAnsi="Arial" w:cs="Arial"/>
-          <w:i/>
-          <w:iCs/>
-        </w:rPr>
-        <w:t>Animal Behaviour</w:t>
-      </w:r>
-      <w:r>
-        <w:rPr>
-          <w:rFonts w:ascii="Arial" w:hAnsi="Arial" w:cs="Arial"/>
-        </w:rPr>
-        <w:t xml:space="preserve">, </w:t>
-      </w:r>
-      <w:r>
-        <w:rPr>
-          <w:rFonts w:ascii="Arial" w:hAnsi="Arial" w:cs="Arial"/>
-          <w:i/>
-          <w:iCs/>
-        </w:rPr>
-        <w:t>60</w:t>
-      </w:r>
-      <w:r>
-        <w:rPr>
-          <w:rFonts w:ascii="Arial" w:hAnsi="Arial" w:cs="Arial"/>
-        </w:rPr>
-        <w:t>(5), 629–638. https://doi.org/10.1006/anbe.2000.1454</w:t>
-      </w:r>
-    </w:p>
-    <w:p>
-      <w:pPr>
-        <w:pStyle w:val="Bibliography"/>
-        <w:spacing w:line="360" w:lineRule="auto"/>
-        <w:ind w:left="720" w:hanging="720"/>
-        <w:rPr>
-          <w:rFonts w:ascii="Arial" w:hAnsi="Arial" w:cs="Arial"/>
-        </w:rPr>
-      </w:pPr>
-      <w:r>
-        <w:rPr>
-          <w:rFonts w:ascii="Arial" w:hAnsi="Arial" w:cs="Arial"/>
-        </w:rPr>
-        <w:t xml:space="preserve">Freeberg, T. M. (2006). Social Complexity Can Drive Vocal Complexity: Group Size Influences Vocal Information in Carolina Chickadees. </w:t>
-      </w:r>
-      <w:r>
-        <w:rPr>
-          <w:rFonts w:ascii="Arial" w:hAnsi="Arial" w:cs="Arial"/>
-          <w:i/>
-          <w:iCs/>
-        </w:rPr>
-        <w:t>Psychological Science</w:t>
-      </w:r>
-      <w:r>
-        <w:rPr>
-          <w:rFonts w:ascii="Arial" w:hAnsi="Arial" w:cs="Arial"/>
-        </w:rPr>
-        <w:t xml:space="preserve">, </w:t>
-      </w:r>
-      <w:r>
-        <w:rPr>
-          <w:rFonts w:ascii="Arial" w:hAnsi="Arial" w:cs="Arial"/>
-          <w:i/>
-          <w:iCs/>
-        </w:rPr>
-        <w:t>17</w:t>
-      </w:r>
-      <w:r>
-        <w:rPr>
-          <w:rFonts w:ascii="Arial" w:hAnsi="Arial" w:cs="Arial"/>
-        </w:rPr>
-        <w:t>(7), 557–561. https://doi.org/10.1111/j.1467-9280.2006.01743.x</w:t>
-      </w:r>
-    </w:p>
-    <w:p>
-      <w:pPr>
-        <w:pStyle w:val="Bibliography"/>
-        <w:spacing w:line="360" w:lineRule="auto"/>
-        <w:ind w:left="720" w:hanging="720"/>
-        <w:rPr>
-          <w:rFonts w:ascii="Arial" w:hAnsi="Arial" w:cs="Arial"/>
-        </w:rPr>
-      </w:pPr>
-      <w:r>
-        <w:rPr>
-          <w:rFonts w:ascii="Arial" w:hAnsi="Arial" w:cs="Arial"/>
-        </w:rPr>
-        <w:t xml:space="preserve">Hile, A. G., Plummer, T. K., &amp; Striedter, G. F. (2000). Male vocal imitation produces call convergence during pair bonding in budgerigars, </w:t>
-      </w:r>
-      <w:r>
-        <w:rPr>
-          <w:rFonts w:ascii="Arial" w:hAnsi="Arial" w:cs="Arial"/>
-          <w:i/>
-          <w:iCs/>
-        </w:rPr>
-        <w:t>Melopsittacus undulatus</w:t>
-      </w:r>
-      <w:r>
-        <w:rPr>
-          <w:rFonts w:ascii="Arial" w:hAnsi="Arial" w:cs="Arial"/>
-        </w:rPr>
-        <w:t xml:space="preserve">. </w:t>
-      </w:r>
-      <w:r>
-        <w:rPr>
-          <w:rFonts w:ascii="Arial" w:hAnsi="Arial" w:cs="Arial"/>
-          <w:i/>
-          <w:iCs/>
-        </w:rPr>
-        <w:t>Animal Behaviour</w:t>
-      </w:r>
-      <w:r>
-        <w:rPr>
-          <w:rFonts w:ascii="Arial" w:hAnsi="Arial" w:cs="Arial"/>
-        </w:rPr>
-        <w:t xml:space="preserve">, </w:t>
-      </w:r>
-      <w:r>
-        <w:rPr>
-          <w:rFonts w:ascii="Arial" w:hAnsi="Arial" w:cs="Arial"/>
-          <w:i/>
-          <w:iCs/>
-        </w:rPr>
-        <w:t>59</w:t>
-      </w:r>
-      <w:r>
-        <w:rPr>
-          <w:rFonts w:ascii="Arial" w:hAnsi="Arial" w:cs="Arial"/>
-        </w:rPr>
-        <w:t>(6), 1209–1218. https://doi.org/10.1006/anbe.1999.1438</w:t>
-      </w:r>
-    </w:p>
-    <w:p>
-      <w:pPr>
-        <w:pStyle w:val="Bibliography"/>
-        <w:spacing w:line="360" w:lineRule="auto"/>
-        <w:ind w:left="720" w:hanging="720"/>
-        <w:rPr>
-          <w:rFonts w:ascii="Arial" w:hAnsi="Arial" w:cs="Arial"/>
-        </w:rPr>
-      </w:pPr>
-      <w:r>
-        <w:rPr>
-          <w:rFonts w:ascii="Arial" w:hAnsi="Arial" w:cs="Arial"/>
-        </w:rPr>
-        <w:t xml:space="preserve">Kershenbaum, A. (2014). Entropy rate as a measure of animal vocal complexity. </w:t>
-      </w:r>
-      <w:r>
-        <w:rPr>
-          <w:rFonts w:ascii="Arial" w:hAnsi="Arial" w:cs="Arial"/>
-          <w:i/>
-          <w:iCs/>
-        </w:rPr>
-        <w:t>Bioacoustics</w:t>
-      </w:r>
-      <w:r>
-        <w:rPr>
-          <w:rFonts w:ascii="Arial" w:hAnsi="Arial" w:cs="Arial"/>
-        </w:rPr>
-        <w:t xml:space="preserve">, </w:t>
-      </w:r>
-      <w:r>
-        <w:rPr>
-          <w:rFonts w:ascii="Arial" w:hAnsi="Arial" w:cs="Arial"/>
-          <w:i/>
-          <w:iCs/>
-        </w:rPr>
-        <w:t>23</w:t>
-      </w:r>
-      <w:r>
-        <w:rPr>
-          <w:rFonts w:ascii="Arial" w:hAnsi="Arial" w:cs="Arial"/>
-        </w:rPr>
-        <w:t>(3), 195–208. https://doi.org/10.1080/09524622.2013.850040</w:t>
-      </w:r>
-    </w:p>
-    <w:p>
-      <w:pPr>
-        <w:pStyle w:val="Bibliography"/>
-        <w:spacing w:line="360" w:lineRule="auto"/>
-        <w:ind w:left="720" w:hanging="720"/>
-        <w:rPr>
-          <w:rFonts w:ascii="Arial" w:hAnsi="Arial" w:cs="Arial"/>
-        </w:rPr>
-      </w:pPr>
-      <w:r>
-        <w:rPr>
-          <w:rFonts w:ascii="Arial" w:hAnsi="Arial" w:cs="Arial"/>
-        </w:rPr>
-        <w:lastRenderedPageBreak/>
-        <w:t xml:space="preserve">Kershenbaum, A., &amp; Garland, E. C. (2015). Quantifying similarity in animal vocal sequences: Which metric performs best? </w:t>
-      </w:r>
-      <w:r>
-        <w:rPr>
-          <w:rFonts w:ascii="Arial" w:hAnsi="Arial" w:cs="Arial"/>
-          <w:i/>
-          <w:iCs/>
-        </w:rPr>
-        <w:t>Methods in Ecology and Evolution</w:t>
-      </w:r>
-      <w:r>
-        <w:rPr>
-          <w:rFonts w:ascii="Arial" w:hAnsi="Arial" w:cs="Arial"/>
-        </w:rPr>
-        <w:t xml:space="preserve">, </w:t>
-      </w:r>
-      <w:r>
-        <w:rPr>
-          <w:rFonts w:ascii="Arial" w:hAnsi="Arial" w:cs="Arial"/>
-          <w:i/>
-          <w:iCs/>
-        </w:rPr>
-        <w:t>6</w:t>
-      </w:r>
-      <w:r>
-        <w:rPr>
-          <w:rFonts w:ascii="Arial" w:hAnsi="Arial" w:cs="Arial"/>
-        </w:rPr>
-        <w:t>(12), 1452–1461. https://doi.org/10.1111/2041-210X.12433</w:t>
-      </w:r>
-    </w:p>
-    <w:p>
-      <w:pPr>
-        <w:pStyle w:val="Bibliography"/>
-        <w:spacing w:line="360" w:lineRule="auto"/>
-        <w:ind w:left="720" w:hanging="720"/>
-        <w:rPr>
-          <w:rFonts w:ascii="Arial" w:hAnsi="Arial" w:cs="Arial"/>
-        </w:rPr>
-      </w:pPr>
-      <w:r>
-        <w:rPr>
-          <w:rFonts w:ascii="Arial" w:hAnsi="Arial" w:cs="Arial"/>
-        </w:rPr>
-        <w:t xml:space="preserve">Kershenbaum, A., Ilany, A., Blaustein, L., &amp; Geffen, E. (2012). Syntactic structure and geographical dialects in the songs of male rock hyraxes. </w:t>
-      </w:r>
-      <w:r>
-        <w:rPr>
-          <w:rFonts w:ascii="Arial" w:hAnsi="Arial" w:cs="Arial"/>
-          <w:i/>
-          <w:iCs/>
-        </w:rPr>
-        <w:t>Proceedings of the Royal Society B: Biological Sciences</w:t>
-      </w:r>
-      <w:r>
-        <w:rPr>
-          <w:rFonts w:ascii="Arial" w:hAnsi="Arial" w:cs="Arial"/>
-        </w:rPr>
-        <w:t xml:space="preserve">, </w:t>
-      </w:r>
-      <w:r>
-        <w:rPr>
-          <w:rFonts w:ascii="Arial" w:hAnsi="Arial" w:cs="Arial"/>
-          <w:i/>
-          <w:iCs/>
-        </w:rPr>
-        <w:t>279</w:t>
-      </w:r>
-      <w:r>
-        <w:rPr>
-          <w:rFonts w:ascii="Arial" w:hAnsi="Arial" w:cs="Arial"/>
-        </w:rPr>
-        <w:t>(1740), 2974. https://doi.org/10.1098/rspb.2012.0322</w:t>
-      </w:r>
-    </w:p>
-    <w:p>
-      <w:pPr>
-        <w:pStyle w:val="Bibliography"/>
-        <w:spacing w:line="360" w:lineRule="auto"/>
-        <w:ind w:left="720" w:hanging="720"/>
-        <w:rPr>
-          <w:rFonts w:ascii="Arial" w:hAnsi="Arial" w:cs="Arial"/>
-        </w:rPr>
-      </w:pPr>
-      <w:r>
-        <w:rPr>
-          <w:rFonts w:ascii="Arial" w:hAnsi="Arial" w:cs="Arial"/>
-        </w:rPr>
-        <w:t xml:space="preserve">MacDougall-Shackleton, E. A., &amp; MacDougall-Shackleton, S. A. (2001). Cultural and Genetic Evolution in Mountain White-Crowned Sparrows: Song Dialects Are Associated with Population Structure. </w:t>
-      </w:r>
-      <w:r>
-        <w:rPr>
-          <w:rFonts w:ascii="Arial" w:hAnsi="Arial" w:cs="Arial"/>
-          <w:i/>
-          <w:iCs/>
-        </w:rPr>
-        <w:t>Evolution</w:t>
-      </w:r>
-      <w:r>
-        <w:rPr>
-          <w:rFonts w:ascii="Arial" w:hAnsi="Arial" w:cs="Arial"/>
-        </w:rPr>
-        <w:t xml:space="preserve">, </w:t>
-      </w:r>
-      <w:r>
-        <w:rPr>
-          <w:rFonts w:ascii="Arial" w:hAnsi="Arial" w:cs="Arial"/>
-          <w:i/>
-          <w:iCs/>
-        </w:rPr>
-        <w:t>55</w:t>
-      </w:r>
-      <w:r>
-        <w:rPr>
-          <w:rFonts w:ascii="Arial" w:hAnsi="Arial" w:cs="Arial"/>
-        </w:rPr>
-        <w:t>(12), 2568–2575. https://doi.org/10.1111/j.0014-3820.2001.tb00769.x</w:t>
-      </w:r>
-    </w:p>
-    <w:p>
-      <w:pPr>
-        <w:pStyle w:val="Bibliography"/>
-        <w:spacing w:line="360" w:lineRule="auto"/>
-        <w:ind w:left="720" w:hanging="720"/>
-        <w:rPr>
-          <w:rFonts w:ascii="Arial" w:hAnsi="Arial" w:cs="Arial"/>
-        </w:rPr>
-      </w:pPr>
-      <w:r>
-        <w:rPr>
-          <w:rFonts w:ascii="Arial" w:hAnsi="Arial" w:cs="Arial"/>
-        </w:rPr>
-        <w:t xml:space="preserve">McDonald, M. A., Mesnick, S. L., &amp; Hildebrand, J. A. (2006). Biogeographic characterization of blue whale song worldwide: Using song to identify populations. </w:t>
-      </w:r>
-      <w:r>
-        <w:rPr>
-          <w:rFonts w:ascii="Arial" w:hAnsi="Arial" w:cs="Arial"/>
-          <w:i/>
-          <w:iCs/>
-        </w:rPr>
-        <w:t>Journal of Cetacean Research and Management</w:t>
-      </w:r>
-      <w:r>
-        <w:rPr>
-          <w:rFonts w:ascii="Arial" w:hAnsi="Arial" w:cs="Arial"/>
-        </w:rPr>
-        <w:t xml:space="preserve">, </w:t>
-      </w:r>
-      <w:r>
-        <w:rPr>
-          <w:rFonts w:ascii="Arial" w:hAnsi="Arial" w:cs="Arial"/>
-          <w:i/>
-          <w:iCs/>
-        </w:rPr>
-        <w:t>8</w:t>
-      </w:r>
-      <w:r>
-        <w:rPr>
-          <w:rFonts w:ascii="Arial" w:hAnsi="Arial" w:cs="Arial"/>
-        </w:rPr>
-        <w:t>(1), 55–65.</w:t>
-      </w:r>
-    </w:p>
-    <w:p>
-      <w:pPr>
-        <w:pStyle w:val="Bibliography"/>
-        <w:spacing w:line="360" w:lineRule="auto"/>
-        <w:ind w:left="720" w:hanging="720"/>
-        <w:rPr>
-          <w:rFonts w:ascii="Arial" w:hAnsi="Arial" w:cs="Arial"/>
-        </w:rPr>
-      </w:pPr>
-      <w:r>
-        <w:rPr>
-          <w:rFonts w:ascii="Arial" w:hAnsi="Arial" w:cs="Arial"/>
-        </w:rPr>
-        <w:t xml:space="preserve">Nowicki, S., &amp; Searcy, W. A. (2014). The evolution of vocal learning. </w:t>
-      </w:r>
-      <w:r>
-        <w:rPr>
-          <w:rFonts w:ascii="Arial" w:hAnsi="Arial" w:cs="Arial"/>
-          <w:i/>
-          <w:iCs/>
-        </w:rPr>
-        <w:t>Current Opinion in Neurobiology</w:t>
-      </w:r>
-      <w:r>
-        <w:rPr>
-          <w:rFonts w:ascii="Arial" w:hAnsi="Arial" w:cs="Arial"/>
-        </w:rPr>
-        <w:t xml:space="preserve">, </w:t>
-      </w:r>
-      <w:r>
-        <w:rPr>
-          <w:rFonts w:ascii="Arial" w:hAnsi="Arial" w:cs="Arial"/>
-          <w:i/>
-          <w:iCs/>
-        </w:rPr>
-        <w:t>28</w:t>
-      </w:r>
-      <w:r>
-        <w:rPr>
-          <w:rFonts w:ascii="Arial" w:hAnsi="Arial" w:cs="Arial"/>
-        </w:rPr>
-        <w:t>, 48–53. https://doi.org/10.1016/j.conb.2014.06.007</w:t>
-      </w:r>
-    </w:p>
-    <w:p>
-      <w:pPr>
-        <w:pStyle w:val="Bibliography"/>
-        <w:spacing w:line="360" w:lineRule="auto"/>
-        <w:ind w:left="720" w:hanging="720"/>
-        <w:rPr>
-          <w:rFonts w:ascii="Arial" w:hAnsi="Arial" w:cs="Arial"/>
-        </w:rPr>
-      </w:pPr>
-      <w:r>
-        <w:rPr>
-          <w:rFonts w:ascii="Arial" w:hAnsi="Arial" w:cs="Arial"/>
-        </w:rPr>
-        <w:t xml:space="preserve">Selman, Z. A., &amp; Freeberg, T. M. (2024). Complexity in Chick-a-Dee Calls of Mountain Chickadees (Poecile gambeli): Call Variation Associated With Flock Size and Flight. </w:t>
-      </w:r>
-      <w:r>
-        <w:rPr>
-          <w:rFonts w:ascii="Arial" w:hAnsi="Arial" w:cs="Arial"/>
-          <w:i/>
-          <w:iCs/>
-        </w:rPr>
-        <w:t>Ethology</w:t>
-      </w:r>
-      <w:r>
-        <w:rPr>
-          <w:rFonts w:ascii="Arial" w:hAnsi="Arial" w:cs="Arial"/>
-        </w:rPr>
-        <w:t xml:space="preserve">, </w:t>
-      </w:r>
-      <w:r>
-        <w:rPr>
-          <w:rFonts w:ascii="Arial" w:hAnsi="Arial" w:cs="Arial"/>
-          <w:i/>
-          <w:iCs/>
-        </w:rPr>
-        <w:t>n/a</w:t>
-      </w:r>
-      <w:r>
-        <w:rPr>
-          <w:rFonts w:ascii="Arial" w:hAnsi="Arial" w:cs="Arial"/>
-        </w:rPr>
-        <w:t>(n/a), e13523. https://doi.org/10.1111/eth.13523</w:t>
-      </w:r>
-    </w:p>
-    <w:p>
-      <w:pPr>
-        <w:pStyle w:val="Bibliography"/>
-        <w:spacing w:line="360" w:lineRule="auto"/>
-        <w:ind w:left="720" w:hanging="720"/>
-        <w:rPr>
-          <w:rFonts w:ascii="Arial" w:hAnsi="Arial" w:cs="Arial"/>
-        </w:rPr>
-      </w:pPr>
-      <w:r>
-        <w:rPr>
-          <w:rFonts w:ascii="Arial" w:hAnsi="Arial" w:cs="Arial"/>
-        </w:rPr>
-        <w:t xml:space="preserve">Sewall, K. B., Young, A. M., &amp; Wright, T. F. (2016). Social calls provide novel insights into the evolution of vocal learning. </w:t>
-      </w:r>
-      <w:r>
-        <w:rPr>
-          <w:rFonts w:ascii="Arial" w:hAnsi="Arial" w:cs="Arial"/>
-          <w:i/>
-          <w:iCs/>
-        </w:rPr>
-        <w:t>Animal Behaviour</w:t>
-      </w:r>
-      <w:r>
-        <w:rPr>
-          <w:rFonts w:ascii="Arial" w:hAnsi="Arial" w:cs="Arial"/>
-        </w:rPr>
-        <w:t xml:space="preserve">, </w:t>
-      </w:r>
-      <w:r>
-        <w:rPr>
-          <w:rFonts w:ascii="Arial" w:hAnsi="Arial" w:cs="Arial"/>
-          <w:i/>
-          <w:iCs/>
-        </w:rPr>
-        <w:t>120</w:t>
-      </w:r>
-      <w:r>
-        <w:rPr>
-          <w:rFonts w:ascii="Arial" w:hAnsi="Arial" w:cs="Arial"/>
-        </w:rPr>
-        <w:t>, 163–172. https://doi.org/10.1016/j.anbehav.2016.07.031</w:t>
-      </w:r>
-    </w:p>
-    <w:p>
-      <w:pPr>
-        <w:pStyle w:val="Bibliography"/>
-        <w:spacing w:line="360" w:lineRule="auto"/>
-        <w:ind w:left="720" w:hanging="720"/>
-        <w:rPr>
-          <w:rFonts w:ascii="Arial" w:hAnsi="Arial" w:cs="Arial"/>
-        </w:rPr>
-      </w:pPr>
-      <w:r>
-        <w:rPr>
-          <w:rFonts w:ascii="Arial" w:hAnsi="Arial" w:cs="Arial"/>
-        </w:rPr>
-        <w:t xml:space="preserve">Smith-Vidaurre, G., Araya-Salas, M., &amp; Wright, T. F. (2020). Individual signatures outweigh social group identity in contact calls of a communally nesting parrot. </w:t>
-      </w:r>
-      <w:r>
-        <w:rPr>
-          <w:rFonts w:ascii="Arial" w:hAnsi="Arial" w:cs="Arial"/>
-          <w:i/>
-          <w:iCs/>
-        </w:rPr>
-        <w:t>Behavioral Ecology</w:t>
-      </w:r>
-      <w:r>
-        <w:rPr>
-          <w:rFonts w:ascii="Arial" w:hAnsi="Arial" w:cs="Arial"/>
-        </w:rPr>
-        <w:t xml:space="preserve">, </w:t>
-      </w:r>
-      <w:r>
-        <w:rPr>
-          <w:rFonts w:ascii="Arial" w:hAnsi="Arial" w:cs="Arial"/>
-          <w:i/>
-          <w:iCs/>
-        </w:rPr>
-        <w:t>31</w:t>
-      </w:r>
-      <w:r>
-        <w:rPr>
-          <w:rFonts w:ascii="Arial" w:hAnsi="Arial" w:cs="Arial"/>
-        </w:rPr>
-        <w:t>(2), 448–458. https://doi.org/10.1093/beheco/arz202</w:t>
-      </w:r>
-    </w:p>
-    <w:p>
-      <w:pPr>
-        <w:pStyle w:val="Bibliography"/>
-        <w:spacing w:line="360" w:lineRule="auto"/>
-        <w:ind w:left="720" w:hanging="720"/>
-        <w:rPr>
-          <w:rFonts w:ascii="Arial" w:hAnsi="Arial" w:cs="Arial"/>
-        </w:rPr>
-      </w:pPr>
-      <w:r>
-        <w:rPr>
-          <w:rFonts w:ascii="Arial" w:hAnsi="Arial" w:cs="Arial"/>
-        </w:rPr>
-        <w:t xml:space="preserve">Smith-Vidaurre, G., Pérez-Marrufo, V., Hobson, E. A., Salinas-Melgoza, A., &amp; Wright, T. F. (2023). Individual identity information persists in learned calls of introduced parrot populations. </w:t>
-      </w:r>
-      <w:r>
-        <w:rPr>
-          <w:rFonts w:ascii="Arial" w:hAnsi="Arial" w:cs="Arial"/>
-          <w:i/>
-          <w:iCs/>
-        </w:rPr>
-        <w:t>PLOS Computational Biology</w:t>
-      </w:r>
-      <w:r>
-        <w:rPr>
-          <w:rFonts w:ascii="Arial" w:hAnsi="Arial" w:cs="Arial"/>
-        </w:rPr>
-        <w:t xml:space="preserve">, </w:t>
-      </w:r>
-      <w:r>
-        <w:rPr>
-          <w:rFonts w:ascii="Arial" w:hAnsi="Arial" w:cs="Arial"/>
-          <w:i/>
-          <w:iCs/>
-        </w:rPr>
-        <w:t>19</w:t>
-      </w:r>
-      <w:r>
-        <w:rPr>
-          <w:rFonts w:ascii="Arial" w:hAnsi="Arial" w:cs="Arial"/>
-        </w:rPr>
-        <w:t>(7), e1011231. https://doi.org/10.1371/journal.pcbi.1011231</w:t>
-      </w:r>
-    </w:p>
-    <w:p>
-      <w:pPr>
-        <w:pStyle w:val="Bibliography"/>
-        <w:spacing w:line="360" w:lineRule="auto"/>
-        <w:ind w:left="720" w:hanging="720"/>
-        <w:rPr>
-          <w:rFonts w:ascii="Arial" w:hAnsi="Arial" w:cs="Arial"/>
-        </w:rPr>
-      </w:pPr>
-      <w:r>
-        <w:rPr>
-          <w:rFonts w:ascii="Arial" w:hAnsi="Arial" w:cs="Arial"/>
-        </w:rPr>
-        <w:lastRenderedPageBreak/>
-        <w:t xml:space="preserve">Smith-Vidaurre, G., Perez-Marrufo, V., &amp; Wright, T. F. (2021). Individual vocal signatures show reduced complexity following invasion. </w:t>
-      </w:r>
-      <w:r>
-        <w:rPr>
-          <w:rFonts w:ascii="Arial" w:hAnsi="Arial" w:cs="Arial"/>
-          <w:i/>
-          <w:iCs/>
-        </w:rPr>
-        <w:t>Animal Behaviour</w:t>
-      </w:r>
-      <w:r>
-        <w:rPr>
-          <w:rFonts w:ascii="Arial" w:hAnsi="Arial" w:cs="Arial"/>
-        </w:rPr>
-        <w:t xml:space="preserve">, </w:t>
-      </w:r>
-      <w:r>
-        <w:rPr>
-          <w:rFonts w:ascii="Arial" w:hAnsi="Arial" w:cs="Arial"/>
-          <w:i/>
-          <w:iCs/>
-        </w:rPr>
-        <w:t>179</w:t>
-      </w:r>
-      <w:r>
-        <w:rPr>
-          <w:rFonts w:ascii="Arial" w:hAnsi="Arial" w:cs="Arial"/>
-        </w:rPr>
-        <w:t>, 15–39. https://doi.org/10.1016/j.anbehav.2021.06.020</w:t>
-      </w:r>
-    </w:p>
-    <w:p>
-      <w:pPr>
-        <w:pStyle w:val="Bibliography"/>
-        <w:spacing w:line="360" w:lineRule="auto"/>
-        <w:ind w:left="720" w:hanging="720"/>
-        <w:rPr>
-          <w:rFonts w:ascii="Arial" w:hAnsi="Arial" w:cs="Arial"/>
-        </w:rPr>
-      </w:pPr>
-      <w:r>
-        <w:rPr>
-          <w:rFonts w:ascii="Arial" w:hAnsi="Arial" w:cs="Arial"/>
-        </w:rPr>
-        <w:t xml:space="preserve">Wright, T. F. (1997). Regional dialects in the contact call of a parrot. </w:t>
-      </w:r>
-      <w:r>
-        <w:rPr>
-          <w:rFonts w:ascii="Arial" w:hAnsi="Arial" w:cs="Arial"/>
-          <w:i/>
-          <w:iCs/>
-        </w:rPr>
-        <w:t>Proceedings of the Royal Society of London. Series B: Biological Sciences</w:t>
-      </w:r>
-      <w:r>
-        <w:rPr>
-          <w:rFonts w:ascii="Arial" w:hAnsi="Arial" w:cs="Arial"/>
-        </w:rPr>
-        <w:t xml:space="preserve">, </w:t>
-      </w:r>
-      <w:r>
-        <w:rPr>
-          <w:rFonts w:ascii="Arial" w:hAnsi="Arial" w:cs="Arial"/>
-          <w:i/>
-          <w:iCs/>
-        </w:rPr>
-        <w:t>263</w:t>
-      </w:r>
-      <w:r>
-        <w:rPr>
-          <w:rFonts w:ascii="Arial" w:hAnsi="Arial" w:cs="Arial"/>
-        </w:rPr>
-        <w:t>(1372), 867–872. https://doi.org/10.1098/rspb.1996.0128</w:t>
-      </w:r>
-    </w:p>
-    <w:p>
-      <w:pPr>
-        <w:spacing w:line="360" w:lineRule="auto"/>
-        <w:ind w:left="720" w:hanging="720"/>
-        <w:rPr>
-          <w:rFonts w:ascii="Arial" w:hAnsi="Arial" w:cs="Arial"/>
-        </w:rPr>
-      </w:pPr>
-      <w:r>
-        <w:rPr>
-          <w:rFonts w:ascii="Arial" w:hAnsi="Arial" w:cs="Arial"/>
-        </w:rPr>
         <w:fldChar w:fldCharType="end"/>
       </w:r>
     </w:p>
@@ -4238,11 +4980,19 @@
           <w:rFonts w:ascii="Arial" w:hAnsi="Arial" w:cs="Arial"/>
         </w:rPr>
       </w:pPr>
-      <w:r>
-        <w:rPr>
-          <w:rFonts w:ascii="Arial" w:hAnsi="Arial" w:cs="Arial"/>
-        </w:rPr>
-        <w:t xml:space="preserve">paRsynth Part 2: validating types of analysis </w:t>
+      <w:proofErr w:type="spellStart"/>
+      <w:r>
+        <w:rPr>
+          <w:rFonts w:ascii="Arial" w:hAnsi="Arial" w:cs="Arial"/>
+        </w:rPr>
+        <w:t>paRsynth</w:t>
+      </w:r>
+      <w:proofErr w:type="spellEnd"/>
+      <w:r>
+        <w:rPr>
+          <w:rFonts w:ascii="Arial" w:hAnsi="Arial" w:cs="Arial"/>
+        </w:rPr>
+        <w:t xml:space="preserve"> Part 2: validating types of analysis </w:t>
       </w:r>
     </w:p>
     <w:p>
@@ -4332,7 +5082,21 @@
         <w:rPr>
           <w:rFonts w:ascii="Arial" w:hAnsi="Arial" w:cs="Arial"/>
         </w:rPr>
-        <w:t>Analysis questions: How similar are an individual’s calls to its own calls, compared to calls of other individuals? And the same for groups</w:t>
+        <w:t xml:space="preserve">Analysis questions: How similar are an individual’s calls to </w:t>
+      </w:r>
+      <w:proofErr w:type="gramStart"/>
+      <w:r>
+        <w:rPr>
+          <w:rFonts w:ascii="Arial" w:hAnsi="Arial" w:cs="Arial"/>
+        </w:rPr>
+        <w:t>its</w:t>
+      </w:r>
+      <w:proofErr w:type="gramEnd"/>
+      <w:r>
+        <w:rPr>
+          <w:rFonts w:ascii="Arial" w:hAnsi="Arial" w:cs="Arial"/>
+        </w:rPr>
+        <w:t xml:space="preserve"> own calls, compared to calls of other individuals? And the same for groups</w:t>
       </w:r>
     </w:p>
     <w:p>
@@ -4353,7 +5117,21 @@
         <w:rPr>
           <w:rFonts w:ascii="Arial" w:hAnsi="Arial" w:cs="Arial"/>
         </w:rPr>
-        <w:t>These models allow us to address the statistical significance of the degree or magnitude of convergence (which we originally encoded using paRsynth). The inferential statistics layer to validate that the information we originally encoded can be recovered</w:t>
+        <w:t xml:space="preserve">These models allow us to address the statistical significance of the degree or magnitude of convergence (which we originally encoded using </w:t>
+      </w:r>
+      <w:proofErr w:type="spellStart"/>
+      <w:r>
+        <w:rPr>
+          <w:rFonts w:ascii="Arial" w:hAnsi="Arial" w:cs="Arial"/>
+        </w:rPr>
+        <w:t>paRsynth</w:t>
+      </w:r>
+      <w:proofErr w:type="spellEnd"/>
+      <w:r>
+        <w:rPr>
+          <w:rFonts w:ascii="Arial" w:hAnsi="Arial" w:cs="Arial"/>
+        </w:rPr>
+        <w:t>). The inferential statistics layer to validate that the information we originally encoded can be recovered</w:t>
       </w:r>
     </w:p>
     <w:p>
@@ -4374,7 +5152,21 @@
         <w:rPr>
           <w:rFonts w:ascii="Arial" w:hAnsi="Arial" w:cs="Arial"/>
         </w:rPr>
-        <w:t>A receiver standpoint on information recovery, in which we simulated signaler information encoding. Does the variation that we encoded actually matter???</w:t>
+        <w:t xml:space="preserve">A receiver standpoint on information recovery, in which we simulated signaler information encoding. Does the variation that we encoded </w:t>
+      </w:r>
+      <w:proofErr w:type="gramStart"/>
+      <w:r>
+        <w:rPr>
+          <w:rFonts w:ascii="Arial" w:hAnsi="Arial" w:cs="Arial"/>
+        </w:rPr>
+        <w:t>actually matter</w:t>
+      </w:r>
+      <w:proofErr w:type="gramEnd"/>
+      <w:r>
+        <w:rPr>
+          <w:rFonts w:ascii="Arial" w:hAnsi="Arial" w:cs="Arial"/>
+        </w:rPr>
+        <w:t>???</w:t>
       </w:r>
     </w:p>
     <w:p>
@@ -4395,7 +5187,21 @@
         <w:rPr>
           <w:rFonts w:ascii="Arial" w:hAnsi="Arial" w:cs="Arial"/>
         </w:rPr>
-        <w:t>Because we have repeated sampling at both social levels with known individuals, we can actually model variation in convergence within and between categories (individuals, groups) at each social level</w:t>
+        <w:t xml:space="preserve">Because we have repeated sampling at both social levels with known individuals, we can </w:t>
+      </w:r>
+      <w:proofErr w:type="gramStart"/>
+      <w:r>
+        <w:rPr>
+          <w:rFonts w:ascii="Arial" w:hAnsi="Arial" w:cs="Arial"/>
+        </w:rPr>
+        <w:t>actually model</w:t>
+      </w:r>
+      <w:proofErr w:type="gramEnd"/>
+      <w:r>
+        <w:rPr>
+          <w:rFonts w:ascii="Arial" w:hAnsi="Arial" w:cs="Arial"/>
+        </w:rPr>
+        <w:t xml:space="preserve"> variation in convergence within and between categories (individuals, groups) at each social level</w:t>
       </w:r>
     </w:p>
     <w:p>
@@ -4730,8 +5536,11 @@
       </w:r>
     </w:p>
   </w:comment>
-  <w:comment w:id="12" w:author="Smith Vidaurre, Grace" w:date="2024-12-16T09:44:00Z" w:initials="GSV">
-    <w:p>
+  <w:comment w:id="12" w:author="Coppinger, Brittany" w:date="2024-12-17T13:46:00Z" w:initials="BC">
+    <w:p>
+      <w:pPr>
+        <w:pStyle w:val="CommentText"/>
+      </w:pPr>
       <w:r>
         <w:rPr>
           <w:rStyle w:val="CommentReference"/>
@@ -4739,16 +5548,15 @@
         <w:annotationRef/>
       </w:r>
       <w:r>
-        <w:rPr>
-          <w:sz w:val="20"/>
-          <w:szCs w:val="20"/>
-        </w:rPr>
-        <w:t>This is key, move to the third point</w:t>
+        <w:t>Bradbury Verherncamp ed 1</w:t>
       </w:r>
     </w:p>
   </w:comment>
-  <w:comment w:id="13" w:author="Smith Vidaurre, Grace" w:date="2024-12-16T09:43:00Z" w:initials="GSV">
-    <w:p>
+  <w:comment w:id="13" w:author="Coppinger, Brittany" w:date="2024-12-17T13:47:00Z" w:initials="BC">
+    <w:p>
+      <w:pPr>
+        <w:pStyle w:val="CommentText"/>
+      </w:pPr>
       <w:r>
         <w:rPr>
           <w:rStyle w:val="CommentReference"/>
@@ -4756,15 +5564,11 @@
         <w:annotationRef/>
       </w:r>
       <w:r>
-        <w:rPr>
-          <w:sz w:val="20"/>
-          <w:szCs w:val="20"/>
-        </w:rPr>
-        <w:t>The dynamics of information encoding during real-time social interactions (in the very same call type)</w:t>
+        <w:t>Grace, you have this citation right?</w:t>
       </w:r>
     </w:p>
   </w:comment>
-  <w:comment w:id="14" w:author="Coppinger, Brittany" w:date="2024-12-09T10:47:00Z" w:initials="BC">
+  <w:comment w:id="14" w:author="Coppinger, Brittany" w:date="2024-12-17T14:24:00Z" w:initials="BC">
     <w:p>
       <w:pPr>
         <w:pStyle w:val="CommentText"/>
@@ -4776,28 +5580,15 @@
         <w:annotationRef/>
       </w:r>
       <w:r>
-        <w:t xml:space="preserve">Marcello, tim paper (more methods based to use machine learning, but used syntheitc sugnals. </w:t>
-      </w:r>
-    </w:p>
+        <w:t>Grace, do you think you could describe these packages, since you are more familiar with them?</w:t>
+      </w:r>
+    </w:p>
+  </w:comment>
+  <w:comment w:id="15" w:author="Coppinger, Brittany" w:date="2024-12-17T14:27:00Z" w:initials="BC">
     <w:p>
       <w:pPr>
         <w:pStyle w:val="CommentText"/>
       </w:pPr>
-    </w:p>
-    <w:p>
-      <w:pPr>
-        <w:pStyle w:val="CommentText"/>
-      </w:pPr>
-      <w:r>
-        <w:t>Look people are suing these synthetic datasets and they are useful for simplifying and controling complexi biological dataset</w:t>
-      </w:r>
-    </w:p>
-  </w:comment>
-  <w:comment w:id="15" w:author="Coppinger, Brittany" w:date="2024-12-09T10:47:00Z" w:initials="BC">
-    <w:p>
-      <w:pPr>
-        <w:pStyle w:val="CommentText"/>
-      </w:pPr>
       <w:r>
         <w:rPr>
           <w:rStyle w:val="CommentReference"/>
@@ -4805,7 +5596,7 @@
         <w:annotationRef/>
       </w:r>
       <w:r>
-        <w:t xml:space="preserve">Cite soundgen </w:t>
+        <w:t>Messy messy sentence, needs to be cleaned up. But serves as current placeholder for power transition sentence!</w:t>
       </w:r>
     </w:p>
   </w:comment>
@@ -4857,8 +5648,11 @@
       </w:r>
     </w:p>
   </w:comment>
-  <w:comment w:id="19" w:author="Smith Vidaurre, Grace" w:date="2024-12-16T09:46:00Z" w:initials="GSV">
-    <w:p>
+  <w:comment w:id="19" w:author="Coppinger, Brittany" w:date="2024-12-09T12:05:00Z" w:initials="BC">
+    <w:p>
+      <w:pPr>
+        <w:pStyle w:val="CommentText"/>
+      </w:pPr>
       <w:r>
         <w:rPr>
           <w:rStyle w:val="CommentReference"/>
@@ -4866,15 +5660,11 @@
         <w:annotationRef/>
       </w:r>
       <w:r>
-        <w:rPr>
-          <w:sz w:val="20"/>
-          <w:szCs w:val="20"/>
-        </w:rPr>
-        <w:t xml:space="preserve">Allowing for a pipeline of controlled information encoding and decoding that facilitates validation of traditional bioacoustics tools for information recovery </w:t>
+        <w:t>Keep this here or move this to paper 2</w:t>
       </w:r>
     </w:p>
   </w:comment>
-  <w:comment w:id="20" w:author="Coppinger, Brittany" w:date="2024-12-09T12:05:00Z" w:initials="BC">
+  <w:comment w:id="20" w:author="Coppinger, Brittany" w:date="2024-12-09T12:04:00Z" w:initials="BC">
     <w:p>
       <w:pPr>
         <w:pStyle w:val="CommentText"/>
@@ -4886,27 +5676,11 @@
         <w:annotationRef/>
       </w:r>
       <w:r>
-        <w:t>Keep this here or move this to paper 2</w:t>
+        <w:t>Don’t need this?</w:t>
       </w:r>
     </w:p>
   </w:comment>
-  <w:comment w:id="21" w:author="Coppinger, Brittany" w:date="2024-12-09T12:04:00Z" w:initials="BC">
-    <w:p>
-      <w:pPr>
-        <w:pStyle w:val="CommentText"/>
-      </w:pPr>
-      <w:r>
-        <w:rPr>
-          <w:rStyle w:val="CommentReference"/>
-        </w:rPr>
-        <w:annotationRef/>
-      </w:r>
-      <w:r>
-        <w:t>Don’t need this?</w:t>
-      </w:r>
-    </w:p>
-  </w:comment>
-  <w:comment w:id="22" w:author="Coppinger, Brittany" w:date="2024-12-09T12:03:00Z" w:initials="BC">
+  <w:comment w:id="21" w:author="Coppinger, Brittany" w:date="2024-12-09T12:03:00Z" w:initials="BC">
     <w:p>
       <w:pPr>
         <w:pStyle w:val="CommentText"/>
@@ -4939,14 +5713,13 @@
   <w15:commentEx w15:paraId="2AF6C8F6" w15:paraIdParent="163BE427" w15:done="0"/>
   <w15:commentEx w15:paraId="4315F33A" w15:paraIdParent="163BE427" w15:done="0"/>
   <w15:commentEx w15:paraId="636B6223" w15:done="0"/>
-  <w15:commentEx w15:paraId="1AE30FB7" w15:done="0"/>
-  <w15:commentEx w15:paraId="144DBA80" w15:done="0"/>
-  <w15:commentEx w15:paraId="4F49A793" w15:done="0"/>
-  <w15:commentEx w15:paraId="57AE8EA3" w15:paraIdParent="4F49A793" w15:done="0"/>
+  <w15:commentEx w15:paraId="5C215586" w15:done="0"/>
+  <w15:commentEx w15:paraId="3D2844F7" w15:paraIdParent="5C215586" w15:done="0"/>
+  <w15:commentEx w15:paraId="6792BB40" w15:done="0"/>
+  <w15:commentEx w15:paraId="137E9573" w15:done="0"/>
   <w15:commentEx w15:paraId="6F484538" w15:done="0"/>
   <w15:commentEx w15:paraId="2CA2704B" w15:paraIdParent="6F484538" w15:done="0"/>
   <w15:commentEx w15:paraId="421960A3" w15:paraIdParent="6F484538" w15:done="0"/>
-  <w15:commentEx w15:paraId="523664BE" w15:done="0"/>
   <w15:commentEx w15:paraId="06B3310D" w15:done="0"/>
   <w15:commentEx w15:paraId="74FB68C1" w15:done="0"/>
   <w15:commentEx w15:paraId="415E945D" w15:done="0"/>
@@ -4967,14 +5740,13 @@
   <w16cex:commentExtensible w16cex:durableId="1474319E" w16cex:dateUtc="2024-12-16T14:41:00Z"/>
   <w16cex:commentExtensible w16cex:durableId="6E909C82" w16cex:dateUtc="2024-12-16T19:51:00Z"/>
   <w16cex:commentExtensible w16cex:durableId="37576767" w16cex:dateUtc="2024-12-16T14:42:00Z"/>
-  <w16cex:commentExtensible w16cex:durableId="4D87440D" w16cex:dateUtc="2024-12-16T14:44:00Z"/>
-  <w16cex:commentExtensible w16cex:durableId="613CE9D2" w16cex:dateUtc="2024-12-16T14:43:00Z"/>
-  <w16cex:commentExtensible w16cex:durableId="33C20744" w16cex:dateUtc="2024-12-09T15:47:00Z"/>
-  <w16cex:commentExtensible w16cex:durableId="30861157" w16cex:dateUtc="2024-12-09T15:47:00Z"/>
+  <w16cex:commentExtensible w16cex:durableId="664E477A" w16cex:dateUtc="2024-12-17T18:46:00Z"/>
+  <w16cex:commentExtensible w16cex:durableId="4A1630E6" w16cex:dateUtc="2024-12-17T18:47:00Z"/>
+  <w16cex:commentExtensible w16cex:durableId="4BE7D845" w16cex:dateUtc="2024-12-17T19:24:00Z"/>
+  <w16cex:commentExtensible w16cex:durableId="6BF42AE1" w16cex:dateUtc="2024-12-17T19:27:00Z"/>
   <w16cex:commentExtensible w16cex:durableId="68E3180E" w16cex:dateUtc="2024-12-12T19:19:00Z"/>
   <w16cex:commentExtensible w16cex:durableId="5D5BA50A" w16cex:dateUtc="2024-12-16T20:38:00Z"/>
   <w16cex:commentExtensible w16cex:durableId="13A2EF68" w16cex:dateUtc="2024-12-16T20:39:00Z"/>
-  <w16cex:commentExtensible w16cex:durableId="3C842578" w16cex:dateUtc="2024-12-16T14:46:00Z"/>
   <w16cex:commentExtensible w16cex:durableId="413A92F9" w16cex:dateUtc="2024-12-09T17:05:00Z"/>
   <w16cex:commentExtensible w16cex:durableId="1DC55E73" w16cex:dateUtc="2024-12-09T17:04:00Z"/>
   <w16cex:commentExtensible w16cex:durableId="787E58E8" w16cex:dateUtc="2024-12-09T17:03:00Z"/>
@@ -4995,14 +5767,13 @@
   <w16cid:commentId w16cid:paraId="2AF6C8F6" w16cid:durableId="1474319E"/>
   <w16cid:commentId w16cid:paraId="4315F33A" w16cid:durableId="6E909C82"/>
   <w16cid:commentId w16cid:paraId="636B6223" w16cid:durableId="37576767"/>
-  <w16cid:commentId w16cid:paraId="1AE30FB7" w16cid:durableId="4D87440D"/>
-  <w16cid:commentId w16cid:paraId="144DBA80" w16cid:durableId="613CE9D2"/>
-  <w16cid:commentId w16cid:paraId="4F49A793" w16cid:durableId="33C20744"/>
-  <w16cid:commentId w16cid:paraId="57AE8EA3" w16cid:durableId="30861157"/>
+  <w16cid:commentId w16cid:paraId="5C215586" w16cid:durableId="664E477A"/>
+  <w16cid:commentId w16cid:paraId="3D2844F7" w16cid:durableId="4A1630E6"/>
+  <w16cid:commentId w16cid:paraId="6792BB40" w16cid:durableId="4BE7D845"/>
+  <w16cid:commentId w16cid:paraId="137E9573" w16cid:durableId="6BF42AE1"/>
   <w16cid:commentId w16cid:paraId="6F484538" w16cid:durableId="68E3180E"/>
   <w16cid:commentId w16cid:paraId="2CA2704B" w16cid:durableId="5D5BA50A"/>
   <w16cid:commentId w16cid:paraId="421960A3" w16cid:durableId="13A2EF68"/>
-  <w16cid:commentId w16cid:paraId="523664BE" w16cid:durableId="3C842578"/>
   <w16cid:commentId w16cid:paraId="06B3310D" w16cid:durableId="413A92F9"/>
   <w16cid:commentId w16cid:paraId="74FB68C1" w16cid:durableId="1DC55E73"/>
   <w16cid:commentId w16cid:paraId="415E945D" w16cid:durableId="787E58E8"/>

</xml_diff>

<commit_message>
Feedback on recent draft of Intro
</commit_message>
<xml_diff>
--- a/paRsynth_methods_draft_BAC.docx
+++ b/paRsynth_methods_draft_BAC.docx
@@ -1633,20 +1633,12 @@
         </w:rPr>
         <w:t xml:space="preserve">, therefore creating a potential mismatch between the salient information that we can quantify and the information that is salient to receivers. Second, </w:t>
       </w:r>
-      <w:proofErr w:type="gramStart"/>
       <w:r>
         <w:rPr>
           <w:rFonts w:ascii="Arial" w:hAnsi="Arial" w:cs="Arial"/>
         </w:rPr>
         <w:lastRenderedPageBreak/>
-        <w:t>out</w:t>
-      </w:r>
-      <w:proofErr w:type="gramEnd"/>
-      <w:r>
-        <w:rPr>
-          <w:rFonts w:ascii="Arial" w:hAnsi="Arial" w:cs="Arial"/>
-        </w:rPr>
-        <w:t xml:space="preserve"> ability to detect the dynamics of information encoding during real time social interactions is limited by our ability to capture the totality of an individual’s or groups signal produced during these interactions. </w:t>
+        <w:t xml:space="preserve">out ability to detect the dynamics of information encoding during real time social interactions is limited by our ability to capture the totality of an individual’s or groups signal produced during these interactions. </w:t>
       </w:r>
       <w:r>
         <w:rPr>
@@ -1766,21 +1758,7 @@
         <w:rPr>
           <w:rFonts w:ascii="Arial" w:hAnsi="Arial" w:cs="Arial"/>
         </w:rPr>
-        <w:t>(</w:t>
-      </w:r>
-      <w:proofErr w:type="spellStart"/>
-      <w:r>
-        <w:rPr>
-          <w:rFonts w:ascii="Arial" w:hAnsi="Arial" w:cs="Arial"/>
-        </w:rPr>
-        <w:t>Sainburg</w:t>
-      </w:r>
-      <w:proofErr w:type="spellEnd"/>
-      <w:r>
-        <w:rPr>
-          <w:rFonts w:ascii="Arial" w:hAnsi="Arial" w:cs="Arial"/>
-        </w:rPr>
-        <w:t xml:space="preserve"> &amp; Gentner, 2021)</w:t>
+        <w:t>(Sainburg &amp; Gentner, 2021)</w:t>
       </w:r>
       <w:r>
         <w:rPr>
@@ -1816,21 +1794,7 @@
         <w:rPr>
           <w:rFonts w:ascii="Arial" w:hAnsi="Arial" w:cs="Arial"/>
         </w:rPr>
-        <w:t>(</w:t>
-      </w:r>
-      <w:proofErr w:type="spellStart"/>
-      <w:r>
-        <w:rPr>
-          <w:rFonts w:ascii="Arial" w:hAnsi="Arial" w:cs="Arial"/>
-        </w:rPr>
-        <w:t>Kershenbaum</w:t>
-      </w:r>
-      <w:proofErr w:type="spellEnd"/>
-      <w:r>
-        <w:rPr>
-          <w:rFonts w:ascii="Arial" w:hAnsi="Arial" w:cs="Arial"/>
-        </w:rPr>
-        <w:t xml:space="preserve"> &amp; Garland, 2015)</w:t>
+        <w:t>(Kershenbaum &amp; Garland, 2015)</w:t>
       </w:r>
       <w:r>
         <w:rPr>
@@ -2033,21 +1997,7 @@
         <w:rPr>
           <w:rFonts w:ascii="Arial" w:hAnsi="Arial" w:cs="Arial"/>
         </w:rPr>
-        <w:t xml:space="preserve">(Berg, Delgado, Okawa, et al., 2011; Janik et al., 2006; Janik &amp; </w:t>
-      </w:r>
-      <w:proofErr w:type="spellStart"/>
-      <w:r>
-        <w:rPr>
-          <w:rFonts w:ascii="Arial" w:hAnsi="Arial" w:cs="Arial"/>
-        </w:rPr>
-        <w:t>Sayigh</w:t>
-      </w:r>
-      <w:proofErr w:type="spellEnd"/>
-      <w:r>
-        <w:rPr>
-          <w:rFonts w:ascii="Arial" w:hAnsi="Arial" w:cs="Arial"/>
-        </w:rPr>
-        <w:t>, 2013; Janik &amp; Slater, 2000; Wright, 1997b)</w:t>
+        <w:t>(Berg, Delgado, Okawa, et al., 2011; Janik et al., 2006; Janik &amp; Sayigh, 2013; Janik &amp; Slater, 2000; Wright, 1997b)</w:t>
       </w:r>
       <w:r>
         <w:rPr>
@@ -2150,7 +2100,27 @@
         <w:rPr>
           <w:rFonts w:ascii="Arial" w:hAnsi="Arial" w:cs="Arial"/>
         </w:rPr>
-        <w:t>vocalization. [Need powerful closing sentence].</w:t>
+        <w:t xml:space="preserve">vocalization. [Need powerful closing </w:t>
+      </w:r>
+      <w:commentRangeStart w:id="19"/>
+      <w:r>
+        <w:rPr>
+          <w:rFonts w:ascii="Arial" w:hAnsi="Arial" w:cs="Arial"/>
+        </w:rPr>
+        <w:t>sentence</w:t>
+      </w:r>
+      <w:commentRangeEnd w:id="19"/>
+      <w:r>
+        <w:rPr>
+          <w:rStyle w:val="CommentReference"/>
+        </w:rPr>
+        <w:commentReference w:id="19"/>
+      </w:r>
+      <w:r>
+        <w:rPr>
+          <w:rFonts w:ascii="Arial" w:hAnsi="Arial" w:cs="Arial"/>
+        </w:rPr>
+        <w:t>].</w:t>
       </w:r>
     </w:p>
     <w:p>
@@ -2782,7 +2752,7 @@
           <w:rFonts w:ascii="Arial" w:hAnsi="Arial" w:cs="Arial"/>
         </w:rPr>
       </w:pPr>
-      <w:commentRangeStart w:id="19"/>
+      <w:commentRangeStart w:id="20"/>
       <w:r>
         <w:rPr>
           <w:rFonts w:ascii="Arial" w:hAnsi="Arial" w:cs="Arial"/>
@@ -2795,12 +2765,12 @@
         </w:rPr>
         <w:t xml:space="preserve"> based</w:t>
       </w:r>
-      <w:commentRangeEnd w:id="19"/>
+      <w:commentRangeEnd w:id="20"/>
       <w:r>
         <w:rPr>
           <w:rStyle w:val="CommentReference"/>
         </w:rPr>
-        <w:commentReference w:id="19"/>
+        <w:commentReference w:id="20"/>
       </w:r>
       <w:r>
         <w:rPr>
@@ -3213,7 +3183,7 @@
         </w:rPr>
         <w:t xml:space="preserve">, </w:t>
       </w:r>
-      <w:commentRangeStart w:id="20"/>
+      <w:commentRangeStart w:id="21"/>
       <w:r>
         <w:rPr>
           <w:rFonts w:ascii="Arial" w:hAnsi="Arial" w:cs="Arial"/>
@@ -3226,12 +3196,12 @@
         </w:rPr>
         <w:t>models</w:t>
       </w:r>
-      <w:commentRangeEnd w:id="20"/>
+      <w:commentRangeEnd w:id="21"/>
       <w:r>
         <w:rPr>
           <w:rStyle w:val="CommentReference"/>
         </w:rPr>
-        <w:commentReference w:id="20"/>
+        <w:commentReference w:id="21"/>
       </w:r>
     </w:p>
     <w:p>
@@ -3279,19 +3249,19 @@
           <w:rFonts w:ascii="Arial" w:hAnsi="Arial" w:cs="Arial"/>
         </w:rPr>
       </w:pPr>
-      <w:commentRangeStart w:id="21"/>
+      <w:commentRangeStart w:id="22"/>
       <w:r>
         <w:rPr>
           <w:rFonts w:ascii="Arial" w:hAnsi="Arial" w:cs="Arial"/>
         </w:rPr>
         <w:t>Figures</w:t>
       </w:r>
-      <w:commentRangeEnd w:id="21"/>
+      <w:commentRangeEnd w:id="22"/>
       <w:r>
         <w:rPr>
           <w:rStyle w:val="CommentReference"/>
         </w:rPr>
-        <w:commentReference w:id="21"/>
+        <w:commentReference w:id="22"/>
       </w:r>
       <w:r>
         <w:rPr>
@@ -3450,21 +3420,7 @@
         <w:rPr>
           <w:rFonts w:ascii="Arial" w:hAnsi="Arial" w:cs="Arial"/>
         </w:rPr>
-        <w:t xml:space="preserve">Araya-Salas, M., Smith-Vidaurre, G., </w:t>
-      </w:r>
-      <w:proofErr w:type="spellStart"/>
-      <w:r>
-        <w:rPr>
-          <w:rFonts w:ascii="Arial" w:hAnsi="Arial" w:cs="Arial"/>
-        </w:rPr>
-        <w:t>Mennill</w:t>
-      </w:r>
-      <w:proofErr w:type="spellEnd"/>
-      <w:r>
-        <w:rPr>
-          <w:rFonts w:ascii="Arial" w:hAnsi="Arial" w:cs="Arial"/>
-        </w:rPr>
-        <w:t xml:space="preserve">, D. J., González-Gómez, P. L., Cahill, J., &amp; Wright, T. F. (2019). Social group signatures in hummingbird displays provide evidence of co-occurrence of vocal and visual learning. </w:t>
+        <w:t xml:space="preserve">Araya-Salas, M., Smith-Vidaurre, G., Mennill, D. J., González-Gómez, P. L., Cahill, J., &amp; Wright, T. F. (2019). Social group signatures in hummingbird displays provide evidence of co-occurrence of vocal and visual learning. </w:t>
       </w:r>
       <w:r>
         <w:rPr>
@@ -3506,21 +3462,7 @@
         <w:rPr>
           <w:rFonts w:ascii="Arial" w:hAnsi="Arial" w:cs="Arial"/>
         </w:rPr>
-        <w:t xml:space="preserve">Berg, K. S., Delgado, S., Cortopassi, K. A., </w:t>
-      </w:r>
-      <w:proofErr w:type="spellStart"/>
-      <w:r>
-        <w:rPr>
-          <w:rFonts w:ascii="Arial" w:hAnsi="Arial" w:cs="Arial"/>
-        </w:rPr>
-        <w:t>Beissinger</w:t>
-      </w:r>
-      <w:proofErr w:type="spellEnd"/>
-      <w:r>
-        <w:rPr>
-          <w:rFonts w:ascii="Arial" w:hAnsi="Arial" w:cs="Arial"/>
-        </w:rPr>
-        <w:t xml:space="preserve">, S. R., &amp; Bradbury, J. W. (2011). Vertical transmission of learned signatures in a wild parrot. </w:t>
+        <w:t xml:space="preserve">Berg, K. S., Delgado, S., Cortopassi, K. A., Beissinger, S. R., &amp; Bradbury, J. W. (2011). Vertical transmission of learned signatures in a wild parrot. </w:t>
       </w:r>
       <w:r>
         <w:rPr>
@@ -3562,69 +3504,63 @@
         <w:rPr>
           <w:rFonts w:ascii="Arial" w:hAnsi="Arial" w:cs="Arial"/>
         </w:rPr>
-        <w:t xml:space="preserve">Berg, K. S., Delgado, S., Okawa, R., </w:t>
-      </w:r>
-      <w:proofErr w:type="spellStart"/>
-      <w:r>
-        <w:rPr>
-          <w:rFonts w:ascii="Arial" w:hAnsi="Arial" w:cs="Arial"/>
-        </w:rPr>
-        <w:t>Beissinger</w:t>
-      </w:r>
-      <w:proofErr w:type="spellEnd"/>
-      <w:r>
-        <w:rPr>
-          <w:rFonts w:ascii="Arial" w:hAnsi="Arial" w:cs="Arial"/>
-        </w:rPr>
-        <w:t>, S. R., &amp; Bradbury, J. W. (2011). Contact calls are used for individual mate recognition in free-ranging green-</w:t>
-      </w:r>
-      <w:proofErr w:type="spellStart"/>
-      <w:r>
-        <w:rPr>
-          <w:rFonts w:ascii="Arial" w:hAnsi="Arial" w:cs="Arial"/>
-        </w:rPr>
-        <w:t>rumped</w:t>
-      </w:r>
-      <w:proofErr w:type="spellEnd"/>
-      <w:r>
-        <w:rPr>
-          <w:rFonts w:ascii="Arial" w:hAnsi="Arial" w:cs="Arial"/>
-        </w:rPr>
-        <w:t xml:space="preserve"> parrotlets, </w:t>
-      </w:r>
-      <w:proofErr w:type="spellStart"/>
+        <w:t xml:space="preserve">Berg, K. S., Delgado, S., Okawa, R., Beissinger, S. R., &amp; Bradbury, J. W. (2011). Contact calls are used for individual mate recognition in free-ranging green-rumped parrotlets, </w:t>
+      </w:r>
       <w:r>
         <w:rPr>
           <w:rFonts w:ascii="Arial" w:hAnsi="Arial" w:cs="Arial"/>
           <w:i/>
           <w:iCs/>
         </w:rPr>
-        <w:t>Forpus</w:t>
-      </w:r>
-      <w:proofErr w:type="spellEnd"/>
+        <w:t>Forpus passerinus</w:t>
+      </w:r>
+      <w:r>
+        <w:rPr>
+          <w:rFonts w:ascii="Arial" w:hAnsi="Arial" w:cs="Arial"/>
+        </w:rPr>
+        <w:t xml:space="preserve">. </w:t>
+      </w:r>
       <w:r>
         <w:rPr>
           <w:rFonts w:ascii="Arial" w:hAnsi="Arial" w:cs="Arial"/>
           <w:i/>
           <w:iCs/>
         </w:rPr>
-        <w:t xml:space="preserve"> </w:t>
-      </w:r>
-      <w:proofErr w:type="spellStart"/>
+        <w:t>Animal Behaviour</w:t>
+      </w:r>
+      <w:r>
+        <w:rPr>
+          <w:rFonts w:ascii="Arial" w:hAnsi="Arial" w:cs="Arial"/>
+        </w:rPr>
+        <w:t xml:space="preserve">, </w:t>
+      </w:r>
       <w:r>
         <w:rPr>
           <w:rFonts w:ascii="Arial" w:hAnsi="Arial" w:cs="Arial"/>
           <w:i/>
           <w:iCs/>
         </w:rPr>
-        <w:t>passerinus</w:t>
-      </w:r>
-      <w:proofErr w:type="spellEnd"/>
-      <w:r>
-        <w:rPr>
-          <w:rFonts w:ascii="Arial" w:hAnsi="Arial" w:cs="Arial"/>
-        </w:rPr>
-        <w:t xml:space="preserve">. </w:t>
+        <w:t>81</w:t>
+      </w:r>
+      <w:r>
+        <w:rPr>
+          <w:rFonts w:ascii="Arial" w:hAnsi="Arial" w:cs="Arial"/>
+        </w:rPr>
+        <w:t>(1), 241–248. https://doi.org/10.1016/j.anbehav.2010.10.012</w:t>
+      </w:r>
+    </w:p>
+    <w:p>
+      <w:pPr>
+        <w:pStyle w:val="Bibliography"/>
+        <w:rPr>
+          <w:rFonts w:ascii="Arial" w:hAnsi="Arial" w:cs="Arial"/>
+        </w:rPr>
+      </w:pPr>
+      <w:r>
+        <w:rPr>
+          <w:rFonts w:ascii="Arial" w:hAnsi="Arial" w:cs="Arial"/>
+        </w:rPr>
+        <w:t xml:space="preserve">Carouso-Peck, S., Goldstein, M. H., &amp; Fitch, W. T. (2021). The many functions of vocal learning. </w:t>
       </w:r>
       <w:r>
         <w:rPr>
@@ -3632,23 +3568,41 @@
           <w:i/>
           <w:iCs/>
         </w:rPr>
-        <w:t xml:space="preserve">Animal </w:t>
-      </w:r>
-      <w:proofErr w:type="spellStart"/>
+        <w:t>Philosophical Transactions of the Royal Society B: Biological Sciences</w:t>
+      </w:r>
+      <w:r>
+        <w:rPr>
+          <w:rFonts w:ascii="Arial" w:hAnsi="Arial" w:cs="Arial"/>
+        </w:rPr>
+        <w:t xml:space="preserve">, </w:t>
+      </w:r>
       <w:r>
         <w:rPr>
           <w:rFonts w:ascii="Arial" w:hAnsi="Arial" w:cs="Arial"/>
           <w:i/>
           <w:iCs/>
         </w:rPr>
-        <w:t>Behaviour</w:t>
-      </w:r>
-      <w:proofErr w:type="spellEnd"/>
-      <w:r>
-        <w:rPr>
-          <w:rFonts w:ascii="Arial" w:hAnsi="Arial" w:cs="Arial"/>
-        </w:rPr>
-        <w:t xml:space="preserve">, </w:t>
+        <w:t>376</w:t>
+      </w:r>
+      <w:r>
+        <w:rPr>
+          <w:rFonts w:ascii="Arial" w:hAnsi="Arial" w:cs="Arial"/>
+        </w:rPr>
+        <w:t>(1836), 20200235. https://doi.org/10.1098/rstb.2020.0235</w:t>
+      </w:r>
+    </w:p>
+    <w:p>
+      <w:pPr>
+        <w:pStyle w:val="Bibliography"/>
+        <w:rPr>
+          <w:rFonts w:ascii="Arial" w:hAnsi="Arial" w:cs="Arial"/>
+        </w:rPr>
+      </w:pPr>
+      <w:r>
+        <w:rPr>
+          <w:rFonts w:ascii="Arial" w:hAnsi="Arial" w:cs="Arial"/>
+        </w:rPr>
+        <w:t xml:space="preserve">Coppinger, B. A., Davis, J. E., &amp; Freeberg, T. M. (2019). Flock-mate familiarity affects note composition of chickadee calls. </w:t>
       </w:r>
       <w:r>
         <w:rPr>
@@ -3656,35 +3610,13 @@
           <w:i/>
           <w:iCs/>
         </w:rPr>
-        <w:t>81</w:t>
-      </w:r>
-      <w:r>
-        <w:rPr>
-          <w:rFonts w:ascii="Arial" w:hAnsi="Arial" w:cs="Arial"/>
-        </w:rPr>
-        <w:t>(1), 241–248. https://doi.org/10.1016/j.anbehav.2010.10.012</w:t>
-      </w:r>
-    </w:p>
-    <w:p>
-      <w:pPr>
-        <w:pStyle w:val="Bibliography"/>
-        <w:rPr>
-          <w:rFonts w:ascii="Arial" w:hAnsi="Arial" w:cs="Arial"/>
-        </w:rPr>
-      </w:pPr>
-      <w:proofErr w:type="spellStart"/>
-      <w:r>
-        <w:rPr>
-          <w:rFonts w:ascii="Arial" w:hAnsi="Arial" w:cs="Arial"/>
-        </w:rPr>
-        <w:t>Carouso</w:t>
-      </w:r>
-      <w:proofErr w:type="spellEnd"/>
-      <w:r>
-        <w:rPr>
-          <w:rFonts w:ascii="Arial" w:hAnsi="Arial" w:cs="Arial"/>
-        </w:rPr>
-        <w:t xml:space="preserve">-Peck, S., Goldstein, M. H., &amp; Fitch, W. T. (2021). The many functions of vocal learning. </w:t>
+        <w:t>Acta Ethologica</w:t>
+      </w:r>
+      <w:r>
+        <w:rPr>
+          <w:rFonts w:ascii="Arial" w:hAnsi="Arial" w:cs="Arial"/>
+        </w:rPr>
+        <w:t xml:space="preserve">, </w:t>
       </w:r>
       <w:r>
         <w:rPr>
@@ -3692,13 +3624,27 @@
           <w:i/>
           <w:iCs/>
         </w:rPr>
-        <w:t>Philosophical Transactions of the Royal Society B: Biological Sciences</w:t>
-      </w:r>
-      <w:r>
-        <w:rPr>
-          <w:rFonts w:ascii="Arial" w:hAnsi="Arial" w:cs="Arial"/>
-        </w:rPr>
-        <w:t xml:space="preserve">, </w:t>
+        <w:t>22</w:t>
+      </w:r>
+      <w:r>
+        <w:rPr>
+          <w:rFonts w:ascii="Arial" w:hAnsi="Arial" w:cs="Arial"/>
+        </w:rPr>
+        <w:t>(1), 73–77. https://doi.org/10.1007/s10211-019-00308-8</w:t>
+      </w:r>
+    </w:p>
+    <w:p>
+      <w:pPr>
+        <w:pStyle w:val="Bibliography"/>
+        <w:rPr>
+          <w:rFonts w:ascii="Arial" w:hAnsi="Arial" w:cs="Arial"/>
+        </w:rPr>
+      </w:pPr>
+      <w:r>
+        <w:rPr>
+          <w:rFonts w:ascii="Arial" w:hAnsi="Arial" w:cs="Arial"/>
+        </w:rPr>
+        <w:t xml:space="preserve">Deecke, V. B., Ford, J. K. B., &amp; Spong, P. (2000). Dialect change in resident killer whales: Implications for vocal learning and cultural transmission. </w:t>
       </w:r>
       <w:r>
         <w:rPr>
@@ -3706,27 +3652,13 @@
           <w:i/>
           <w:iCs/>
         </w:rPr>
-        <w:t>376</w:t>
-      </w:r>
-      <w:r>
-        <w:rPr>
-          <w:rFonts w:ascii="Arial" w:hAnsi="Arial" w:cs="Arial"/>
-        </w:rPr>
-        <w:t>(1836), 20200235. https://doi.org/10.1098/rstb.2020.0235</w:t>
-      </w:r>
-    </w:p>
-    <w:p>
-      <w:pPr>
-        <w:pStyle w:val="Bibliography"/>
-        <w:rPr>
-          <w:rFonts w:ascii="Arial" w:hAnsi="Arial" w:cs="Arial"/>
-        </w:rPr>
-      </w:pPr>
-      <w:r>
-        <w:rPr>
-          <w:rFonts w:ascii="Arial" w:hAnsi="Arial" w:cs="Arial"/>
-        </w:rPr>
-        <w:t xml:space="preserve">Coppinger, B. A., Davis, J. E., &amp; Freeberg, T. M. (2019). Flock-mate familiarity affects note composition of chickadee calls. </w:t>
+        <w:t>Animal Behaviour</w:t>
+      </w:r>
+      <w:r>
+        <w:rPr>
+          <w:rFonts w:ascii="Arial" w:hAnsi="Arial" w:cs="Arial"/>
+        </w:rPr>
+        <w:t xml:space="preserve">, </w:t>
       </w:r>
       <w:r>
         <w:rPr>
@@ -3734,18 +3666,36 @@
           <w:i/>
           <w:iCs/>
         </w:rPr>
-        <w:t xml:space="preserve">Acta </w:t>
-      </w:r>
-      <w:proofErr w:type="spellStart"/>
+        <w:t>60</w:t>
+      </w:r>
+      <w:r>
+        <w:rPr>
+          <w:rFonts w:ascii="Arial" w:hAnsi="Arial" w:cs="Arial"/>
+        </w:rPr>
+        <w:t>(5), 629–638. https://doi.org/10.1006/anbe.2000.1454</w:t>
+      </w:r>
+    </w:p>
+    <w:p>
+      <w:pPr>
+        <w:pStyle w:val="Bibliography"/>
+        <w:rPr>
+          <w:rFonts w:ascii="Arial" w:hAnsi="Arial" w:cs="Arial"/>
+        </w:rPr>
+      </w:pPr>
+      <w:r>
+        <w:rPr>
+          <w:rFonts w:ascii="Arial" w:hAnsi="Arial" w:cs="Arial"/>
+        </w:rPr>
+        <w:t xml:space="preserve">Freeberg, T. M. (2006). Social Complexity Can Drive Vocal Complexity: Group Size Influences Vocal Information in Carolina Chickadees. </w:t>
+      </w:r>
       <w:r>
         <w:rPr>
           <w:rFonts w:ascii="Arial" w:hAnsi="Arial" w:cs="Arial"/>
           <w:i/>
           <w:iCs/>
         </w:rPr>
-        <w:t>Ethologica</w:t>
-      </w:r>
-      <w:proofErr w:type="spellEnd"/>
+        <w:t>Psychological Science</w:t>
+      </w:r>
       <w:r>
         <w:rPr>
           <w:rFonts w:ascii="Arial" w:hAnsi="Arial" w:cs="Arial"/>
@@ -3758,13 +3708,13 @@
           <w:i/>
           <w:iCs/>
         </w:rPr>
-        <w:t>22</w:t>
-      </w:r>
-      <w:r>
-        <w:rPr>
-          <w:rFonts w:ascii="Arial" w:hAnsi="Arial" w:cs="Arial"/>
-        </w:rPr>
-        <w:t>(1), 73–77. https://doi.org/10.1007/s10211-019-00308-8</w:t>
+        <w:t>17</w:t>
+      </w:r>
+      <w:r>
+        <w:rPr>
+          <w:rFonts w:ascii="Arial" w:hAnsi="Arial" w:cs="Arial"/>
+        </w:rPr>
+        <w:t>(7), 557–561. https://doi.org/10.1111/j.1467-9280.2006.01743.x</w:t>
       </w:r>
     </w:p>
     <w:p>
@@ -3774,33 +3724,11 @@
           <w:rFonts w:ascii="Arial" w:hAnsi="Arial" w:cs="Arial"/>
         </w:rPr>
       </w:pPr>
-      <w:proofErr w:type="spellStart"/>
-      <w:r>
-        <w:rPr>
-          <w:rFonts w:ascii="Arial" w:hAnsi="Arial" w:cs="Arial"/>
-        </w:rPr>
-        <w:t>Deecke</w:t>
-      </w:r>
-      <w:proofErr w:type="spellEnd"/>
-      <w:r>
-        <w:rPr>
-          <w:rFonts w:ascii="Arial" w:hAnsi="Arial" w:cs="Arial"/>
-        </w:rPr>
-        <w:t xml:space="preserve">, V. B., Ford, J. K. B., &amp; Spong, P. (2000). Dialect </w:t>
-      </w:r>
-      <w:proofErr w:type="gramStart"/>
-      <w:r>
-        <w:rPr>
-          <w:rFonts w:ascii="Arial" w:hAnsi="Arial" w:cs="Arial"/>
-        </w:rPr>
-        <w:t>change</w:t>
-      </w:r>
-      <w:proofErr w:type="gramEnd"/>
-      <w:r>
-        <w:rPr>
-          <w:rFonts w:ascii="Arial" w:hAnsi="Arial" w:cs="Arial"/>
-        </w:rPr>
-        <w:t xml:space="preserve"> in resident killer whales: Implications for vocal learning and cultural transmission. </w:t>
+      <w:r>
+        <w:rPr>
+          <w:rFonts w:ascii="Arial" w:hAnsi="Arial" w:cs="Arial"/>
+        </w:rPr>
+        <w:t xml:space="preserve">Hile, A. G., Plummer, T. K., &amp; Striedter, G. F. (2000). Male vocal imitation produces call convergence during pair bonding in budgerigars, </w:t>
       </w:r>
       <w:r>
         <w:rPr>
@@ -3808,18 +3736,22 @@
           <w:i/>
           <w:iCs/>
         </w:rPr>
-        <w:t xml:space="preserve">Animal </w:t>
-      </w:r>
-      <w:proofErr w:type="spellStart"/>
+        <w:t>Melopsittacus undulatus</w:t>
+      </w:r>
+      <w:r>
+        <w:rPr>
+          <w:rFonts w:ascii="Arial" w:hAnsi="Arial" w:cs="Arial"/>
+        </w:rPr>
+        <w:t xml:space="preserve">. </w:t>
+      </w:r>
       <w:r>
         <w:rPr>
           <w:rFonts w:ascii="Arial" w:hAnsi="Arial" w:cs="Arial"/>
           <w:i/>
           <w:iCs/>
         </w:rPr>
-        <w:t>Behaviour</w:t>
-      </w:r>
-      <w:proofErr w:type="spellEnd"/>
+        <w:t>Animal Behaviour</w:t>
+      </w:r>
       <w:r>
         <w:rPr>
           <w:rFonts w:ascii="Arial" w:hAnsi="Arial" w:cs="Arial"/>
@@ -3832,13 +3764,13 @@
           <w:i/>
           <w:iCs/>
         </w:rPr>
-        <w:t>60</w:t>
-      </w:r>
-      <w:r>
-        <w:rPr>
-          <w:rFonts w:ascii="Arial" w:hAnsi="Arial" w:cs="Arial"/>
-        </w:rPr>
-        <w:t>(5), 629–638. https://doi.org/10.1006/anbe.2000.1454</w:t>
+        <w:t>59</w:t>
+      </w:r>
+      <w:r>
+        <w:rPr>
+          <w:rFonts w:ascii="Arial" w:hAnsi="Arial" w:cs="Arial"/>
+        </w:rPr>
+        <w:t>(6), 1209–1218. https://doi.org/10.1006/anbe.1999.1438</w:t>
       </w:r>
     </w:p>
     <w:p>
@@ -3852,7 +3784,7 @@
         <w:rPr>
           <w:rFonts w:ascii="Arial" w:hAnsi="Arial" w:cs="Arial"/>
         </w:rPr>
-        <w:t xml:space="preserve">Freeberg, T. M. (2006). Social Complexity Can Drive Vocal Complexity: Group Size Influences Vocal Information in Carolina Chickadees. </w:t>
+        <w:t xml:space="preserve">Janik, V. M., &amp; Sayigh, L. S. (2013). Communication in bottlenose dolphins: 50 years of signature whistle research. </w:t>
       </w:r>
       <w:r>
         <w:rPr>
@@ -3860,7 +3792,7 @@
           <w:i/>
           <w:iCs/>
         </w:rPr>
-        <w:t>Psychological Science</w:t>
+        <w:t>Journal of Comparative Physiology A</w:t>
       </w:r>
       <w:r>
         <w:rPr>
@@ -3874,13 +3806,13 @@
           <w:i/>
           <w:iCs/>
         </w:rPr>
-        <w:t>17</w:t>
-      </w:r>
-      <w:r>
-        <w:rPr>
-          <w:rFonts w:ascii="Arial" w:hAnsi="Arial" w:cs="Arial"/>
-        </w:rPr>
-        <w:t>(7), 557–561. https://doi.org/10.1111/j.1467-9280.2006.01743.x</w:t>
+        <w:t>199</w:t>
+      </w:r>
+      <w:r>
+        <w:rPr>
+          <w:rFonts w:ascii="Arial" w:hAnsi="Arial" w:cs="Arial"/>
+        </w:rPr>
+        <w:t>(6), 479–489. https://doi.org/10.1007/s00359-013-0817-7</w:t>
       </w:r>
     </w:p>
     <w:p>
@@ -3894,21 +3826,7 @@
         <w:rPr>
           <w:rFonts w:ascii="Arial" w:hAnsi="Arial" w:cs="Arial"/>
         </w:rPr>
-        <w:t xml:space="preserve">Hile, A. G., Plummer, T. K., &amp; </w:t>
-      </w:r>
-      <w:proofErr w:type="spellStart"/>
-      <w:r>
-        <w:rPr>
-          <w:rFonts w:ascii="Arial" w:hAnsi="Arial" w:cs="Arial"/>
-        </w:rPr>
-        <w:t>Striedter</w:t>
-      </w:r>
-      <w:proofErr w:type="spellEnd"/>
-      <w:r>
-        <w:rPr>
-          <w:rFonts w:ascii="Arial" w:hAnsi="Arial" w:cs="Arial"/>
-        </w:rPr>
-        <w:t xml:space="preserve">, G. F. (2000). Male vocal imitation produces call convergence during pair bonding in budgerigars, </w:t>
+        <w:t xml:space="preserve">Janik, V. M., Sayigh, L. S., &amp; Wells, R. S. (2006). Signature whistle shape conveys identity information to bottlenose dolphins. </w:t>
       </w:r>
       <w:r>
         <w:rPr>
@@ -3916,13 +3834,13 @@
           <w:i/>
           <w:iCs/>
         </w:rPr>
-        <w:t>Melopsittacus undulatus</w:t>
-      </w:r>
-      <w:r>
-        <w:rPr>
-          <w:rFonts w:ascii="Arial" w:hAnsi="Arial" w:cs="Arial"/>
-        </w:rPr>
-        <w:t xml:space="preserve">. </w:t>
+        <w:t>PNAS</w:t>
+      </w:r>
+      <w:r>
+        <w:rPr>
+          <w:rFonts w:ascii="Arial" w:hAnsi="Arial" w:cs="Arial"/>
+        </w:rPr>
+        <w:t xml:space="preserve">, </w:t>
       </w:r>
       <w:r>
         <w:rPr>
@@ -3930,18 +3848,36 @@
           <w:i/>
           <w:iCs/>
         </w:rPr>
-        <w:t xml:space="preserve">Animal </w:t>
-      </w:r>
-      <w:proofErr w:type="spellStart"/>
+        <w:t>103</w:t>
+      </w:r>
+      <w:r>
+        <w:rPr>
+          <w:rFonts w:ascii="Arial" w:hAnsi="Arial" w:cs="Arial"/>
+        </w:rPr>
+        <w:t>(21), 8293–8297.</w:t>
+      </w:r>
+    </w:p>
+    <w:p>
+      <w:pPr>
+        <w:pStyle w:val="Bibliography"/>
+        <w:rPr>
+          <w:rFonts w:ascii="Arial" w:hAnsi="Arial" w:cs="Arial"/>
+        </w:rPr>
+      </w:pPr>
+      <w:r>
+        <w:rPr>
+          <w:rFonts w:ascii="Arial" w:hAnsi="Arial" w:cs="Arial"/>
+        </w:rPr>
+        <w:t xml:space="preserve">Janik, V. M., &amp; Slater, P. J. B. (2000). The different roles of social learning in vocal communication. </w:t>
+      </w:r>
       <w:r>
         <w:rPr>
           <w:rFonts w:ascii="Arial" w:hAnsi="Arial" w:cs="Arial"/>
           <w:i/>
           <w:iCs/>
         </w:rPr>
-        <w:t>Behaviour</w:t>
-      </w:r>
-      <w:proofErr w:type="spellEnd"/>
+        <w:t>Animal Behaviour</w:t>
+      </w:r>
       <w:r>
         <w:rPr>
           <w:rFonts w:ascii="Arial" w:hAnsi="Arial" w:cs="Arial"/>
@@ -3954,13 +3890,13 @@
           <w:i/>
           <w:iCs/>
         </w:rPr>
-        <w:t>59</w:t>
-      </w:r>
-      <w:r>
-        <w:rPr>
-          <w:rFonts w:ascii="Arial" w:hAnsi="Arial" w:cs="Arial"/>
-        </w:rPr>
-        <w:t>(6), 1209–1218. https://doi.org/10.1006/anbe.1999.1438</w:t>
+        <w:t>60</w:t>
+      </w:r>
+      <w:r>
+        <w:rPr>
+          <w:rFonts w:ascii="Arial" w:hAnsi="Arial" w:cs="Arial"/>
+        </w:rPr>
+        <w:t>(1), 1–11. https://doi.org/10.1006/anbe.2000.1410</w:t>
       </w:r>
     </w:p>
     <w:p>
@@ -3974,21 +3910,7 @@
         <w:rPr>
           <w:rFonts w:ascii="Arial" w:hAnsi="Arial" w:cs="Arial"/>
         </w:rPr>
-        <w:t xml:space="preserve">Janik, V. M., &amp; </w:t>
-      </w:r>
-      <w:proofErr w:type="spellStart"/>
-      <w:r>
-        <w:rPr>
-          <w:rFonts w:ascii="Arial" w:hAnsi="Arial" w:cs="Arial"/>
-        </w:rPr>
-        <w:t>Sayigh</w:t>
-      </w:r>
-      <w:proofErr w:type="spellEnd"/>
-      <w:r>
-        <w:rPr>
-          <w:rFonts w:ascii="Arial" w:hAnsi="Arial" w:cs="Arial"/>
-        </w:rPr>
-        <w:t xml:space="preserve">, L. S. (2013). Communication in bottlenose dolphins: 50 years of signature whistle research. </w:t>
+        <w:t xml:space="preserve">Keen, S. C., Odom, K. J., Webster, M. S., Kohn, G. M., Wright, T. F., &amp; Araya-Salas, M. (2021). A machine learning approach for classifying and quantifying acoustic diversity. </w:t>
       </w:r>
       <w:r>
         <w:rPr>
@@ -3996,7 +3918,7 @@
           <w:i/>
           <w:iCs/>
         </w:rPr>
-        <w:t>Journal of Comparative Physiology A</w:t>
+        <w:t>Methods in Ecology and Evolution</w:t>
       </w:r>
       <w:r>
         <w:rPr>
@@ -4010,13 +3932,13 @@
           <w:i/>
           <w:iCs/>
         </w:rPr>
-        <w:t>199</w:t>
-      </w:r>
-      <w:r>
-        <w:rPr>
-          <w:rFonts w:ascii="Arial" w:hAnsi="Arial" w:cs="Arial"/>
-        </w:rPr>
-        <w:t>(6), 479–489. https://doi.org/10.1007/s00359-013-0817-7</w:t>
+        <w:t>12</w:t>
+      </w:r>
+      <w:r>
+        <w:rPr>
+          <w:rFonts w:ascii="Arial" w:hAnsi="Arial" w:cs="Arial"/>
+        </w:rPr>
+        <w:t>(7), 1213–1225. https://doi.org/10.1111/2041-210X.13599</w:t>
       </w:r>
     </w:p>
     <w:p>
@@ -4030,35 +3952,7 @@
         <w:rPr>
           <w:rFonts w:ascii="Arial" w:hAnsi="Arial" w:cs="Arial"/>
         </w:rPr>
-        <w:t xml:space="preserve">Janik, V. M., </w:t>
-      </w:r>
-      <w:proofErr w:type="spellStart"/>
-      <w:r>
-        <w:rPr>
-          <w:rFonts w:ascii="Arial" w:hAnsi="Arial" w:cs="Arial"/>
-        </w:rPr>
-        <w:t>Sayigh</w:t>
-      </w:r>
-      <w:proofErr w:type="spellEnd"/>
-      <w:r>
-        <w:rPr>
-          <w:rFonts w:ascii="Arial" w:hAnsi="Arial" w:cs="Arial"/>
-        </w:rPr>
-        <w:t xml:space="preserve">, L. S., &amp; Wells, R. S. (2006). </w:t>
-      </w:r>
-      <w:proofErr w:type="gramStart"/>
-      <w:r>
-        <w:rPr>
-          <w:rFonts w:ascii="Arial" w:hAnsi="Arial" w:cs="Arial"/>
-        </w:rPr>
-        <w:t>Signature</w:t>
-      </w:r>
-      <w:proofErr w:type="gramEnd"/>
-      <w:r>
-        <w:rPr>
-          <w:rFonts w:ascii="Arial" w:hAnsi="Arial" w:cs="Arial"/>
-        </w:rPr>
-        <w:t xml:space="preserve"> whistle shape conveys identity information to bottlenose dolphins. </w:t>
+        <w:t xml:space="preserve">Kershenbaum, A. (2014). Entropy rate as a measure of animal vocal complexity. </w:t>
       </w:r>
       <w:r>
         <w:rPr>
@@ -4066,7 +3960,7 @@
           <w:i/>
           <w:iCs/>
         </w:rPr>
-        <w:t>PNAS</w:t>
+        <w:t>Bioacoustics</w:t>
       </w:r>
       <w:r>
         <w:rPr>
@@ -4080,13 +3974,13 @@
           <w:i/>
           <w:iCs/>
         </w:rPr>
-        <w:t>103</w:t>
-      </w:r>
-      <w:r>
-        <w:rPr>
-          <w:rFonts w:ascii="Arial" w:hAnsi="Arial" w:cs="Arial"/>
-        </w:rPr>
-        <w:t>(21), 8293–8297.</w:t>
+        <w:t>23</w:t>
+      </w:r>
+      <w:r>
+        <w:rPr>
+          <w:rFonts w:ascii="Arial" w:hAnsi="Arial" w:cs="Arial"/>
+        </w:rPr>
+        <w:t>(3), 195–208. https://doi.org/10.1080/09524622.2013.850040</w:t>
       </w:r>
     </w:p>
     <w:p>
@@ -4100,7 +3994,7 @@
         <w:rPr>
           <w:rFonts w:ascii="Arial" w:hAnsi="Arial" w:cs="Arial"/>
         </w:rPr>
-        <w:t xml:space="preserve">Janik, V. M., &amp; Slater, P. J. B. (2000). The different roles of social learning in vocal communication. </w:t>
+        <w:t xml:space="preserve">Kershenbaum, A., &amp; Garland, E. C. (2015). Quantifying similarity in animal vocal sequences: Which metric performs best? </w:t>
       </w:r>
       <w:r>
         <w:rPr>
@@ -4108,23 +4002,42 @@
           <w:i/>
           <w:iCs/>
         </w:rPr>
-        <w:t xml:space="preserve">Animal </w:t>
-      </w:r>
-      <w:proofErr w:type="spellStart"/>
+        <w:t>Methods in Ecology and Evolution</w:t>
+      </w:r>
+      <w:r>
+        <w:rPr>
+          <w:rFonts w:ascii="Arial" w:hAnsi="Arial" w:cs="Arial"/>
+        </w:rPr>
+        <w:t xml:space="preserve">, </w:t>
+      </w:r>
       <w:r>
         <w:rPr>
           <w:rFonts w:ascii="Arial" w:hAnsi="Arial" w:cs="Arial"/>
           <w:i/>
           <w:iCs/>
         </w:rPr>
-        <w:t>Behaviour</w:t>
-      </w:r>
-      <w:proofErr w:type="spellEnd"/>
-      <w:r>
-        <w:rPr>
-          <w:rFonts w:ascii="Arial" w:hAnsi="Arial" w:cs="Arial"/>
-        </w:rPr>
-        <w:t xml:space="preserve">, </w:t>
+        <w:t>6</w:t>
+      </w:r>
+      <w:r>
+        <w:rPr>
+          <w:rFonts w:ascii="Arial" w:hAnsi="Arial" w:cs="Arial"/>
+        </w:rPr>
+        <w:t>(12), 1452–1461. https://doi.org/10.1111/2041-210X.12433</w:t>
+      </w:r>
+    </w:p>
+    <w:p>
+      <w:pPr>
+        <w:pStyle w:val="Bibliography"/>
+        <w:rPr>
+          <w:rFonts w:ascii="Arial" w:hAnsi="Arial" w:cs="Arial"/>
+        </w:rPr>
+      </w:pPr>
+      <w:r>
+        <w:rPr>
+          <w:rFonts w:ascii="Arial" w:hAnsi="Arial" w:cs="Arial"/>
+        </w:rPr>
+        <w:lastRenderedPageBreak/>
+        <w:t xml:space="preserve">Kershenbaum, A., Ilany, A., Blaustein, L., &amp; Geffen, E. (2012). Syntactic structure and geographical dialects in the songs of male rock hyraxes. </w:t>
       </w:r>
       <w:r>
         <w:rPr>
@@ -4132,27 +4045,13 @@
           <w:i/>
           <w:iCs/>
         </w:rPr>
-        <w:t>60</w:t>
-      </w:r>
-      <w:r>
-        <w:rPr>
-          <w:rFonts w:ascii="Arial" w:hAnsi="Arial" w:cs="Arial"/>
-        </w:rPr>
-        <w:t>(1), 1–11. https://doi.org/10.1006/anbe.2000.1410</w:t>
-      </w:r>
-    </w:p>
-    <w:p>
-      <w:pPr>
-        <w:pStyle w:val="Bibliography"/>
-        <w:rPr>
-          <w:rFonts w:ascii="Arial" w:hAnsi="Arial" w:cs="Arial"/>
-        </w:rPr>
-      </w:pPr>
-      <w:r>
-        <w:rPr>
-          <w:rFonts w:ascii="Arial" w:hAnsi="Arial" w:cs="Arial"/>
-        </w:rPr>
-        <w:t xml:space="preserve">Keen, S. C., Odom, K. J., Webster, M. S., Kohn, G. M., Wright, T. F., &amp; Araya-Salas, M. (2021). A machine learning approach for classifying and quantifying acoustic diversity. </w:t>
+        <w:t>Proceedings of the Royal Society B: Biological Sciences</w:t>
+      </w:r>
+      <w:r>
+        <w:rPr>
+          <w:rFonts w:ascii="Arial" w:hAnsi="Arial" w:cs="Arial"/>
+        </w:rPr>
+        <w:t xml:space="preserve">, </w:t>
       </w:r>
       <w:r>
         <w:rPr>
@@ -4160,13 +4059,27 @@
           <w:i/>
           <w:iCs/>
         </w:rPr>
-        <w:t>Methods in Ecology and Evolution</w:t>
-      </w:r>
-      <w:r>
-        <w:rPr>
-          <w:rFonts w:ascii="Arial" w:hAnsi="Arial" w:cs="Arial"/>
-        </w:rPr>
-        <w:t xml:space="preserve">, </w:t>
+        <w:t>279</w:t>
+      </w:r>
+      <w:r>
+        <w:rPr>
+          <w:rFonts w:ascii="Arial" w:hAnsi="Arial" w:cs="Arial"/>
+        </w:rPr>
+        <w:t>(1740), 2974. https://doi.org/10.1098/rspb.2012.0322</w:t>
+      </w:r>
+    </w:p>
+    <w:p>
+      <w:pPr>
+        <w:pStyle w:val="Bibliography"/>
+        <w:rPr>
+          <w:rFonts w:ascii="Arial" w:hAnsi="Arial" w:cs="Arial"/>
+        </w:rPr>
+      </w:pPr>
+      <w:r>
+        <w:rPr>
+          <w:rFonts w:ascii="Arial" w:hAnsi="Arial" w:cs="Arial"/>
+        </w:rPr>
+        <w:t xml:space="preserve">MacDougall-Shackleton, E. A., &amp; MacDougall-Shackleton, S. A. (2001). Cultural and Genetic Evolution in Mountain White-Crowned Sparrows: Song Dialects Are Associated with Population Structure. </w:t>
       </w:r>
       <w:r>
         <w:rPr>
@@ -4174,35 +4087,13 @@
           <w:i/>
           <w:iCs/>
         </w:rPr>
-        <w:t>12</w:t>
-      </w:r>
-      <w:r>
-        <w:rPr>
-          <w:rFonts w:ascii="Arial" w:hAnsi="Arial" w:cs="Arial"/>
-        </w:rPr>
-        <w:t>(7), 1213–1225. https://doi.org/10.1111/2041-210X.13599</w:t>
-      </w:r>
-    </w:p>
-    <w:p>
-      <w:pPr>
-        <w:pStyle w:val="Bibliography"/>
-        <w:rPr>
-          <w:rFonts w:ascii="Arial" w:hAnsi="Arial" w:cs="Arial"/>
-        </w:rPr>
-      </w:pPr>
-      <w:proofErr w:type="spellStart"/>
-      <w:r>
-        <w:rPr>
-          <w:rFonts w:ascii="Arial" w:hAnsi="Arial" w:cs="Arial"/>
-        </w:rPr>
-        <w:t>Kershenbaum</w:t>
-      </w:r>
-      <w:proofErr w:type="spellEnd"/>
-      <w:r>
-        <w:rPr>
-          <w:rFonts w:ascii="Arial" w:hAnsi="Arial" w:cs="Arial"/>
-        </w:rPr>
-        <w:t xml:space="preserve">, A. (2014). Entropy rate as a measure of animal vocal complexity. </w:t>
+        <w:t>Evolution</w:t>
+      </w:r>
+      <w:r>
+        <w:rPr>
+          <w:rFonts w:ascii="Arial" w:hAnsi="Arial" w:cs="Arial"/>
+        </w:rPr>
+        <w:t xml:space="preserve">, </w:t>
       </w:r>
       <w:r>
         <w:rPr>
@@ -4210,13 +4101,27 @@
           <w:i/>
           <w:iCs/>
         </w:rPr>
-        <w:t>Bioacoustics</w:t>
-      </w:r>
-      <w:r>
-        <w:rPr>
-          <w:rFonts w:ascii="Arial" w:hAnsi="Arial" w:cs="Arial"/>
-        </w:rPr>
-        <w:t xml:space="preserve">, </w:t>
+        <w:t>55</w:t>
+      </w:r>
+      <w:r>
+        <w:rPr>
+          <w:rFonts w:ascii="Arial" w:hAnsi="Arial" w:cs="Arial"/>
+        </w:rPr>
+        <w:t>(12), 2568–2575. https://doi.org/10.1111/j.0014-3820.2001.tb00769.x</w:t>
+      </w:r>
+    </w:p>
+    <w:p>
+      <w:pPr>
+        <w:pStyle w:val="Bibliography"/>
+        <w:rPr>
+          <w:rFonts w:ascii="Arial" w:hAnsi="Arial" w:cs="Arial"/>
+        </w:rPr>
+      </w:pPr>
+      <w:r>
+        <w:rPr>
+          <w:rFonts w:ascii="Arial" w:hAnsi="Arial" w:cs="Arial"/>
+        </w:rPr>
+        <w:t xml:space="preserve">McDonald, M. A., Mesnick, S. L., &amp; Hildebrand, J. A. (2006). Biogeographic characterization of blue whale song worldwide: Using song to identify populations. </w:t>
       </w:r>
       <w:r>
         <w:rPr>
@@ -4224,35 +4129,13 @@
           <w:i/>
           <w:iCs/>
         </w:rPr>
-        <w:t>23</w:t>
-      </w:r>
-      <w:r>
-        <w:rPr>
-          <w:rFonts w:ascii="Arial" w:hAnsi="Arial" w:cs="Arial"/>
-        </w:rPr>
-        <w:t>(3), 195–208. https://doi.org/10.1080/09524622.2013.850040</w:t>
-      </w:r>
-    </w:p>
-    <w:p>
-      <w:pPr>
-        <w:pStyle w:val="Bibliography"/>
-        <w:rPr>
-          <w:rFonts w:ascii="Arial" w:hAnsi="Arial" w:cs="Arial"/>
-        </w:rPr>
-      </w:pPr>
-      <w:proofErr w:type="spellStart"/>
-      <w:r>
-        <w:rPr>
-          <w:rFonts w:ascii="Arial" w:hAnsi="Arial" w:cs="Arial"/>
-        </w:rPr>
-        <w:t>Kershenbaum</w:t>
-      </w:r>
-      <w:proofErr w:type="spellEnd"/>
-      <w:r>
-        <w:rPr>
-          <w:rFonts w:ascii="Arial" w:hAnsi="Arial" w:cs="Arial"/>
-        </w:rPr>
-        <w:t xml:space="preserve">, A., &amp; Garland, E. C. (2015). Quantifying similarity in animal vocal sequences: Which metric performs best? </w:t>
+        <w:t>Journal of Cetacean Research and Management</w:t>
+      </w:r>
+      <w:r>
+        <w:rPr>
+          <w:rFonts w:ascii="Arial" w:hAnsi="Arial" w:cs="Arial"/>
+        </w:rPr>
+        <w:t xml:space="preserve">, </w:t>
       </w:r>
       <w:r>
         <w:rPr>
@@ -4260,13 +4143,27 @@
           <w:i/>
           <w:iCs/>
         </w:rPr>
-        <w:t>Methods in Ecology and Evolution</w:t>
-      </w:r>
-      <w:r>
-        <w:rPr>
-          <w:rFonts w:ascii="Arial" w:hAnsi="Arial" w:cs="Arial"/>
-        </w:rPr>
-        <w:t xml:space="preserve">, </w:t>
+        <w:t>8</w:t>
+      </w:r>
+      <w:r>
+        <w:rPr>
+          <w:rFonts w:ascii="Arial" w:hAnsi="Arial" w:cs="Arial"/>
+        </w:rPr>
+        <w:t>(1), 55–65.</w:t>
+      </w:r>
+    </w:p>
+    <w:p>
+      <w:pPr>
+        <w:pStyle w:val="Bibliography"/>
+        <w:rPr>
+          <w:rFonts w:ascii="Arial" w:hAnsi="Arial" w:cs="Arial"/>
+        </w:rPr>
+      </w:pPr>
+      <w:r>
+        <w:rPr>
+          <w:rFonts w:ascii="Arial" w:hAnsi="Arial" w:cs="Arial"/>
+        </w:rPr>
+        <w:t xml:space="preserve">Nowicki, S., &amp; Searcy, W. A. (2014). The evolution of vocal learning. </w:t>
       </w:r>
       <w:r>
         <w:rPr>
@@ -4274,36 +4171,13 @@
           <w:i/>
           <w:iCs/>
         </w:rPr>
-        <w:t>6</w:t>
-      </w:r>
-      <w:r>
-        <w:rPr>
-          <w:rFonts w:ascii="Arial" w:hAnsi="Arial" w:cs="Arial"/>
-        </w:rPr>
-        <w:t>(12), 1452–1461. https://doi.org/10.1111/2041-210X.12433</w:t>
-      </w:r>
-    </w:p>
-    <w:p>
-      <w:pPr>
-        <w:pStyle w:val="Bibliography"/>
-        <w:rPr>
-          <w:rFonts w:ascii="Arial" w:hAnsi="Arial" w:cs="Arial"/>
-        </w:rPr>
-      </w:pPr>
-      <w:proofErr w:type="spellStart"/>
-      <w:r>
-        <w:rPr>
-          <w:rFonts w:ascii="Arial" w:hAnsi="Arial" w:cs="Arial"/>
-        </w:rPr>
-        <w:lastRenderedPageBreak/>
-        <w:t>Kershenbaum</w:t>
-      </w:r>
-      <w:proofErr w:type="spellEnd"/>
-      <w:r>
-        <w:rPr>
-          <w:rFonts w:ascii="Arial" w:hAnsi="Arial" w:cs="Arial"/>
-        </w:rPr>
-        <w:t xml:space="preserve">, A., Ilany, A., Blaustein, L., &amp; Geffen, E. (2012). Syntactic structure and geographical dialects in the songs of male rock hyraxes. </w:t>
+        <w:t>Current Opinion in Neurobiology</w:t>
+      </w:r>
+      <w:r>
+        <w:rPr>
+          <w:rFonts w:ascii="Arial" w:hAnsi="Arial" w:cs="Arial"/>
+        </w:rPr>
+        <w:t xml:space="preserve">, </w:t>
       </w:r>
       <w:r>
         <w:rPr>
@@ -4311,13 +4185,27 @@
           <w:i/>
           <w:iCs/>
         </w:rPr>
-        <w:t>Proceedings of the Royal Society B: Biological Sciences</w:t>
-      </w:r>
-      <w:r>
-        <w:rPr>
-          <w:rFonts w:ascii="Arial" w:hAnsi="Arial" w:cs="Arial"/>
-        </w:rPr>
-        <w:t xml:space="preserve">, </w:t>
+        <w:t>28</w:t>
+      </w:r>
+      <w:r>
+        <w:rPr>
+          <w:rFonts w:ascii="Arial" w:hAnsi="Arial" w:cs="Arial"/>
+        </w:rPr>
+        <w:t>, 48–53. https://doi.org/10.1016/j.conb.2014.06.007</w:t>
+      </w:r>
+    </w:p>
+    <w:p>
+      <w:pPr>
+        <w:pStyle w:val="Bibliography"/>
+        <w:rPr>
+          <w:rFonts w:ascii="Arial" w:hAnsi="Arial" w:cs="Arial"/>
+        </w:rPr>
+      </w:pPr>
+      <w:r>
+        <w:rPr>
+          <w:rFonts w:ascii="Arial" w:hAnsi="Arial" w:cs="Arial"/>
+        </w:rPr>
+        <w:t xml:space="preserve">Sainburg, T., &amp; Gentner, T. Q. (2021). Toward a Computational Neuroethology of Vocal Communication: From Bioacoustics to Neurophysiology, Emerging Tools and Future Directions. </w:t>
       </w:r>
       <w:r>
         <w:rPr>
@@ -4325,27 +4213,13 @@
           <w:i/>
           <w:iCs/>
         </w:rPr>
-        <w:t>279</w:t>
-      </w:r>
-      <w:r>
-        <w:rPr>
-          <w:rFonts w:ascii="Arial" w:hAnsi="Arial" w:cs="Arial"/>
-        </w:rPr>
-        <w:t>(1740), 2974. https://doi.org/10.1098/rspb.2012.0322</w:t>
-      </w:r>
-    </w:p>
-    <w:p>
-      <w:pPr>
-        <w:pStyle w:val="Bibliography"/>
-        <w:rPr>
-          <w:rFonts w:ascii="Arial" w:hAnsi="Arial" w:cs="Arial"/>
-        </w:rPr>
-      </w:pPr>
-      <w:r>
-        <w:rPr>
-          <w:rFonts w:ascii="Arial" w:hAnsi="Arial" w:cs="Arial"/>
-        </w:rPr>
-        <w:t xml:space="preserve">MacDougall-Shackleton, E. A., &amp; MacDougall-Shackleton, S. A. (2001). Cultural and Genetic Evolution in Mountain White-Crowned Sparrows: Song Dialects Are Associated with Population Structure. </w:t>
+        <w:t>Frontiers in Behavioral Neuroscience</w:t>
+      </w:r>
+      <w:r>
+        <w:rPr>
+          <w:rFonts w:ascii="Arial" w:hAnsi="Arial" w:cs="Arial"/>
+        </w:rPr>
+        <w:t xml:space="preserve">, </w:t>
       </w:r>
       <w:r>
         <w:rPr>
@@ -4353,13 +4227,27 @@
           <w:i/>
           <w:iCs/>
         </w:rPr>
-        <w:t>Evolution</w:t>
-      </w:r>
-      <w:r>
-        <w:rPr>
-          <w:rFonts w:ascii="Arial" w:hAnsi="Arial" w:cs="Arial"/>
-        </w:rPr>
-        <w:t xml:space="preserve">, </w:t>
+        <w:t>15</w:t>
+      </w:r>
+      <w:r>
+        <w:rPr>
+          <w:rFonts w:ascii="Arial" w:hAnsi="Arial" w:cs="Arial"/>
+        </w:rPr>
+        <w:t>. https://doi.org/10.3389/fnbeh.2021.811737</w:t>
+      </w:r>
+    </w:p>
+    <w:p>
+      <w:pPr>
+        <w:pStyle w:val="Bibliography"/>
+        <w:rPr>
+          <w:rFonts w:ascii="Arial" w:hAnsi="Arial" w:cs="Arial"/>
+        </w:rPr>
+      </w:pPr>
+      <w:r>
+        <w:rPr>
+          <w:rFonts w:ascii="Arial" w:hAnsi="Arial" w:cs="Arial"/>
+        </w:rPr>
+        <w:t xml:space="preserve">Sawant, S., Arvind, C., Joshi, V., &amp; Robin, V. V. (2022). Spectrogram cross-correlation can be used to measure the complexity of bird vocalizations. </w:t>
       </w:r>
       <w:r>
         <w:rPr>
@@ -4367,27 +4255,13 @@
           <w:i/>
           <w:iCs/>
         </w:rPr>
-        <w:t>55</w:t>
-      </w:r>
-      <w:r>
-        <w:rPr>
-          <w:rFonts w:ascii="Arial" w:hAnsi="Arial" w:cs="Arial"/>
-        </w:rPr>
-        <w:t>(12), 2568–2575. https://doi.org/10.1111/j.0014-3820.2001.tb00769.x</w:t>
-      </w:r>
-    </w:p>
-    <w:p>
-      <w:pPr>
-        <w:pStyle w:val="Bibliography"/>
-        <w:rPr>
-          <w:rFonts w:ascii="Arial" w:hAnsi="Arial" w:cs="Arial"/>
-        </w:rPr>
-      </w:pPr>
-      <w:r>
-        <w:rPr>
-          <w:rFonts w:ascii="Arial" w:hAnsi="Arial" w:cs="Arial"/>
-        </w:rPr>
-        <w:t xml:space="preserve">McDonald, M. A., Mesnick, S. L., &amp; Hildebrand, J. A. (2006). Biogeographic characterization of blue whale song worldwide: Using song to identify populations. </w:t>
+        <w:t>Methods in Ecology and Evolution</w:t>
+      </w:r>
+      <w:r>
+        <w:rPr>
+          <w:rFonts w:ascii="Arial" w:hAnsi="Arial" w:cs="Arial"/>
+        </w:rPr>
+        <w:t xml:space="preserve">, </w:t>
       </w:r>
       <w:r>
         <w:rPr>
@@ -4395,13 +4269,27 @@
           <w:i/>
           <w:iCs/>
         </w:rPr>
-        <w:t>Journal of Cetacean Research and Management</w:t>
-      </w:r>
-      <w:r>
-        <w:rPr>
-          <w:rFonts w:ascii="Arial" w:hAnsi="Arial" w:cs="Arial"/>
-        </w:rPr>
-        <w:t xml:space="preserve">, </w:t>
+        <w:t>13</w:t>
+      </w:r>
+      <w:r>
+        <w:rPr>
+          <w:rFonts w:ascii="Arial" w:hAnsi="Arial" w:cs="Arial"/>
+        </w:rPr>
+        <w:t>(2), 459–472. https://doi.org/10.1111/2041-210X.13765</w:t>
+      </w:r>
+    </w:p>
+    <w:p>
+      <w:pPr>
+        <w:pStyle w:val="Bibliography"/>
+        <w:rPr>
+          <w:rFonts w:ascii="Arial" w:hAnsi="Arial" w:cs="Arial"/>
+        </w:rPr>
+      </w:pPr>
+      <w:r>
+        <w:rPr>
+          <w:rFonts w:ascii="Arial" w:hAnsi="Arial" w:cs="Arial"/>
+        </w:rPr>
+        <w:t xml:space="preserve">Selman, Z. A., &amp; Freeberg, T. M. (2024). Complexity in Chick-a-Dee Calls of Mountain Chickadees (Poecile gambeli): Call Variation Associated With Flock Size and Flight. </w:t>
       </w:r>
       <w:r>
         <w:rPr>
@@ -4409,27 +4297,13 @@
           <w:i/>
           <w:iCs/>
         </w:rPr>
-        <w:t>8</w:t>
-      </w:r>
-      <w:r>
-        <w:rPr>
-          <w:rFonts w:ascii="Arial" w:hAnsi="Arial" w:cs="Arial"/>
-        </w:rPr>
-        <w:t>(1), 55–65.</w:t>
-      </w:r>
-    </w:p>
-    <w:p>
-      <w:pPr>
-        <w:pStyle w:val="Bibliography"/>
-        <w:rPr>
-          <w:rFonts w:ascii="Arial" w:hAnsi="Arial" w:cs="Arial"/>
-        </w:rPr>
-      </w:pPr>
-      <w:r>
-        <w:rPr>
-          <w:rFonts w:ascii="Arial" w:hAnsi="Arial" w:cs="Arial"/>
-        </w:rPr>
-        <w:t xml:space="preserve">Nowicki, S., &amp; Searcy, W. A. (2014). The evolution of vocal learning. </w:t>
+        <w:t>Ethology</w:t>
+      </w:r>
+      <w:r>
+        <w:rPr>
+          <w:rFonts w:ascii="Arial" w:hAnsi="Arial" w:cs="Arial"/>
+        </w:rPr>
+        <w:t xml:space="preserve">, </w:t>
       </w:r>
       <w:r>
         <w:rPr>
@@ -4437,13 +4311,27 @@
           <w:i/>
           <w:iCs/>
         </w:rPr>
-        <w:t>Current Opinion in Neurobiology</w:t>
-      </w:r>
-      <w:r>
-        <w:rPr>
-          <w:rFonts w:ascii="Arial" w:hAnsi="Arial" w:cs="Arial"/>
-        </w:rPr>
-        <w:t xml:space="preserve">, </w:t>
+        <w:t>n/a</w:t>
+      </w:r>
+      <w:r>
+        <w:rPr>
+          <w:rFonts w:ascii="Arial" w:hAnsi="Arial" w:cs="Arial"/>
+        </w:rPr>
+        <w:t>(n/a), e13523. https://doi.org/10.1111/eth.13523</w:t>
+      </w:r>
+    </w:p>
+    <w:p>
+      <w:pPr>
+        <w:pStyle w:val="Bibliography"/>
+        <w:rPr>
+          <w:rFonts w:ascii="Arial" w:hAnsi="Arial" w:cs="Arial"/>
+        </w:rPr>
+      </w:pPr>
+      <w:r>
+        <w:rPr>
+          <w:rFonts w:ascii="Arial" w:hAnsi="Arial" w:cs="Arial"/>
+        </w:rPr>
+        <w:t xml:space="preserve">Sewall, K. B., Young, A. M., &amp; Wright, T. F. (2016). Social calls provide novel insights into the evolution of vocal learning. </w:t>
       </w:r>
       <w:r>
         <w:rPr>
@@ -4451,35 +4339,13 @@
           <w:i/>
           <w:iCs/>
         </w:rPr>
-        <w:t>28</w:t>
-      </w:r>
-      <w:r>
-        <w:rPr>
-          <w:rFonts w:ascii="Arial" w:hAnsi="Arial" w:cs="Arial"/>
-        </w:rPr>
-        <w:t>, 48–53. https://doi.org/10.1016/j.conb.2014.06.007</w:t>
-      </w:r>
-    </w:p>
-    <w:p>
-      <w:pPr>
-        <w:pStyle w:val="Bibliography"/>
-        <w:rPr>
-          <w:rFonts w:ascii="Arial" w:hAnsi="Arial" w:cs="Arial"/>
-        </w:rPr>
-      </w:pPr>
-      <w:proofErr w:type="spellStart"/>
-      <w:r>
-        <w:rPr>
-          <w:rFonts w:ascii="Arial" w:hAnsi="Arial" w:cs="Arial"/>
-        </w:rPr>
-        <w:t>Sainburg</w:t>
-      </w:r>
-      <w:proofErr w:type="spellEnd"/>
-      <w:r>
-        <w:rPr>
-          <w:rFonts w:ascii="Arial" w:hAnsi="Arial" w:cs="Arial"/>
-        </w:rPr>
-        <w:t xml:space="preserve">, T., &amp; Gentner, T. Q. (2021). Toward a Computational Neuroethology of Vocal Communication: From Bioacoustics to Neurophysiology, Emerging Tools and Future Directions. </w:t>
+        <w:t>Animal Behaviour</w:t>
+      </w:r>
+      <w:r>
+        <w:rPr>
+          <w:rFonts w:ascii="Arial" w:hAnsi="Arial" w:cs="Arial"/>
+        </w:rPr>
+        <w:t xml:space="preserve">, </w:t>
       </w:r>
       <w:r>
         <w:rPr>
@@ -4487,13 +4353,27 @@
           <w:i/>
           <w:iCs/>
         </w:rPr>
-        <w:t>Frontiers in Behavioral Neuroscience</w:t>
-      </w:r>
-      <w:r>
-        <w:rPr>
-          <w:rFonts w:ascii="Arial" w:hAnsi="Arial" w:cs="Arial"/>
-        </w:rPr>
-        <w:t xml:space="preserve">, </w:t>
+        <w:t>120</w:t>
+      </w:r>
+      <w:r>
+        <w:rPr>
+          <w:rFonts w:ascii="Arial" w:hAnsi="Arial" w:cs="Arial"/>
+        </w:rPr>
+        <w:t>, 163–172. https://doi.org/10.1016/j.anbehav.2016.07.031</w:t>
+      </w:r>
+    </w:p>
+    <w:p>
+      <w:pPr>
+        <w:pStyle w:val="Bibliography"/>
+        <w:rPr>
+          <w:rFonts w:ascii="Arial" w:hAnsi="Arial" w:cs="Arial"/>
+        </w:rPr>
+      </w:pPr>
+      <w:r>
+        <w:rPr>
+          <w:rFonts w:ascii="Arial" w:hAnsi="Arial" w:cs="Arial"/>
+        </w:rPr>
+        <w:t xml:space="preserve">Smith-Vidaurre, G., Araya-Salas, M., &amp; Wright, T. F. (2020). Individual signatures outweigh social group identity in contact calls of a communally nesting parrot. </w:t>
       </w:r>
       <w:r>
         <w:rPr>
@@ -4501,27 +4381,13 @@
           <w:i/>
           <w:iCs/>
         </w:rPr>
-        <w:t>15</w:t>
-      </w:r>
-      <w:r>
-        <w:rPr>
-          <w:rFonts w:ascii="Arial" w:hAnsi="Arial" w:cs="Arial"/>
-        </w:rPr>
-        <w:t>. https://doi.org/10.3389/fnbeh.2021.811737</w:t>
-      </w:r>
-    </w:p>
-    <w:p>
-      <w:pPr>
-        <w:pStyle w:val="Bibliography"/>
-        <w:rPr>
-          <w:rFonts w:ascii="Arial" w:hAnsi="Arial" w:cs="Arial"/>
-        </w:rPr>
-      </w:pPr>
-      <w:r>
-        <w:rPr>
-          <w:rFonts w:ascii="Arial" w:hAnsi="Arial" w:cs="Arial"/>
-        </w:rPr>
-        <w:t xml:space="preserve">Sawant, S., Arvind, C., Joshi, V., &amp; Robin, V. V. (2022). Spectrogram cross-correlation can be used to measure the complexity of bird vocalizations. </w:t>
+        <w:t>Behavioral Ecology</w:t>
+      </w:r>
+      <w:r>
+        <w:rPr>
+          <w:rFonts w:ascii="Arial" w:hAnsi="Arial" w:cs="Arial"/>
+        </w:rPr>
+        <w:t xml:space="preserve">, </w:t>
       </w:r>
       <w:r>
         <w:rPr>
@@ -4529,13 +4395,27 @@
           <w:i/>
           <w:iCs/>
         </w:rPr>
-        <w:t>Methods in Ecology and Evolution</w:t>
-      </w:r>
-      <w:r>
-        <w:rPr>
-          <w:rFonts w:ascii="Arial" w:hAnsi="Arial" w:cs="Arial"/>
-        </w:rPr>
-        <w:t xml:space="preserve">, </w:t>
+        <w:t>31</w:t>
+      </w:r>
+      <w:r>
+        <w:rPr>
+          <w:rFonts w:ascii="Arial" w:hAnsi="Arial" w:cs="Arial"/>
+        </w:rPr>
+        <w:t>(2), 448–458. https://doi.org/10.1093/beheco/arz202</w:t>
+      </w:r>
+    </w:p>
+    <w:p>
+      <w:pPr>
+        <w:pStyle w:val="Bibliography"/>
+        <w:rPr>
+          <w:rFonts w:ascii="Arial" w:hAnsi="Arial" w:cs="Arial"/>
+        </w:rPr>
+      </w:pPr>
+      <w:r>
+        <w:rPr>
+          <w:rFonts w:ascii="Arial" w:hAnsi="Arial" w:cs="Arial"/>
+        </w:rPr>
+        <w:t xml:space="preserve">Smith-Vidaurre, G., Pérez-Marrufo, V., Hobson, E. A., Salinas-Melgoza, A., &amp; Wright, T. F. (2023). Individual identity information persists in learned calls of introduced parrot populations. </w:t>
       </w:r>
       <w:r>
         <w:rPr>
@@ -4543,69 +4423,13 @@
           <w:i/>
           <w:iCs/>
         </w:rPr>
-        <w:t>13</w:t>
-      </w:r>
-      <w:r>
-        <w:rPr>
-          <w:rFonts w:ascii="Arial" w:hAnsi="Arial" w:cs="Arial"/>
-        </w:rPr>
-        <w:t>(2), 459–472. https://doi.org/10.1111/2041-210X.13765</w:t>
-      </w:r>
-    </w:p>
-    <w:p>
-      <w:pPr>
-        <w:pStyle w:val="Bibliography"/>
-        <w:rPr>
-          <w:rFonts w:ascii="Arial" w:hAnsi="Arial" w:cs="Arial"/>
-        </w:rPr>
-      </w:pPr>
-      <w:r>
-        <w:rPr>
-          <w:rFonts w:ascii="Arial" w:hAnsi="Arial" w:cs="Arial"/>
-        </w:rPr>
-        <w:t>Selman, Z. A., &amp; Freeberg, T. M. (2024). Complexity in Chick-a-Dee Calls of Mountain Chickadees (</w:t>
-      </w:r>
-      <w:proofErr w:type="spellStart"/>
-      <w:r>
-        <w:rPr>
-          <w:rFonts w:ascii="Arial" w:hAnsi="Arial" w:cs="Arial"/>
-        </w:rPr>
-        <w:t>Poecile</w:t>
-      </w:r>
-      <w:proofErr w:type="spellEnd"/>
-      <w:r>
-        <w:rPr>
-          <w:rFonts w:ascii="Arial" w:hAnsi="Arial" w:cs="Arial"/>
-        </w:rPr>
-        <w:t xml:space="preserve"> </w:t>
-      </w:r>
-      <w:proofErr w:type="spellStart"/>
-      <w:r>
-        <w:rPr>
-          <w:rFonts w:ascii="Arial" w:hAnsi="Arial" w:cs="Arial"/>
-        </w:rPr>
-        <w:t>gambeli</w:t>
-      </w:r>
-      <w:proofErr w:type="spellEnd"/>
-      <w:r>
-        <w:rPr>
-          <w:rFonts w:ascii="Arial" w:hAnsi="Arial" w:cs="Arial"/>
-        </w:rPr>
-        <w:t xml:space="preserve">): Call Variation Associated </w:t>
-      </w:r>
-      <w:proofErr w:type="gramStart"/>
-      <w:r>
-        <w:rPr>
-          <w:rFonts w:ascii="Arial" w:hAnsi="Arial" w:cs="Arial"/>
-        </w:rPr>
-        <w:t>With</w:t>
-      </w:r>
-      <w:proofErr w:type="gramEnd"/>
-      <w:r>
-        <w:rPr>
-          <w:rFonts w:ascii="Arial" w:hAnsi="Arial" w:cs="Arial"/>
-        </w:rPr>
-        <w:t xml:space="preserve"> Flock Size and Flight. </w:t>
+        <w:t>PLOS Computational Biology</w:t>
+      </w:r>
+      <w:r>
+        <w:rPr>
+          <w:rFonts w:ascii="Arial" w:hAnsi="Arial" w:cs="Arial"/>
+        </w:rPr>
+        <w:t xml:space="preserve">, </w:t>
       </w:r>
       <w:r>
         <w:rPr>
@@ -4613,13 +4437,27 @@
           <w:i/>
           <w:iCs/>
         </w:rPr>
-        <w:t>Ethology</w:t>
-      </w:r>
-      <w:r>
-        <w:rPr>
-          <w:rFonts w:ascii="Arial" w:hAnsi="Arial" w:cs="Arial"/>
-        </w:rPr>
-        <w:t xml:space="preserve">, </w:t>
+        <w:t>19</w:t>
+      </w:r>
+      <w:r>
+        <w:rPr>
+          <w:rFonts w:ascii="Arial" w:hAnsi="Arial" w:cs="Arial"/>
+        </w:rPr>
+        <w:t>(7), e1011231. https://doi.org/10.1371/journal.pcbi.1011231</w:t>
+      </w:r>
+    </w:p>
+    <w:p>
+      <w:pPr>
+        <w:pStyle w:val="Bibliography"/>
+        <w:rPr>
+          <w:rFonts w:ascii="Arial" w:hAnsi="Arial" w:cs="Arial"/>
+        </w:rPr>
+      </w:pPr>
+      <w:r>
+        <w:rPr>
+          <w:rFonts w:ascii="Arial" w:hAnsi="Arial" w:cs="Arial"/>
+        </w:rPr>
+        <w:t xml:space="preserve">Smith-Vidaurre, G., Perez-Marrufo, V., &amp; Wright, T. F. (2021). Individual vocal signatures show reduced complexity following invasion. </w:t>
       </w:r>
       <w:r>
         <w:rPr>
@@ -4627,182 +4465,8 @@
           <w:i/>
           <w:iCs/>
         </w:rPr>
-        <w:t>n/a</w:t>
-      </w:r>
-      <w:r>
-        <w:rPr>
-          <w:rFonts w:ascii="Arial" w:hAnsi="Arial" w:cs="Arial"/>
-        </w:rPr>
-        <w:t>(n/a), e13523. https://doi.org/10.1111/eth.13523</w:t>
-      </w:r>
-    </w:p>
-    <w:p>
-      <w:pPr>
-        <w:pStyle w:val="Bibliography"/>
-        <w:rPr>
-          <w:rFonts w:ascii="Arial" w:hAnsi="Arial" w:cs="Arial"/>
-        </w:rPr>
-      </w:pPr>
-      <w:r>
-        <w:rPr>
-          <w:rFonts w:ascii="Arial" w:hAnsi="Arial" w:cs="Arial"/>
-        </w:rPr>
-        <w:t xml:space="preserve">Sewall, K. B., Young, A. M., &amp; Wright, T. F. (2016). Social calls provide novel insights into the evolution of vocal learning. </w:t>
-      </w:r>
-      <w:r>
-        <w:rPr>
-          <w:rFonts w:ascii="Arial" w:hAnsi="Arial" w:cs="Arial"/>
-          <w:i/>
-          <w:iCs/>
-        </w:rPr>
-        <w:t xml:space="preserve">Animal </w:t>
-      </w:r>
-      <w:proofErr w:type="spellStart"/>
-      <w:r>
-        <w:rPr>
-          <w:rFonts w:ascii="Arial" w:hAnsi="Arial" w:cs="Arial"/>
-          <w:i/>
-          <w:iCs/>
-        </w:rPr>
-        <w:t>Behaviour</w:t>
-      </w:r>
-      <w:proofErr w:type="spellEnd"/>
-      <w:r>
-        <w:rPr>
-          <w:rFonts w:ascii="Arial" w:hAnsi="Arial" w:cs="Arial"/>
-        </w:rPr>
-        <w:t xml:space="preserve">, </w:t>
-      </w:r>
-      <w:r>
-        <w:rPr>
-          <w:rFonts w:ascii="Arial" w:hAnsi="Arial" w:cs="Arial"/>
-          <w:i/>
-          <w:iCs/>
-        </w:rPr>
-        <w:t>120</w:t>
-      </w:r>
-      <w:r>
-        <w:rPr>
-          <w:rFonts w:ascii="Arial" w:hAnsi="Arial" w:cs="Arial"/>
-        </w:rPr>
-        <w:t>, 163–172. https://doi.org/10.1016/j.anbehav.2016.07.031</w:t>
-      </w:r>
-    </w:p>
-    <w:p>
-      <w:pPr>
-        <w:pStyle w:val="Bibliography"/>
-        <w:rPr>
-          <w:rFonts w:ascii="Arial" w:hAnsi="Arial" w:cs="Arial"/>
-        </w:rPr>
-      </w:pPr>
-      <w:r>
-        <w:rPr>
-          <w:rFonts w:ascii="Arial" w:hAnsi="Arial" w:cs="Arial"/>
-        </w:rPr>
-        <w:t xml:space="preserve">Smith-Vidaurre, G., Araya-Salas, M., &amp; Wright, T. F. (2020). Individual signatures outweigh social group identity in contact calls of a communally nesting parrot. </w:t>
-      </w:r>
-      <w:r>
-        <w:rPr>
-          <w:rFonts w:ascii="Arial" w:hAnsi="Arial" w:cs="Arial"/>
-          <w:i/>
-          <w:iCs/>
-        </w:rPr>
-        <w:t>Behavioral Ecology</w:t>
-      </w:r>
-      <w:r>
-        <w:rPr>
-          <w:rFonts w:ascii="Arial" w:hAnsi="Arial" w:cs="Arial"/>
-        </w:rPr>
-        <w:t xml:space="preserve">, </w:t>
-      </w:r>
-      <w:r>
-        <w:rPr>
-          <w:rFonts w:ascii="Arial" w:hAnsi="Arial" w:cs="Arial"/>
-          <w:i/>
-          <w:iCs/>
-        </w:rPr>
-        <w:t>31</w:t>
-      </w:r>
-      <w:r>
-        <w:rPr>
-          <w:rFonts w:ascii="Arial" w:hAnsi="Arial" w:cs="Arial"/>
-        </w:rPr>
-        <w:t>(2), 448–458. https://doi.org/10.1093/beheco/arz202</w:t>
-      </w:r>
-    </w:p>
-    <w:p>
-      <w:pPr>
-        <w:pStyle w:val="Bibliography"/>
-        <w:rPr>
-          <w:rFonts w:ascii="Arial" w:hAnsi="Arial" w:cs="Arial"/>
-        </w:rPr>
-      </w:pPr>
-      <w:r>
-        <w:rPr>
-          <w:rFonts w:ascii="Arial" w:hAnsi="Arial" w:cs="Arial"/>
-        </w:rPr>
-        <w:t xml:space="preserve">Smith-Vidaurre, G., Pérez-Marrufo, V., Hobson, E. A., Salinas-Melgoza, A., &amp; Wright, T. F. (2023). Individual identity information persists in learned calls of introduced parrot populations. </w:t>
-      </w:r>
-      <w:r>
-        <w:rPr>
-          <w:rFonts w:ascii="Arial" w:hAnsi="Arial" w:cs="Arial"/>
-          <w:i/>
-          <w:iCs/>
-        </w:rPr>
-        <w:t>PLOS Computational Biology</w:t>
-      </w:r>
-      <w:r>
-        <w:rPr>
-          <w:rFonts w:ascii="Arial" w:hAnsi="Arial" w:cs="Arial"/>
-        </w:rPr>
-        <w:t xml:space="preserve">, </w:t>
-      </w:r>
-      <w:r>
-        <w:rPr>
-          <w:rFonts w:ascii="Arial" w:hAnsi="Arial" w:cs="Arial"/>
-          <w:i/>
-          <w:iCs/>
-        </w:rPr>
-        <w:t>19</w:t>
-      </w:r>
-      <w:r>
-        <w:rPr>
-          <w:rFonts w:ascii="Arial" w:hAnsi="Arial" w:cs="Arial"/>
-        </w:rPr>
-        <w:t>(7), e1011231. https://doi.org/10.1371/journal.pcbi.1011231</w:t>
-      </w:r>
-    </w:p>
-    <w:p>
-      <w:pPr>
-        <w:pStyle w:val="Bibliography"/>
-        <w:rPr>
-          <w:rFonts w:ascii="Arial" w:hAnsi="Arial" w:cs="Arial"/>
-        </w:rPr>
-      </w:pPr>
-      <w:r>
-        <w:rPr>
-          <w:rFonts w:ascii="Arial" w:hAnsi="Arial" w:cs="Arial"/>
-        </w:rPr>
-        <w:t xml:space="preserve">Smith-Vidaurre, G., Perez-Marrufo, V., &amp; Wright, T. F. (2021). Individual vocal signatures show reduced complexity following invasion. </w:t>
-      </w:r>
-      <w:r>
-        <w:rPr>
-          <w:rFonts w:ascii="Arial" w:hAnsi="Arial" w:cs="Arial"/>
-          <w:i/>
-          <w:iCs/>
-        </w:rPr>
-        <w:t xml:space="preserve">Animal </w:t>
-      </w:r>
-      <w:proofErr w:type="spellStart"/>
-      <w:r>
-        <w:rPr>
-          <w:rFonts w:ascii="Arial" w:hAnsi="Arial" w:cs="Arial"/>
-          <w:i/>
-          <w:iCs/>
-        </w:rPr>
-        <w:t>Behaviour</w:t>
-      </w:r>
-      <w:proofErr w:type="spellEnd"/>
+        <w:t>Animal Behaviour</w:t>
+      </w:r>
       <w:r>
         <w:rPr>
           <w:rFonts w:ascii="Arial" w:hAnsi="Arial" w:cs="Arial"/>
@@ -5082,21 +4746,7 @@
         <w:rPr>
           <w:rFonts w:ascii="Arial" w:hAnsi="Arial" w:cs="Arial"/>
         </w:rPr>
-        <w:t xml:space="preserve">Analysis questions: How similar are an individual’s calls to </w:t>
-      </w:r>
-      <w:proofErr w:type="gramStart"/>
-      <w:r>
-        <w:rPr>
-          <w:rFonts w:ascii="Arial" w:hAnsi="Arial" w:cs="Arial"/>
-        </w:rPr>
-        <w:t>its</w:t>
-      </w:r>
-      <w:proofErr w:type="gramEnd"/>
-      <w:r>
-        <w:rPr>
-          <w:rFonts w:ascii="Arial" w:hAnsi="Arial" w:cs="Arial"/>
-        </w:rPr>
-        <w:t xml:space="preserve"> own calls, compared to calls of other individuals? And the same for groups</w:t>
+        <w:t>Analysis questions: How similar are an individual’s calls to its own calls, compared to calls of other individuals? And the same for groups</w:t>
       </w:r>
     </w:p>
     <w:p>
@@ -5648,7 +5298,24 @@
       </w:r>
     </w:p>
   </w:comment>
-  <w:comment w:id="19" w:author="Coppinger, Brittany" w:date="2024-12-09T12:05:00Z" w:initials="BC">
+  <w:comment w:id="19" w:author="Smith Vidaurre, Grace" w:date="2024-12-18T13:50:00Z" w:initials="GSV">
+    <w:p>
+      <w:r>
+        <w:rPr>
+          <w:rStyle w:val="CommentReference"/>
+        </w:rPr>
+        <w:annotationRef/>
+      </w:r>
+      <w:r>
+        <w:rPr>
+          <w:sz w:val="20"/>
+          <w:szCs w:val="20"/>
+        </w:rPr>
+        <w:t>TKTK we need more wording around information theory directly linking signaler encoding to receiver decoding in particular social environments</w:t>
+      </w:r>
+    </w:p>
+  </w:comment>
+  <w:comment w:id="20" w:author="Coppinger, Brittany" w:date="2024-12-09T12:05:00Z" w:initials="BC">
     <w:p>
       <w:pPr>
         <w:pStyle w:val="CommentText"/>
@@ -5664,7 +5331,7 @@
       </w:r>
     </w:p>
   </w:comment>
-  <w:comment w:id="20" w:author="Coppinger, Brittany" w:date="2024-12-09T12:04:00Z" w:initials="BC">
+  <w:comment w:id="21" w:author="Coppinger, Brittany" w:date="2024-12-09T12:04:00Z" w:initials="BC">
     <w:p>
       <w:pPr>
         <w:pStyle w:val="CommentText"/>
@@ -5680,7 +5347,7 @@
       </w:r>
     </w:p>
   </w:comment>
-  <w:comment w:id="21" w:author="Coppinger, Brittany" w:date="2024-12-09T12:03:00Z" w:initials="BC">
+  <w:comment w:id="22" w:author="Coppinger, Brittany" w:date="2024-12-09T12:03:00Z" w:initials="BC">
     <w:p>
       <w:pPr>
         <w:pStyle w:val="CommentText"/>
@@ -5720,6 +5387,7 @@
   <w15:commentEx w15:paraId="6F484538" w15:done="0"/>
   <w15:commentEx w15:paraId="2CA2704B" w15:paraIdParent="6F484538" w15:done="0"/>
   <w15:commentEx w15:paraId="421960A3" w15:paraIdParent="6F484538" w15:done="0"/>
+  <w15:commentEx w15:paraId="460E10C2" w15:done="0"/>
   <w15:commentEx w15:paraId="06B3310D" w15:done="0"/>
   <w15:commentEx w15:paraId="74FB68C1" w15:done="0"/>
   <w15:commentEx w15:paraId="415E945D" w15:done="0"/>
@@ -5747,6 +5415,7 @@
   <w16cex:commentExtensible w16cex:durableId="68E3180E" w16cex:dateUtc="2024-12-12T19:19:00Z"/>
   <w16cex:commentExtensible w16cex:durableId="5D5BA50A" w16cex:dateUtc="2024-12-16T20:38:00Z"/>
   <w16cex:commentExtensible w16cex:durableId="13A2EF68" w16cex:dateUtc="2024-12-16T20:39:00Z"/>
+  <w16cex:commentExtensible w16cex:durableId="59EAFD49" w16cex:dateUtc="2024-12-18T18:50:00Z"/>
   <w16cex:commentExtensible w16cex:durableId="413A92F9" w16cex:dateUtc="2024-12-09T17:05:00Z"/>
   <w16cex:commentExtensible w16cex:durableId="1DC55E73" w16cex:dateUtc="2024-12-09T17:04:00Z"/>
   <w16cex:commentExtensible w16cex:durableId="787E58E8" w16cex:dateUtc="2024-12-09T17:03:00Z"/>
@@ -5774,6 +5443,7 @@
   <w16cid:commentId w16cid:paraId="6F484538" w16cid:durableId="68E3180E"/>
   <w16cid:commentId w16cid:paraId="2CA2704B" w16cid:durableId="5D5BA50A"/>
   <w16cid:commentId w16cid:paraId="421960A3" w16cid:durableId="13A2EF68"/>
+  <w16cid:commentId w16cid:paraId="460E10C2" w16cid:durableId="59EAFD49"/>
   <w16cid:commentId w16cid:paraId="06B3310D" w16cid:durableId="413A92F9"/>
   <w16cid:commentId w16cid:paraId="74FB68C1" w16cid:durableId="1DC55E73"/>
   <w16cid:commentId w16cid:paraId="415E945D" w16cid:durableId="787E58E8"/>
@@ -7290,6 +6960,7 @@
   <w:style w:type="character" w:default="1" w:styleId="DefaultParagraphFont">
     <w:name w:val="Default Paragraph Font"/>
     <w:uiPriority w:val="1"/>
+    <w:semiHidden/>
     <w:unhideWhenUsed/>
   </w:style>
   <w:style w:type="table" w:default="1" w:styleId="TableNormal">

</xml_diff>